<commit_message>
docs: refresh report and MLOps guide
</commit_message>
<xml_diff>
--- a/docs/Hospital_Readmission_Prediction_Report.docx
+++ b/docs/Hospital_Readmission_Prediction_Report.docx
@@ -371,364 +371,298 @@
     </w:p>
     <w:p>
       <w:pPr>
-        <w:spacing w:line="276" w:lineRule="auto"/>
+        <w:pStyle w:val="2"/>
+      </w:pPr>
+      <w:r>
+        <w:rPr>
+          <w:rFonts w:ascii="Times New Roman" w:hAnsi="Times New Roman"/>
+          <w:color w:val="000000"/>
+        </w:rPr>
+        <w:t>LỜI CẢM ƠN</w:t>
+      </w:r>
+    </w:p>
+    <w:p>
+      <w:pPr>
+        <w:pStyle w:val="30"/>
+      </w:pPr>
+      <w:r>
+        <w:rPr>
+          <w:rFonts w:ascii="Times New Roman" w:hAnsi="Times New Roman"/>
+          <w:sz w:val="26"/>
+        </w:rPr>
+        <w:t>Trước tiên, em xin gửi lời cảm ơn chân thành đến TS. Bùi Thanh Hùng, người đã định hướng và hỗ trợ em trong quá trình thực hiện đồ án cuối kì môn Công nghệ mới trong phát triển ứng dụng.</w:t>
+      </w:r>
+    </w:p>
+    <w:p>
+      <w:pPr>
+        <w:pStyle w:val="30"/>
+      </w:pPr>
+      <w:r>
+        <w:rPr>
+          <w:rFonts w:ascii="Times New Roman" w:hAnsi="Times New Roman"/>
+          <w:sz w:val="26"/>
+        </w:rPr>
+        <w:t>Em xin cảm ơn quý thầy cô Khoa Công nghệ Thông tin, Trường Đại học Công nghiệp Thành phố Hồ Chí Minh, đã trang bị các kiến thức nền tảng về phát triển phần mềm, dữ liệu, trí tuệ nhân tạo và triển khai hệ thống.</w:t>
+      </w:r>
+    </w:p>
+    <w:p>
+      <w:pPr>
+        <w:pStyle w:val="30"/>
+      </w:pPr>
+      <w:r>
+        <w:rPr>
+          <w:rFonts w:ascii="Times New Roman" w:hAnsi="Times New Roman"/>
+          <w:sz w:val="26"/>
+        </w:rPr>
+        <w:t>Trong quá trình thực hiện, em đã cố gắng xây dựng một hệ thống hoàn chỉnh theo hướng MLOps. Tuy nhiên, đồ án khó tránh khỏi thiếu sót, em rất mong nhận được góp ý của quý thầy cô để sản phẩm được hoàn thiện hơn.</w:t>
+      </w:r>
+    </w:p>
+    <w:p>
+      <w:pPr>
+        <w:pStyle w:val="30"/>
+      </w:pPr>
+      <w:r>
+        <w:rPr>
+          <w:rFonts w:ascii="Times New Roman" w:hAnsi="Times New Roman"/>
+          <w:sz w:val="26"/>
+        </w:rPr>
+        <w:t>Em xin chân thành cảm ơn!</w:t>
+      </w:r>
+    </w:p>
+    <w:p>
+      <w:pPr>
+        <w:jc w:val="right"/>
+      </w:pPr>
+      <w:r>
+        <w:rPr>
+          <w:rFonts w:ascii="Times New Roman" w:hAnsi="Times New Roman"/>
+          <w:sz w:val="26"/>
+        </w:rPr>
+        <w:t>TP. Hồ Chí Minh, ngày   tháng   năm</w:t>
+      </w:r>
+    </w:p>
+    <w:p>
+      <w:pPr>
+        <w:jc w:val="right"/>
+      </w:pPr>
+      <w:r>
+        <w:rPr>
+          <w:rFonts w:ascii="Times New Roman" w:hAnsi="Times New Roman"/>
+          <w:sz w:val="26"/>
+        </w:rPr>
+        <w:t>Tác giả</w:t>
+      </w:r>
+    </w:p>
+    <w:p>
+      <w:pPr>
+        <w:jc w:val="right"/>
+      </w:pPr>
+      <w:r>
+        <w:rPr>
+          <w:rFonts w:ascii="Times New Roman" w:hAnsi="Times New Roman"/>
+          <w:sz w:val="26"/>
+        </w:rPr>
+        <w:t>Trần Thái Hà</w:t>
+      </w:r>
+    </w:p>
+    <w:p>
+      <w:r>
+        <w:br w:type="page"/>
+      </w:r>
+    </w:p>
+    <w:p>
+      <w:pPr>
         <w:jc w:val="center"/>
       </w:pPr>
       <w:r>
         <w:rPr>
           <w:rFonts w:ascii="Times New Roman" w:hAnsi="Times New Roman"/>
-          <w:b/>
-          <w:sz w:val="28"/>
-        </w:rPr>
-        <w:t>TRƯỜNG ĐẠI HỌC CÔNG NGHIỆP TP HỒ CHÍ MINH</w:t>
-      </w:r>
-    </w:p>
-    <w:p>
-      <w:pPr>
-        <w:spacing w:line="276" w:lineRule="auto"/>
+          <w:sz w:val="26"/>
+        </w:rPr>
+        <w:t>ĐỒ ÁN ĐƯỢC HOÀN THÀNH</w:t>
+      </w:r>
+    </w:p>
+    <w:p>
+      <w:pPr>
         <w:jc w:val="center"/>
       </w:pPr>
       <w:r>
         <w:rPr>
           <w:rFonts w:ascii="Times New Roman" w:hAnsi="Times New Roman"/>
-          <w:b/>
-          <w:sz w:val="28"/>
-        </w:rPr>
-        <w:t>KHOA CÔNG NGHỆ THÔNG TIN</w:t>
-      </w:r>
-    </w:p>
-    <w:p>
-      <w:pPr>
-        <w:spacing w:line="276" w:lineRule="auto"/>
-        <w:jc w:val="center"/>
-      </w:pPr>
-      <w:r>
-        <w:rPr>
-          <w:rFonts w:ascii="Times New Roman" w:hAnsi="Times New Roman"/>
-          <w:b w:val="0"/>
-          <w:sz w:val="28"/>
-        </w:rPr>
-      </w:r>
-    </w:p>
-    <w:p>
-      <w:pPr>
-        <w:spacing w:line="276" w:lineRule="auto"/>
-        <w:jc w:val="center"/>
-      </w:pPr>
-      <w:r>
-        <w:rPr>
-          <w:rFonts w:ascii="Times New Roman" w:hAnsi="Times New Roman"/>
-          <w:b w:val="0"/>
-          <w:sz w:val="28"/>
-        </w:rPr>
-      </w:r>
-    </w:p>
-    <w:p>
-      <w:pPr>
-        <w:jc w:val="center"/>
-      </w:pPr>
-      <w:r>
-        <w:drawing>
-          <wp:inline xmlns:a="http://schemas.openxmlformats.org/drawingml/2006/main" xmlns:pic="http://schemas.openxmlformats.org/drawingml/2006/picture">
-            <wp:extent cx="3803904" cy="1084081"/>
-            <wp:docPr id="2" name="Picture 2"/>
-            <wp:cNvGraphicFramePr>
-              <a:graphicFrameLocks noChangeAspect="1"/>
-            </wp:cNvGraphicFramePr>
-            <a:graphic>
-              <a:graphicData uri="http://schemas.openxmlformats.org/drawingml/2006/picture">
-                <pic:pic>
-                  <pic:nvPicPr>
-                    <pic:cNvPr id="0" name="image.png"/>
-                    <pic:cNvPicPr/>
-                  </pic:nvPicPr>
-                  <pic:blipFill>
-                    <a:blip r:embed="rId11"/>
-                    <a:stretch>
-                      <a:fillRect/>
-                    </a:stretch>
-                  </pic:blipFill>
-                  <pic:spPr>
-                    <a:xfrm>
-                      <a:off x="0" y="0"/>
-                      <a:ext cx="3803904" cy="1084081"/>
-                    </a:xfrm>
-                    <a:prstGeom prst="rect"/>
-                  </pic:spPr>
-                </pic:pic>
-              </a:graphicData>
-            </a:graphic>
-          </wp:inline>
-        </w:drawing>
-      </w:r>
-    </w:p>
-    <w:p>
-      <w:pPr>
-        <w:spacing w:line="276" w:lineRule="auto"/>
-        <w:jc w:val="center"/>
-      </w:pPr>
-      <w:r>
-        <w:rPr>
-          <w:rFonts w:ascii="Times New Roman" w:hAnsi="Times New Roman"/>
-          <w:b w:val="0"/>
-          <w:sz w:val="28"/>
-        </w:rPr>
-      </w:r>
-    </w:p>
-    <w:p>
-      <w:pPr>
-        <w:spacing w:line="276" w:lineRule="auto"/>
-        <w:jc w:val="center"/>
-      </w:pPr>
-      <w:r>
-        <w:rPr>
-          <w:rFonts w:ascii="Times New Roman" w:hAnsi="Times New Roman"/>
-          <w:b/>
-          <w:sz w:val="32"/>
-        </w:rPr>
-        <w:t>ĐỒ ÁN CUỐI KÌ</w:t>
-      </w:r>
-    </w:p>
-    <w:p>
-      <w:pPr>
-        <w:spacing w:line="276" w:lineRule="auto"/>
-        <w:jc w:val="center"/>
-      </w:pPr>
-      <w:r>
-        <w:rPr>
-          <w:rFonts w:ascii="Times New Roman" w:hAnsi="Times New Roman"/>
-          <w:b/>
-          <w:sz w:val="32"/>
-        </w:rPr>
-        <w:t>CÔNG NGHỆ MỚI TRONG PHÁT TRIỂN ỨNG DỤNG</w:t>
-      </w:r>
-    </w:p>
-    <w:p>
-      <w:pPr>
-        <w:spacing w:line="276" w:lineRule="auto"/>
-        <w:jc w:val="center"/>
-      </w:pPr>
-      <w:r>
-        <w:rPr>
-          <w:rFonts w:ascii="Times New Roman" w:hAnsi="Times New Roman"/>
-          <w:b w:val="0"/>
-          <w:sz w:val="28"/>
-        </w:rPr>
-      </w:r>
-    </w:p>
-    <w:p>
-      <w:pPr>
-        <w:spacing w:line="276" w:lineRule="auto"/>
-        <w:jc w:val="center"/>
-      </w:pPr>
-      <w:r>
-        <w:rPr>
-          <w:rFonts w:ascii="Times New Roman" w:hAnsi="Times New Roman"/>
-          <w:b/>
-          <w:sz w:val="32"/>
-        </w:rPr>
-        <w:t>HỆ THỐNG MLOPS DỰ ĐOÁN</w:t>
-      </w:r>
-    </w:p>
-    <w:p>
-      <w:pPr>
-        <w:spacing w:line="276" w:lineRule="auto"/>
-        <w:jc w:val="center"/>
-      </w:pPr>
-      <w:r>
-        <w:rPr>
-          <w:rFonts w:ascii="Times New Roman" w:hAnsi="Times New Roman"/>
-          <w:b/>
-          <w:sz w:val="32"/>
-        </w:rPr>
-        <w:t>TÁI NHẬP VIỆN BỆNH NHÂN</w:t>
-      </w:r>
-    </w:p>
-    <w:p>
-      <w:pPr>
-        <w:spacing w:line="276" w:lineRule="auto"/>
-        <w:jc w:val="center"/>
-      </w:pPr>
-      <w:r>
-        <w:rPr>
-          <w:rFonts w:ascii="Times New Roman" w:hAnsi="Times New Roman"/>
-          <w:b w:val="0"/>
-          <w:sz w:val="28"/>
-        </w:rPr>
-      </w:r>
-    </w:p>
-    <w:p>
-      <w:pPr>
-        <w:spacing w:line="276" w:lineRule="auto"/>
-        <w:jc w:val="center"/>
-      </w:pPr>
-      <w:r>
-        <w:rPr>
-          <w:rFonts w:ascii="Times New Roman" w:hAnsi="Times New Roman"/>
-          <w:b w:val="0"/>
-          <w:sz w:val="28"/>
-        </w:rPr>
-      </w:r>
-    </w:p>
-    <w:p>
-      <w:pPr>
-        <w:spacing w:line="276" w:lineRule="auto"/>
-        <w:jc w:val="center"/>
-      </w:pPr>
-      <w:r>
-        <w:rPr>
-          <w:rFonts w:ascii="Times New Roman" w:hAnsi="Times New Roman"/>
-          <w:b w:val="0"/>
-          <w:sz w:val="28"/>
-        </w:rPr>
-      </w:r>
-    </w:p>
-    <w:p>
-      <w:pPr>
-        <w:spacing w:line="276" w:lineRule="auto"/>
-        <w:jc w:val="center"/>
-      </w:pPr>
-      <w:r>
-        <w:rPr>
-          <w:rFonts w:ascii="Times New Roman" w:hAnsi="Times New Roman"/>
-          <w:b w:val="0"/>
-          <w:sz w:val="28"/>
-        </w:rPr>
-      </w:r>
-    </w:p>
-    <w:p>
-      <w:pPr>
-        <w:spacing w:line="276" w:lineRule="auto"/>
-        <w:jc w:val="center"/>
-      </w:pPr>
-      <w:r>
-        <w:rPr>
-          <w:rFonts w:ascii="Times New Roman" w:hAnsi="Times New Roman"/>
-          <w:b w:val="0"/>
-          <w:sz w:val="28"/>
-        </w:rPr>
-      </w:r>
-    </w:p>
-    <w:p>
-      <w:pPr>
-        <w:spacing w:line="276" w:lineRule="auto"/>
-        <w:jc w:val="center"/>
-      </w:pPr>
-      <w:r>
-        <w:rPr>
-          <w:rFonts w:ascii="Times New Roman" w:hAnsi="Times New Roman"/>
-          <w:b w:val="0"/>
-          <w:sz w:val="28"/>
-        </w:rPr>
-      </w:r>
-    </w:p>
-    <w:p>
-      <w:pPr>
-        <w:spacing w:line="276" w:lineRule="auto"/>
+          <w:sz w:val="26"/>
+        </w:rPr>
+        <w:t>TẠI TRƯỜNG ĐẠI HỌC CÔNG NGHIỆP TP HỒ CHÍ MINH</w:t>
+      </w:r>
+    </w:p>
+    <w:p>
+      <w:pPr>
+        <w:pStyle w:val="30"/>
+      </w:pPr>
+      <w:r>
+        <w:rPr>
+          <w:rFonts w:ascii="Times New Roman" w:hAnsi="Times New Roman"/>
+          <w:sz w:val="26"/>
+        </w:rPr>
+        <w:t>Tôi xin cam đoan đây là sản phẩm đồ án của riêng tôi và được sự hướng dẫn của TS. Bùi Thanh Hùng. Các nội dung nghiên cứu, kết quả trong đề tài là trung thực và được xây dựng dựa trên mã nguồn, dữ liệu và cấu hình hiện có trong project Hospital_Readmission_Prediction.</w:t>
+      </w:r>
+    </w:p>
+    <w:p>
+      <w:pPr>
+        <w:pStyle w:val="30"/>
+      </w:pPr>
+      <w:r>
+        <w:rPr>
+          <w:rFonts w:ascii="Times New Roman" w:hAnsi="Times New Roman"/>
+          <w:sz w:val="26"/>
+        </w:rPr>
+        <w:t>Những tài liệu, thư viện và công nghệ tham khảo trong đồ án đều được nêu ở phần tài liệu tham khảo. Nếu phát hiện có bất kỳ sai sót nào, tôi xin chịu trách nhiệm về nội dung báo cáo.</w:t>
+      </w:r>
+    </w:p>
+    <w:p>
+      <w:pPr>
         <w:jc w:val="right"/>
       </w:pPr>
       <w:r>
         <w:rPr>
           <w:rFonts w:ascii="Times New Roman" w:hAnsi="Times New Roman"/>
-          <w:b w:val="0"/>
-          <w:sz w:val="28"/>
-        </w:rPr>
-        <w:t>Người thực hiện:   TRẦN THÁI HÀ – 22636801</w:t>
-      </w:r>
-    </w:p>
-    <w:p>
-      <w:pPr>
-        <w:spacing w:line="276" w:lineRule="auto"/>
+          <w:sz w:val="26"/>
+        </w:rPr>
+        <w:t>TP. Hồ Chí Minh, ngày   tháng   năm</w:t>
+      </w:r>
+    </w:p>
+    <w:p>
+      <w:pPr>
         <w:jc w:val="right"/>
       </w:pPr>
       <w:r>
         <w:rPr>
           <w:rFonts w:ascii="Times New Roman" w:hAnsi="Times New Roman"/>
-          <w:b w:val="0"/>
-          <w:sz w:val="28"/>
-        </w:rPr>
-        <w:t>Lớp       :    DHKHDL18A</w:t>
-      </w:r>
-    </w:p>
-    <w:p>
-      <w:pPr>
-        <w:spacing w:line="276" w:lineRule="auto"/>
+          <w:sz w:val="26"/>
+        </w:rPr>
+        <w:t>Tác giả</w:t>
+      </w:r>
+    </w:p>
+    <w:p>
+      <w:pPr>
         <w:jc w:val="right"/>
       </w:pPr>
       <w:r>
         <w:rPr>
           <w:rFonts w:ascii="Times New Roman" w:hAnsi="Times New Roman"/>
-          <w:b w:val="0"/>
-          <w:sz w:val="28"/>
-        </w:rPr>
-        <w:t>Khoá     :    18</w:t>
-      </w:r>
-    </w:p>
-    <w:p>
-      <w:pPr>
-        <w:spacing w:line="276" w:lineRule="auto"/>
+          <w:sz w:val="26"/>
+        </w:rPr>
+        <w:t>Trần Thái Hà</w:t>
+      </w:r>
+    </w:p>
+    <w:p>
+      <w:r>
+        <w:br w:type="page"/>
+      </w:r>
+    </w:p>
+    <w:p>
+      <w:pPr>
+        <w:pStyle w:val="2"/>
+      </w:pPr>
+      <w:r>
+        <w:rPr>
+          <w:rFonts w:ascii="Times New Roman" w:hAnsi="Times New Roman"/>
+          <w:color w:val="000000"/>
+        </w:rPr>
+        <w:t>PHẦN ĐÁNH GIÁ CỦA GIẢNG VIÊN</w:t>
+      </w:r>
+    </w:p>
+    <w:p>
+      <w:pPr/>
+      <w:r>
+        <w:rPr>
+          <w:rFonts w:ascii="Times New Roman" w:hAnsi="Times New Roman"/>
+          <w:sz w:val="26"/>
+        </w:rPr>
+        <w:t>___________________________________________________________________________________________________________________</w:t>
+      </w:r>
+    </w:p>
+    <w:p>
+      <w:pPr/>
+      <w:r>
+        <w:rPr>
+          <w:rFonts w:ascii="Times New Roman" w:hAnsi="Times New Roman"/>
+          <w:sz w:val="26"/>
+        </w:rPr>
+        <w:t>___________________________________________________________________________________________________________________</w:t>
+      </w:r>
+    </w:p>
+    <w:p>
+      <w:pPr/>
+      <w:r>
+        <w:rPr>
+          <w:rFonts w:ascii="Times New Roman" w:hAnsi="Times New Roman"/>
+          <w:sz w:val="26"/>
+        </w:rPr>
+        <w:t>___________________________________________________________________________________________________________________</w:t>
+      </w:r>
+    </w:p>
+    <w:p>
+      <w:pPr/>
+      <w:r>
+        <w:rPr>
+          <w:rFonts w:ascii="Times New Roman" w:hAnsi="Times New Roman"/>
+          <w:sz w:val="26"/>
+        </w:rPr>
+        <w:t>___________________________________________________________________________________________________________________</w:t>
+      </w:r>
+    </w:p>
+    <w:p>
+      <w:pPr/>
+      <w:r>
+        <w:rPr>
+          <w:rFonts w:ascii="Times New Roman" w:hAnsi="Times New Roman"/>
+          <w:sz w:val="26"/>
+        </w:rPr>
+        <w:t>___________________________________________________________________________________________________________________</w:t>
+      </w:r>
+    </w:p>
+    <w:p>
+      <w:pPr/>
+      <w:r>
+        <w:rPr>
+          <w:rFonts w:ascii="Times New Roman" w:hAnsi="Times New Roman"/>
+          <w:sz w:val="26"/>
+        </w:rPr>
+        <w:t>___________________________________________________________________________________________________________________</w:t>
+      </w:r>
+    </w:p>
+    <w:p>
+      <w:pPr/>
+      <w:r>
+        <w:rPr>
+          <w:rFonts w:ascii="Times New Roman" w:hAnsi="Times New Roman"/>
+          <w:sz w:val="26"/>
+        </w:rPr>
+        <w:t>___________________________________________________________________________________________________________________</w:t>
+      </w:r>
+    </w:p>
+    <w:p>
+      <w:pPr>
         <w:jc w:val="right"/>
       </w:pPr>
       <w:r>
         <w:rPr>
           <w:rFonts w:ascii="Times New Roman" w:hAnsi="Times New Roman"/>
-          <w:b w:val="0"/>
-          <w:sz w:val="28"/>
-        </w:rPr>
-        <w:t>Người hướng dẫn: TS. BÙI THANH HÙNG</w:t>
-      </w:r>
-    </w:p>
-    <w:p>
-      <w:pPr>
-        <w:spacing w:line="276" w:lineRule="auto"/>
-        <w:jc w:val="center"/>
-      </w:pPr>
-      <w:r>
-        <w:rPr>
-          <w:rFonts w:ascii="Times New Roman" w:hAnsi="Times New Roman"/>
-          <w:b w:val="0"/>
-          <w:sz w:val="28"/>
-        </w:rPr>
-      </w:r>
-    </w:p>
-    <w:p>
-      <w:pPr>
-        <w:spacing w:line="276" w:lineRule="auto"/>
-        <w:jc w:val="center"/>
-      </w:pPr>
-      <w:r>
-        <w:rPr>
-          <w:rFonts w:ascii="Times New Roman" w:hAnsi="Times New Roman"/>
-          <w:b w:val="0"/>
-          <w:sz w:val="28"/>
-        </w:rPr>
-      </w:r>
-    </w:p>
-    <w:p>
-      <w:pPr>
-        <w:spacing w:line="276" w:lineRule="auto"/>
-        <w:jc w:val="center"/>
-      </w:pPr>
-      <w:r>
-        <w:rPr>
-          <w:rFonts w:ascii="Times New Roman" w:hAnsi="Times New Roman"/>
-          <w:b w:val="0"/>
-          <w:sz w:val="28"/>
-        </w:rPr>
-      </w:r>
-    </w:p>
-    <w:p>
-      <w:pPr>
-        <w:spacing w:line="276" w:lineRule="auto"/>
-        <w:jc w:val="center"/>
-      </w:pPr>
-      <w:r>
-        <w:rPr>
-          <w:rFonts w:ascii="Times New Roman" w:hAnsi="Times New Roman"/>
-          <w:b/>
-          <w:sz w:val="28"/>
-        </w:rPr>
-        <w:t>THÀNH PHỐ HỒ CHÍ MINH, NĂM 2026</w:t>
+          <w:sz w:val="26"/>
+        </w:rPr>
+        <w:t>Tp. Hồ Chí Minh, ngày     tháng   năm</w:t>
+      </w:r>
+    </w:p>
+    <w:p>
+      <w:pPr>
+        <w:jc w:val="right"/>
+      </w:pPr>
+      <w:r>
+        <w:rPr>
+          <w:rFonts w:ascii="Times New Roman" w:hAnsi="Times New Roman"/>
+          <w:sz w:val="26"/>
+        </w:rPr>
+        <w:t>(kí và ghi họ tên)</w:t>
       </w:r>
     </w:p>
     <w:p>
@@ -745,7 +679,7 @@
           <w:rFonts w:ascii="Times New Roman" w:hAnsi="Times New Roman"/>
           <w:color w:val="000000"/>
         </w:rPr>
-        <w:t>LỜI CẢM ƠN</w:t>
+        <w:t>TÓM TẮT</w:t>
       </w:r>
     </w:p>
     <w:p>
@@ -757,7 +691,7 @@
           <w:rFonts w:ascii="Times New Roman" w:hAnsi="Times New Roman"/>
           <w:sz w:val="26"/>
         </w:rPr>
-        <w:t>Trước tiên, em xin gửi lời cảm ơn chân thành đến TS. Bùi Thanh Hùng, người đã định hướng và hỗ trợ em trong quá trình thực hiện đồ án cuối kì môn Công nghệ mới trong phát triển ứng dụng.</w:t>
+        <w:t>Tái nhập viện trong thời gian ngắn là một vấn đề quan trọng trong quản trị bệnh viện vì làm tăng chi phí điều trị, gây áp lực lên nhân lực y tế và phản ánh nguy cơ biến chứng sau xuất viện. Đồ án này xây dựng hệ thống MLOps dự đoán khả năng bệnh nhân tiểu đường tái nhập viện trong vòng dưới 30 ngày dựa trên dữ liệu lâm sàng, thông tin nhập viện, chẩn đoán và thuốc điều trị.</w:t>
       </w:r>
     </w:p>
     <w:p>
@@ -769,7 +703,7 @@
           <w:rFonts w:ascii="Times New Roman" w:hAnsi="Times New Roman"/>
           <w:sz w:val="26"/>
         </w:rPr>
-        <w:t>Em xin cảm ơn quý thầy cô Khoa Công nghệ Thông tin, Trường Đại học Công nghiệp Thành phố Hồ Chí Minh, đã trang bị các kiến thức nền tảng về phát triển phần mềm, dữ liệu, trí tuệ nhân tạo và triển khai hệ thống.</w:t>
+        <w:t>Về dữ liệu, project sử dụng tệp diabetic_data.csv gồm 101.766 lượt khám với 50 cột. Nhãn nhị phân được tạo từ cột readmitted, trong đó giá trị &lt;30 được xem là ca tái nhập viện sớm. Pipeline xử lý dữ liệu loại bỏ một số cột thiếu nhiều hoặc ít hữu ích, chuẩn hóa giá trị thiếu, mã hóa biến phân loại và huấn luyện các mô hình ứng viên bằng scikit-learn.</w:t>
       </w:r>
     </w:p>
     <w:p>
@@ -781,308 +715,7 @@
           <w:rFonts w:ascii="Times New Roman" w:hAnsi="Times New Roman"/>
           <w:sz w:val="26"/>
         </w:rPr>
-        <w:t>Trong quá trình thực hiện, em đã cố gắng xây dựng một hệ thống hoàn chỉnh theo hướng MLOps. Tuy nhiên, đồ án khó tránh khỏi thiếu sót, em rất mong nhận được góp ý của quý thầy cô để sản phẩm được hoàn thiện hơn.</w:t>
-      </w:r>
-    </w:p>
-    <w:p>
-      <w:pPr>
-        <w:pStyle w:val="30"/>
-      </w:pPr>
-      <w:r>
-        <w:rPr>
-          <w:rFonts w:ascii="Times New Roman" w:hAnsi="Times New Roman"/>
-          <w:sz w:val="26"/>
-        </w:rPr>
-        <w:t>Em xin chân thành cảm ơn!</w:t>
-      </w:r>
-    </w:p>
-    <w:p>
-      <w:pPr>
-        <w:jc w:val="right"/>
-      </w:pPr>
-      <w:r>
-        <w:rPr>
-          <w:rFonts w:ascii="Times New Roman" w:hAnsi="Times New Roman"/>
-          <w:sz w:val="26"/>
-        </w:rPr>
-        <w:t>TP. Hồ Chí Minh, ngày   tháng   năm</w:t>
-      </w:r>
-    </w:p>
-    <w:p>
-      <w:pPr>
-        <w:jc w:val="right"/>
-      </w:pPr>
-      <w:r>
-        <w:rPr>
-          <w:rFonts w:ascii="Times New Roman" w:hAnsi="Times New Roman"/>
-          <w:sz w:val="26"/>
-        </w:rPr>
-        <w:t>Tác giả</w:t>
-      </w:r>
-    </w:p>
-    <w:p>
-      <w:pPr>
-        <w:jc w:val="right"/>
-      </w:pPr>
-      <w:r>
-        <w:rPr>
-          <w:rFonts w:ascii="Times New Roman" w:hAnsi="Times New Roman"/>
-          <w:sz w:val="26"/>
-        </w:rPr>
-        <w:t>Trần Thái Hà</w:t>
-      </w:r>
-    </w:p>
-    <w:p>
-      <w:r>
-        <w:br w:type="page"/>
-      </w:r>
-    </w:p>
-    <w:p>
-      <w:pPr>
-        <w:jc w:val="center"/>
-      </w:pPr>
-      <w:r>
-        <w:rPr>
-          <w:rFonts w:ascii="Times New Roman" w:hAnsi="Times New Roman"/>
-          <w:sz w:val="26"/>
-        </w:rPr>
-        <w:t>ĐỒ ÁN ĐƯỢC HOÀN THÀNH</w:t>
-      </w:r>
-    </w:p>
-    <w:p>
-      <w:pPr>
-        <w:jc w:val="center"/>
-      </w:pPr>
-      <w:r>
-        <w:rPr>
-          <w:rFonts w:ascii="Times New Roman" w:hAnsi="Times New Roman"/>
-          <w:sz w:val="26"/>
-        </w:rPr>
-        <w:t>TẠI TRƯỜNG ĐẠI HỌC CÔNG NGHIỆP TP HỒ CHÍ MINH</w:t>
-      </w:r>
-    </w:p>
-    <w:p>
-      <w:pPr>
-        <w:pStyle w:val="30"/>
-      </w:pPr>
-      <w:r>
-        <w:rPr>
-          <w:rFonts w:ascii="Times New Roman" w:hAnsi="Times New Roman"/>
-          <w:sz w:val="26"/>
-        </w:rPr>
-        <w:t>Tôi xin cam đoan đây là sản phẩm đồ án của riêng tôi và được sự hướng dẫn của TS. Bùi Thanh Hùng. Các nội dung nghiên cứu, kết quả trong đề tài là trung thực và được xây dựng dựa trên mã nguồn, dữ liệu và cấu hình hiện có trong project Hospital_Readmission_Prediction.</w:t>
-      </w:r>
-    </w:p>
-    <w:p>
-      <w:pPr>
-        <w:pStyle w:val="30"/>
-      </w:pPr>
-      <w:r>
-        <w:rPr>
-          <w:rFonts w:ascii="Times New Roman" w:hAnsi="Times New Roman"/>
-          <w:sz w:val="26"/>
-        </w:rPr>
-        <w:t>Những tài liệu, thư viện và công nghệ tham khảo trong đồ án đều được nêu ở phần tài liệu tham khảo. Nếu phát hiện có bất kỳ sai sót nào, tôi xin chịu trách nhiệm về nội dung báo cáo.</w:t>
-      </w:r>
-    </w:p>
-    <w:p>
-      <w:pPr>
-        <w:jc w:val="right"/>
-      </w:pPr>
-      <w:r>
-        <w:rPr>
-          <w:rFonts w:ascii="Times New Roman" w:hAnsi="Times New Roman"/>
-          <w:sz w:val="26"/>
-        </w:rPr>
-        <w:t>TP. Hồ Chí Minh, ngày   tháng   năm</w:t>
-      </w:r>
-    </w:p>
-    <w:p>
-      <w:pPr>
-        <w:jc w:val="right"/>
-      </w:pPr>
-      <w:r>
-        <w:rPr>
-          <w:rFonts w:ascii="Times New Roman" w:hAnsi="Times New Roman"/>
-          <w:sz w:val="26"/>
-        </w:rPr>
-        <w:t>Tác giả</w:t>
-      </w:r>
-    </w:p>
-    <w:p>
-      <w:pPr>
-        <w:jc w:val="right"/>
-      </w:pPr>
-      <w:r>
-        <w:rPr>
-          <w:rFonts w:ascii="Times New Roman" w:hAnsi="Times New Roman"/>
-          <w:sz w:val="26"/>
-        </w:rPr>
-        <w:t>Trần Thái Hà</w:t>
-      </w:r>
-    </w:p>
-    <w:p>
-      <w:r>
-        <w:br w:type="page"/>
-      </w:r>
-    </w:p>
-    <w:p>
-      <w:pPr>
-        <w:pStyle w:val="2"/>
-      </w:pPr>
-      <w:r>
-        <w:rPr>
-          <w:rFonts w:ascii="Times New Roman" w:hAnsi="Times New Roman"/>
-          <w:color w:val="000000"/>
-        </w:rPr>
-        <w:t>PHẦN ĐÁNH GIÁ CỦA GIẢNG VIÊN</w:t>
-      </w:r>
-    </w:p>
-    <w:p>
-      <w:pPr/>
-      <w:r>
-        <w:rPr>
-          <w:rFonts w:ascii="Times New Roman" w:hAnsi="Times New Roman"/>
-          <w:sz w:val="26"/>
-        </w:rPr>
-        <w:t>___________________________________________________________________________________________________________________</w:t>
-      </w:r>
-    </w:p>
-    <w:p>
-      <w:pPr/>
-      <w:r>
-        <w:rPr>
-          <w:rFonts w:ascii="Times New Roman" w:hAnsi="Times New Roman"/>
-          <w:sz w:val="26"/>
-        </w:rPr>
-        <w:t>___________________________________________________________________________________________________________________</w:t>
-      </w:r>
-    </w:p>
-    <w:p>
-      <w:pPr/>
-      <w:r>
-        <w:rPr>
-          <w:rFonts w:ascii="Times New Roman" w:hAnsi="Times New Roman"/>
-          <w:sz w:val="26"/>
-        </w:rPr>
-        <w:t>___________________________________________________________________________________________________________________</w:t>
-      </w:r>
-    </w:p>
-    <w:p>
-      <w:pPr/>
-      <w:r>
-        <w:rPr>
-          <w:rFonts w:ascii="Times New Roman" w:hAnsi="Times New Roman"/>
-          <w:sz w:val="26"/>
-        </w:rPr>
-        <w:t>___________________________________________________________________________________________________________________</w:t>
-      </w:r>
-    </w:p>
-    <w:p>
-      <w:pPr/>
-      <w:r>
-        <w:rPr>
-          <w:rFonts w:ascii="Times New Roman" w:hAnsi="Times New Roman"/>
-          <w:sz w:val="26"/>
-        </w:rPr>
-        <w:t>___________________________________________________________________________________________________________________</w:t>
-      </w:r>
-    </w:p>
-    <w:p>
-      <w:pPr/>
-      <w:r>
-        <w:rPr>
-          <w:rFonts w:ascii="Times New Roman" w:hAnsi="Times New Roman"/>
-          <w:sz w:val="26"/>
-        </w:rPr>
-        <w:t>___________________________________________________________________________________________________________________</w:t>
-      </w:r>
-    </w:p>
-    <w:p>
-      <w:pPr/>
-      <w:r>
-        <w:rPr>
-          <w:rFonts w:ascii="Times New Roman" w:hAnsi="Times New Roman"/>
-          <w:sz w:val="26"/>
-        </w:rPr>
-        <w:t>___________________________________________________________________________________________________________________</w:t>
-      </w:r>
-    </w:p>
-    <w:p>
-      <w:pPr>
-        <w:jc w:val="right"/>
-      </w:pPr>
-      <w:r>
-        <w:rPr>
-          <w:rFonts w:ascii="Times New Roman" w:hAnsi="Times New Roman"/>
-          <w:sz w:val="26"/>
-        </w:rPr>
-        <w:t>Tp. Hồ Chí Minh, ngày     tháng   năm</w:t>
-      </w:r>
-    </w:p>
-    <w:p>
-      <w:pPr>
-        <w:jc w:val="right"/>
-      </w:pPr>
-      <w:r>
-        <w:rPr>
-          <w:rFonts w:ascii="Times New Roman" w:hAnsi="Times New Roman"/>
-          <w:sz w:val="26"/>
-        </w:rPr>
-        <w:t>(kí và ghi họ tên)</w:t>
-      </w:r>
-    </w:p>
-    <w:p>
-      <w:r>
-        <w:br w:type="page"/>
-      </w:r>
-    </w:p>
-    <w:p>
-      <w:pPr>
-        <w:pStyle w:val="2"/>
-      </w:pPr>
-      <w:r>
-        <w:rPr>
-          <w:rFonts w:ascii="Times New Roman" w:hAnsi="Times New Roman"/>
-          <w:color w:val="000000"/>
-        </w:rPr>
-        <w:t>TÓM TẮT</w:t>
-      </w:r>
-    </w:p>
-    <w:p>
-      <w:pPr>
-        <w:pStyle w:val="30"/>
-      </w:pPr>
-      <w:r>
-        <w:rPr>
-          <w:rFonts w:ascii="Times New Roman" w:hAnsi="Times New Roman"/>
-          <w:sz w:val="26"/>
-        </w:rPr>
-        <w:t>Tái nhập viện trong thời gian ngắn là một vấn đề quan trọng trong quản trị bệnh viện vì làm tăng chi phí điều trị, gây áp lực lên nhân lực y tế và phản ánh nguy cơ biến chứng sau xuất viện. Đồ án này xây dựng hệ thống MLOps dự đoán khả năng bệnh nhân tiểu đường tái nhập viện trong vòng dưới 30 ngày dựa trên dữ liệu lâm sàng, thông tin nhập viện, chẩn đoán và thuốc điều trị.</w:t>
-      </w:r>
-    </w:p>
-    <w:p>
-      <w:pPr>
-        <w:pStyle w:val="30"/>
-      </w:pPr>
-      <w:r>
-        <w:rPr>
-          <w:rFonts w:ascii="Times New Roman" w:hAnsi="Times New Roman"/>
-          <w:sz w:val="26"/>
-        </w:rPr>
-        <w:t>Về dữ liệu, project sử dụng tệp diabetic_data.csv gồm 101.766 lượt khám với 50 cột. Nhãn nhị phân được tạo từ cột readmitted, trong đó giá trị &lt;30 được xem là ca tái nhập viện sớm. Pipeline xử lý dữ liệu loại bỏ một số cột thiếu nhiều hoặc ít hữu ích, chuẩn hóa giá trị thiếu, mã hóa biến phân loại và huấn luyện các mô hình ứng viên bằng scikit-learn.</w:t>
-      </w:r>
-    </w:p>
-    <w:p>
-      <w:pPr>
-        <w:pStyle w:val="30"/>
-      </w:pPr>
-      <w:r>
-        <w:rPr>
-          <w:rFonts w:ascii="Times New Roman" w:hAnsi="Times New Roman"/>
-          <w:sz w:val="26"/>
-        </w:rPr>
-        <w:t>Về hệ thống, đồ án triển khai đầy đủ các thành phần MLOps: Kafka và Spark cho luồng dữ liệu batch/streaming, Airflow điều phối ingestion/ETL/training/retraining, MLflow và MinIO quản lý thí nghiệm cùng artifact mô hình, FastAPI phục vụ suy luận, PostgreSQL và Redis lưu log, React cung cấp giao diện nghiệp vụ, Prometheus và Grafana giám sát vận hành.</w:t>
+        <w:t>Về hệ thống, đồ án triển khai đầy đủ các thành phần MLOps: Spark batch tạo dữ liệu gold và offline feature, Kafka/Spark Streaming là luồng ingestion tùy chọn, Airflow điều phối ingestion/ETL/training/DB-triggered retraining, MLflow và MinIO quản lý thí nghiệm cùng artifact mô hình, FastAPI phục vụ suy luận, PostgreSQL và Redis lưu log, React cung cấp giao diện nghiệp vụ, Prometheus và Grafana giám sát vận hành.</w:t>
       </w:r>
     </w:p>
     <w:p>
@@ -1575,7 +1208,7 @@
           <w:rFonts w:ascii="Times New Roman" w:hAnsi="Times New Roman"/>
           <w:sz w:val="26"/>
         </w:rPr>
-        <w:t>Hình 1.6: Biểu đồ luồng dữ liệu batch, streaming và serving</w:t>
+        <w:t>Hình 1.6: Biểu đồ luồng dữ liệu batch, streaming tùy chọn và serving</w:t>
       </w:r>
     </w:p>
     <w:p>
@@ -1842,7 +1475,7 @@
         <w:drawing>
           <wp:inline xmlns:a="http://schemas.openxmlformats.org/drawingml/2006/main" xmlns:pic="http://schemas.openxmlformats.org/drawingml/2006/picture">
             <wp:extent cx="5852160" cy="3474720"/>
-            <wp:docPr id="3" name="Picture 3"/>
+            <wp:docPr id="2" name="Picture 2"/>
             <wp:cNvGraphicFramePr>
               <a:graphicFrameLocks noChangeAspect="1"/>
             </wp:cNvGraphicFramePr>
@@ -1918,7 +1551,7 @@
         <w:drawing>
           <wp:inline xmlns:a="http://schemas.openxmlformats.org/drawingml/2006/main" xmlns:pic="http://schemas.openxmlformats.org/drawingml/2006/picture">
             <wp:extent cx="5852160" cy="3474720"/>
-            <wp:docPr id="4" name="Picture 4"/>
+            <wp:docPr id="3" name="Picture 3"/>
             <wp:cNvGraphicFramePr>
               <a:graphicFrameLocks noChangeAspect="1"/>
             </wp:cNvGraphicFramePr>
@@ -2423,7 +2056,7 @@
         <w:drawing>
           <wp:inline xmlns:a="http://schemas.openxmlformats.org/drawingml/2006/main" xmlns:pic="http://schemas.openxmlformats.org/drawingml/2006/picture">
             <wp:extent cx="5852160" cy="3474720"/>
-            <wp:docPr id="5" name="Picture 5"/>
+            <wp:docPr id="4" name="Picture 4"/>
             <wp:cNvGraphicFramePr>
               <a:graphicFrameLocks noChangeAspect="1"/>
             </wp:cNvGraphicFramePr>
@@ -2499,7 +2132,7 @@
         <w:drawing>
           <wp:inline xmlns:a="http://schemas.openxmlformats.org/drawingml/2006/main" xmlns:pic="http://schemas.openxmlformats.org/drawingml/2006/picture">
             <wp:extent cx="5852160" cy="3474720"/>
-            <wp:docPr id="6" name="Picture 6"/>
+            <wp:docPr id="5" name="Picture 5"/>
             <wp:cNvGraphicFramePr>
               <a:graphicFrameLocks noChangeAspect="1"/>
             </wp:cNvGraphicFramePr>
@@ -2575,7 +2208,7 @@
         <w:drawing>
           <wp:inline xmlns:a="http://schemas.openxmlformats.org/drawingml/2006/main" xmlns:pic="http://schemas.openxmlformats.org/drawingml/2006/picture">
             <wp:extent cx="5852160" cy="3474720"/>
-            <wp:docPr id="7" name="Picture 7"/>
+            <wp:docPr id="6" name="Picture 6"/>
             <wp:cNvGraphicFramePr>
               <a:graphicFrameLocks noChangeAspect="1"/>
             </wp:cNvGraphicFramePr>
@@ -2871,7 +2504,7 @@
           <w:rFonts w:ascii="Times New Roman" w:hAnsi="Times New Roman"/>
           <w:sz w:val="26"/>
         </w:rPr>
-        <w:t>Luồng dữ liệu của project gồm cả batch và streaming. Dữ liệu CSV gốc có thể được xử lý bằng Spark batch thành tầng gold và feature parquet; đồng thời producer có thể phát lại các dòng CSV vào Kafka để Spark Streaming ghi vào bronze. Các tập dữ liệu này được dùng cho training và retraining.</w:t>
+        <w:t>Luồng dữ liệu chính của project là batch/offline. Dữ liệu CSV gốc được xử lý bằng Spark batch thành tầng gold và offline feature parquet, sau đó được dùng cho training và đăng ký model. Luồng Kafka/Spark Streaming vẫn được giữ dưới dạng tùy chọn để minh họa ingestion gần thời gian thực và ghi bronze parquet, nhưng không còn là trigger tái huấn luyện tự động.</w:t>
       </w:r>
     </w:p>
     <w:p>
@@ -2882,7 +2515,7 @@
         <w:drawing>
           <wp:inline xmlns:a="http://schemas.openxmlformats.org/drawingml/2006/main" xmlns:pic="http://schemas.openxmlformats.org/drawingml/2006/picture">
             <wp:extent cx="5852160" cy="3474720"/>
-            <wp:docPr id="8" name="Picture 8"/>
+            <wp:docPr id="7" name="Picture 7"/>
             <wp:cNvGraphicFramePr>
               <a:graphicFrameLocks noChangeAspect="1"/>
             </wp:cNvGraphicFramePr>
@@ -2923,7 +2556,7 @@
           <w:rFonts w:ascii="Times New Roman" w:hAnsi="Times New Roman"/>
           <w:sz w:val="26"/>
         </w:rPr>
-        <w:t>Hình 1.6: Biểu đồ luồng dữ liệu batch, streaming và serving</w:t>
+        <w:t>Hình 1.6: Biểu đồ luồng dữ liệu batch, streaming tùy chọn và serving</w:t>
       </w:r>
     </w:p>
     <w:p>
@@ -3072,7 +2705,7 @@
                 <w:b w:val="0"/>
                 <w:sz w:val="24"/>
               </w:rPr>
-              <w:t>Hiển thị tổng số dự đoán, xác suất trung bình, số ca positive và phân bố rủi ro</w:t>
+              <w:t>Hiển thị thống kê nghiệp vụ, thông tin model và Grafana dashboard MLOps</w:t>
             </w:r>
           </w:p>
         </w:tc>
@@ -3310,7 +2943,7 @@
                 <w:b w:val="0"/>
                 <w:sz w:val="24"/>
               </w:rPr>
-              <w:t>Nhúng Grafana, Prometheus, MLflow và Airflow vào giao diện quản trị</w:t>
+              <w:t>Truy cập Prometheus, MLflow và Airflow trong giao diện quản trị</w:t>
             </w:r>
           </w:p>
         </w:tc>
@@ -3325,7 +2958,7 @@
         <w:drawing>
           <wp:inline xmlns:a="http://schemas.openxmlformats.org/drawingml/2006/main" xmlns:pic="http://schemas.openxmlformats.org/drawingml/2006/picture">
             <wp:extent cx="5852160" cy="3474720"/>
-            <wp:docPr id="9" name="Picture 9"/>
+            <wp:docPr id="8" name="Picture 8"/>
             <wp:cNvGraphicFramePr>
               <a:graphicFrameLocks noChangeAspect="1"/>
             </wp:cNvGraphicFramePr>
@@ -3413,7 +3046,7 @@
         <w:drawing>
           <wp:inline xmlns:a="http://schemas.openxmlformats.org/drawingml/2006/main" xmlns:pic="http://schemas.openxmlformats.org/drawingml/2006/picture">
             <wp:extent cx="5852160" cy="3474720"/>
-            <wp:docPr id="10" name="Picture 10"/>
+            <wp:docPr id="9" name="Picture 9"/>
             <wp:cNvGraphicFramePr>
               <a:graphicFrameLocks noChangeAspect="1"/>
             </wp:cNvGraphicFramePr>
@@ -3466,7 +3099,7 @@
           <w:rFonts w:ascii="Times New Roman" w:hAnsi="Times New Roman"/>
           <w:sz w:val="26"/>
         </w:rPr>
-        <w:t>Cơ chế tái huấn luyện có hai nhánh. Nhánh thứ nhất dựa trên dữ liệu streaming mới trong tầng bronze; nhánh thứ hai dựa trên số bệnh nhân đã có nhãn actual_readmitted trong PostgreSQL. Sau khi mô hình mới tốt hơn Production theo ngưỡng MIN_IMPROVEMENT, script register_model sẽ đăng ký và promote model mới.</w:t>
+        <w:t>Cơ chế tái huấn luyện được thiết kế theo hướng database-triggered. Khi đủ bệnh nhân hoặc prediction log đã có nhãn actual_readmitted trong PostgreSQL, Airflow chạy prepare_training_from_db để tạo tập db_training_data.csv, huấn luyện lại mô hình, so sánh với phiên bản Production theo ngưỡng MIN_IMPROVEMENT, đăng ký model mới nếu tốt hơn và gọi FastAPI reload model.</w:t>
       </w:r>
     </w:p>
     <w:p>
@@ -3477,7 +3110,7 @@
         <w:drawing>
           <wp:inline xmlns:a="http://schemas.openxmlformats.org/drawingml/2006/main" xmlns:pic="http://schemas.openxmlformats.org/drawingml/2006/picture">
             <wp:extent cx="5852160" cy="3474720"/>
-            <wp:docPr id="11" name="Picture 11"/>
+            <wp:docPr id="10" name="Picture 10"/>
             <wp:cNvGraphicFramePr>
               <a:graphicFrameLocks noChangeAspect="1"/>
             </wp:cNvGraphicFramePr>
@@ -3541,7 +3174,7 @@
         <w:drawing>
           <wp:inline xmlns:a="http://schemas.openxmlformats.org/drawingml/2006/main" xmlns:pic="http://schemas.openxmlformats.org/drawingml/2006/picture">
             <wp:extent cx="5852160" cy="3474720"/>
-            <wp:docPr id="12" name="Picture 12"/>
+            <wp:docPr id="11" name="Picture 11"/>
             <wp:cNvGraphicFramePr>
               <a:graphicFrameLocks noChangeAspect="1"/>
             </wp:cNvGraphicFramePr>
@@ -4296,7 +3929,7 @@
                 <w:b w:val="0"/>
                 <w:sz w:val="24"/>
               </w:rPr>
-              <w:t>Phát lại dữ liệu bệnh nhân và ghi bronze parquet</w:t>
+              <w:t>Luồng tùy chọn để phát lại dữ liệu bệnh nhân và ghi bronze parquet</w:t>
             </w:r>
           </w:p>
         </w:tc>
@@ -4511,7 +4144,7 @@
         <w:drawing>
           <wp:inline xmlns:a="http://schemas.openxmlformats.org/drawingml/2006/main" xmlns:pic="http://schemas.openxmlformats.org/drawingml/2006/picture">
             <wp:extent cx="5852160" cy="3474720"/>
-            <wp:docPr id="13" name="Picture 13"/>
+            <wp:docPr id="12" name="Picture 12"/>
             <wp:cNvGraphicFramePr>
               <a:graphicFrameLocks noChangeAspect="1"/>
             </wp:cNvGraphicFramePr>
@@ -4636,7 +4269,7 @@
           <w:rFonts w:ascii="Times New Roman" w:hAnsi="Times New Roman"/>
           <w:sz w:val="26"/>
         </w:rPr>
-        <w:t>ingestion_dag tạo Kafka topic patient-events và chạy producer phát lại dữ liệu CSV. etl_dag chạy Spark batch ETL để tạo data/gold/diabetic_gold.parquet, sau đó chạy feature_engineering.py để tạo data/features/offline/patient_features.parquet. Spark Streaming liên tục đọc topic patient-events và ghi bronze parquet.</w:t>
+        <w:t>ingestion_dag tạo Kafka topic patient-events và chạy producer phát lại dữ liệu CSV. etl_dag chạy Spark batch ETL để tạo data/gold/diabetic_gold.parquet, sau đó chạy feature_engineering.py để tạo data/features/offline/patient_features.parquet. Spark Streaming được đóng gói trong profile tùy chọn để ghi bronze parquet khi cần demo ingestion liên tục.</w:t>
       </w:r>
     </w:p>
     <w:p>
@@ -4695,7 +4328,7 @@
         <w:drawing>
           <wp:inline xmlns:a="http://schemas.openxmlformats.org/drawingml/2006/main" xmlns:pic="http://schemas.openxmlformats.org/drawingml/2006/picture">
             <wp:extent cx="5852160" cy="3474720"/>
-            <wp:docPr id="14" name="Picture 14"/>
+            <wp:docPr id="13" name="Picture 13"/>
             <wp:cNvGraphicFramePr>
               <a:graphicFrameLocks noChangeAspect="1"/>
             </wp:cNvGraphicFramePr>
@@ -6290,7 +5923,7 @@
     </w:p>
     <w:p>
       <w:r>
-        <w:t>airflow/: Dockerfile và các DAG ingestion, ETL, training, data-triggered retraining, db-triggered retraining.</w:t>
+        <w:t>airflow/: Dockerfile và các DAG ingestion, ETL, training, db-triggered retraining.</w:t>
       </w:r>
     </w:p>
     <w:p>
@@ -6299,7 +5932,7 @@
           <w:rFonts w:ascii="Times New Roman" w:hAnsi="Times New Roman"/>
           <w:sz w:val="24"/>
         </w:rPr>
-        <w:t>- airflow/: Dockerfile và các DAG ingestion, ETL, training, data-triggered retraining, db-triggered retraining.</w:t>
+        <w:t>- airflow/: Dockerfile và các DAG ingestion, ETL, training, db-triggered retraining.</w:t>
       </w:r>
     </w:p>
     <w:p>
@@ -6318,7 +5951,7 @@
     </w:p>
     <w:p>
       <w:r>
-        <w:t>training/: pipeline huấn luyện, chuẩn bị dữ liệu retraining và đăng ký model.</w:t>
+        <w:t>training/: pipeline huấn luyện, chuẩn bị dữ liệu DB retraining và đăng ký model.</w:t>
       </w:r>
     </w:p>
     <w:p>
@@ -6327,7 +5960,7 @@
           <w:rFonts w:ascii="Times New Roman" w:hAnsi="Times New Roman"/>
           <w:sz w:val="24"/>
         </w:rPr>
-        <w:t>- training/: pipeline huấn luyện, chuẩn bị dữ liệu retraining và đăng ký model.</w:t>
+        <w:t>- training/: pipeline huấn luyện, chuẩn bị dữ liệu DB retraining và đăng ký model.</w:t>
       </w:r>
     </w:p>
     <w:p>

</xml_diff>

<commit_message>
feat: add admin user management
</commit_message>
<xml_diff>
--- a/docs/Hospital_Readmission_Prediction_Report.docx
+++ b/docs/Hospital_Readmission_Prediction_Report.docx
@@ -1198,7 +1198,7 @@
           <w:rFonts w:ascii="Times New Roman" w:hAnsi="Times New Roman"/>
           <w:sz w:val="26"/>
         </w:rPr>
-        <w:t>Hình 1.5: Biểu đồ quan hệ dữ liệu PostgreSQL</w:t>
+        <w:t>Hình 1.5: Biểu đồ lớp của hệ thống</w:t>
       </w:r>
     </w:p>
     <w:p>
@@ -1208,7 +1208,7 @@
           <w:rFonts w:ascii="Times New Roman" w:hAnsi="Times New Roman"/>
           <w:sz w:val="26"/>
         </w:rPr>
-        <w:t>Hình 1.6: Biểu đồ luồng dữ liệu batch, streaming tùy chọn và serving</w:t>
+        <w:t>Hình 1.6: Biểu đồ quan hệ dữ liệu PostgreSQL</w:t>
       </w:r>
     </w:p>
     <w:p>
@@ -1218,7 +1218,7 @@
           <w:rFonts w:ascii="Times New Roman" w:hAnsi="Times New Roman"/>
           <w:sz w:val="26"/>
         </w:rPr>
-        <w:t>Hình 1.7: Thiết kế các giao diện chính</w:t>
+        <w:t>Hình 1.7: Biểu đồ luồng dữ liệu batch, streaming tùy chọn và serving</w:t>
       </w:r>
     </w:p>
     <w:p>
@@ -1228,7 +1228,7 @@
           <w:rFonts w:ascii="Times New Roman" w:hAnsi="Times New Roman"/>
           <w:sz w:val="26"/>
         </w:rPr>
-        <w:t>Hình 1.8: Quy trình tiền xử lý, huấn luyện và lựa chọn mô hình</w:t>
+        <w:t>Hình 1.8: Thiết kế các giao diện chính</w:t>
       </w:r>
     </w:p>
     <w:p>
@@ -1238,7 +1238,7 @@
           <w:rFonts w:ascii="Times New Roman" w:hAnsi="Times New Roman"/>
           <w:sz w:val="26"/>
         </w:rPr>
-        <w:t>Hình 1.9: Luồng tái huấn luyện tự động</w:t>
+        <w:t>Hình 1.9: Quy trình tiền xử lý, huấn luyện và lựa chọn mô hình</w:t>
       </w:r>
     </w:p>
     <w:p>
@@ -1248,7 +1248,7 @@
           <w:rFonts w:ascii="Times New Roman" w:hAnsi="Times New Roman"/>
           <w:sz w:val="26"/>
         </w:rPr>
-        <w:t>Hình 1.10: Sơ đồ MLOps tổng thể</w:t>
+        <w:t>Hình 1.10: Luồng tái huấn luyện tự động</w:t>
       </w:r>
     </w:p>
     <w:p>
@@ -1258,6 +1258,16 @@
           <w:rFonts w:ascii="Times New Roman" w:hAnsi="Times New Roman"/>
           <w:sz w:val="26"/>
         </w:rPr>
+        <w:t>Hình 1.11: Sơ đồ MLOps tổng thể</w:t>
+      </w:r>
+    </w:p>
+    <w:p>
+      <w:pPr/>
+      <w:r>
+        <w:rPr>
+          <w:rFonts w:ascii="Times New Roman" w:hAnsi="Times New Roman"/>
+          <w:sz w:val="26"/>
+        </w:rPr>
         <w:t>Hình 2.1: Sơ đồ triển khai Docker Compose</w:t>
       </w:r>
     </w:p>
@@ -1464,7 +1474,7 @@
           <w:rFonts w:ascii="Times New Roman" w:hAnsi="Times New Roman"/>
           <w:sz w:val="26"/>
         </w:rPr>
-        <w:t>Hệ thống được chia thành bốn nhóm chức năng chính: quản lý bệnh nhân, dự đoán tái nhập viện, MLOps pipeline và quan sát vận hành. Cách phân rã này giúp tách rõ chức năng nghiệp vụ cho bác sĩ với chức năng quản trị mô hình dành cho admin.</w:t>
+        <w:t>Hệ thống được chia thành bốn nhóm chức năng chính: quản lý người dùng và bệnh nhân, dự đoán tái nhập viện, dữ liệu và logging, quản trị MLOps. Cách phân rã này giúp tách rõ chức năng nghiệp vụ cho bác sĩ với chức năng vận hành mô hình dành cho admin.</w:t>
       </w:r>
     </w:p>
     <w:p>
@@ -1474,7 +1484,7 @@
       <w:r>
         <w:drawing>
           <wp:inline xmlns:a="http://schemas.openxmlformats.org/drawingml/2006/main" xmlns:pic="http://schemas.openxmlformats.org/drawingml/2006/picture">
-            <wp:extent cx="5852160" cy="3474720"/>
+            <wp:extent cx="5852160" cy="7315200"/>
             <wp:docPr id="2" name="Picture 2"/>
             <wp:cNvGraphicFramePr>
               <a:graphicFrameLocks noChangeAspect="1"/>
@@ -1495,7 +1505,7 @@
                   <pic:spPr>
                     <a:xfrm>
                       <a:off x="0" y="0"/>
-                      <a:ext cx="5852160" cy="3474720"/>
+                      <a:ext cx="5852160" cy="7315200"/>
                     </a:xfrm>
                     <a:prstGeom prst="rect"/>
                   </pic:spPr>
@@ -1550,7 +1560,7 @@
       <w:r>
         <w:drawing>
           <wp:inline xmlns:a="http://schemas.openxmlformats.org/drawingml/2006/main" xmlns:pic="http://schemas.openxmlformats.org/drawingml/2006/picture">
-            <wp:extent cx="5852160" cy="3474720"/>
+            <wp:extent cx="5852160" cy="3738880"/>
             <wp:docPr id="3" name="Picture 3"/>
             <wp:cNvGraphicFramePr>
               <a:graphicFrameLocks noChangeAspect="1"/>
@@ -1571,7 +1581,7 @@
                   <pic:spPr>
                     <a:xfrm>
                       <a:off x="0" y="0"/>
-                      <a:ext cx="5852160" cy="3474720"/>
+                      <a:ext cx="5852160" cy="3738880"/>
                     </a:xfrm>
                     <a:prstGeom prst="rect"/>
                   </pic:spPr>
@@ -2055,7 +2065,7 @@
       <w:r>
         <w:drawing>
           <wp:inline xmlns:a="http://schemas.openxmlformats.org/drawingml/2006/main" xmlns:pic="http://schemas.openxmlformats.org/drawingml/2006/picture">
-            <wp:extent cx="5852160" cy="3474720"/>
+            <wp:extent cx="5852160" cy="7802880"/>
             <wp:docPr id="4" name="Picture 4"/>
             <wp:cNvGraphicFramePr>
               <a:graphicFrameLocks noChangeAspect="1"/>
@@ -2076,7 +2086,7 @@
                   <pic:spPr>
                     <a:xfrm>
                       <a:off x="0" y="0"/>
-                      <a:ext cx="5852160" cy="3474720"/>
+                      <a:ext cx="5852160" cy="7802880"/>
                     </a:xfrm>
                     <a:prstGeom prst="rect"/>
                   </pic:spPr>
@@ -2131,7 +2141,7 @@
       <w:r>
         <w:drawing>
           <wp:inline xmlns:a="http://schemas.openxmlformats.org/drawingml/2006/main" xmlns:pic="http://schemas.openxmlformats.org/drawingml/2006/picture">
-            <wp:extent cx="5852160" cy="3474720"/>
+            <wp:extent cx="5852160" cy="4389120"/>
             <wp:docPr id="5" name="Picture 5"/>
             <wp:cNvGraphicFramePr>
               <a:graphicFrameLocks noChangeAspect="1"/>
@@ -2152,7 +2162,7 @@
                   <pic:spPr>
                     <a:xfrm>
                       <a:off x="0" y="0"/>
-                      <a:ext cx="5852160" cy="3474720"/>
+                      <a:ext cx="5852160" cy="4389120"/>
                     </a:xfrm>
                     <a:prstGeom prst="rect"/>
                   </pic:spPr>
@@ -2197,7 +2207,7 @@
           <w:rFonts w:ascii="Times New Roman" w:hAnsi="Times New Roman"/>
           <w:sz w:val="26"/>
         </w:rPr>
-        <w:t>Tầng dữ liệu quan hệ được hiện thực bằng PostgreSQL. Các bảng cốt lõi gồm users, patients, prediction_logs, retraining_state và retraining_runs. Bảng patients lưu đặc trưng đầu vào và nhãn thực tế nếu có; prediction_logs lưu kết quả suy luận; retraining_state và retraining_runs phục vụ quyết định tái huấn luyện.</w:t>
+        <w:t>Tầng dữ liệu quan hệ được hiện thực bằng PostgreSQL. Ở mức thiết kế lớp, các thành phần User, Patient, PredictionLog, RetrainingState, RetrainingRun và các service nghiệp vụ thể hiện trách nhiệm chính của hệ thống. Ở mức dữ liệu, các bảng cốt lõi gồm users, patients, prediction_logs, retraining_state và retraining_runs.</w:t>
       </w:r>
     </w:p>
     <w:p>
@@ -2207,7 +2217,7 @@
       <w:r>
         <w:drawing>
           <wp:inline xmlns:a="http://schemas.openxmlformats.org/drawingml/2006/main" xmlns:pic="http://schemas.openxmlformats.org/drawingml/2006/picture">
-            <wp:extent cx="5852160" cy="3474720"/>
+            <wp:extent cx="5852160" cy="4389120"/>
             <wp:docPr id="6" name="Picture 6"/>
             <wp:cNvGraphicFramePr>
               <a:graphicFrameLocks noChangeAspect="1"/>
@@ -2216,7 +2226,7 @@
               <a:graphicData uri="http://schemas.openxmlformats.org/drawingml/2006/picture">
                 <pic:pic>
                   <pic:nvPicPr>
-                    <pic:cNvPr id="0" name="05_erd.png"/>
+                    <pic:cNvPr id="0" name="05_class_diagram.png"/>
                     <pic:cNvPicPr/>
                   </pic:nvPicPr>
                   <pic:blipFill>
@@ -2228,7 +2238,7 @@
                   <pic:spPr>
                     <a:xfrm>
                       <a:off x="0" y="0"/>
-                      <a:ext cx="5852160" cy="3474720"/>
+                      <a:ext cx="5852160" cy="4389120"/>
                     </a:xfrm>
                     <a:prstGeom prst="rect"/>
                   </pic:spPr>
@@ -2249,7 +2259,59 @@
           <w:rFonts w:ascii="Times New Roman" w:hAnsi="Times New Roman"/>
           <w:sz w:val="26"/>
         </w:rPr>
-        <w:t>Hình 1.5: Biểu đồ quan hệ dữ liệu PostgreSQL</w:t>
+        <w:t>Hình 1.5: Biểu đồ lớp của hệ thống</w:t>
+      </w:r>
+    </w:p>
+    <w:p>
+      <w:pPr>
+        <w:jc w:val="center"/>
+      </w:pPr>
+      <w:r>
+        <w:drawing>
+          <wp:inline xmlns:a="http://schemas.openxmlformats.org/drawingml/2006/main" xmlns:pic="http://schemas.openxmlformats.org/drawingml/2006/picture">
+            <wp:extent cx="5852160" cy="4064000"/>
+            <wp:docPr id="7" name="Picture 7"/>
+            <wp:cNvGraphicFramePr>
+              <a:graphicFrameLocks noChangeAspect="1"/>
+            </wp:cNvGraphicFramePr>
+            <a:graphic>
+              <a:graphicData uri="http://schemas.openxmlformats.org/drawingml/2006/picture">
+                <pic:pic>
+                  <pic:nvPicPr>
+                    <pic:cNvPr id="0" name="06_erd.png"/>
+                    <pic:cNvPicPr/>
+                  </pic:nvPicPr>
+                  <pic:blipFill>
+                    <a:blip r:embed="rId17"/>
+                    <a:stretch>
+                      <a:fillRect/>
+                    </a:stretch>
+                  </pic:blipFill>
+                  <pic:spPr>
+                    <a:xfrm>
+                      <a:off x="0" y="0"/>
+                      <a:ext cx="5852160" cy="4064000"/>
+                    </a:xfrm>
+                    <a:prstGeom prst="rect"/>
+                  </pic:spPr>
+                </pic:pic>
+              </a:graphicData>
+            </a:graphic>
+          </wp:inline>
+        </w:drawing>
+      </w:r>
+    </w:p>
+    <w:p>
+      <w:pPr>
+        <w:pStyle w:val="55"/>
+        <w:jc w:val="center"/>
+      </w:pPr>
+      <w:r>
+        <w:rPr>
+          <w:rFonts w:ascii="Times New Roman" w:hAnsi="Times New Roman"/>
+          <w:sz w:val="26"/>
+        </w:rPr>
+        <w:t>Hình 1.6: Biểu đồ quan hệ dữ liệu PostgreSQL</w:t>
       </w:r>
     </w:p>
     <w:p>
@@ -2515,449 +2577,6 @@
         <w:drawing>
           <wp:inline xmlns:a="http://schemas.openxmlformats.org/drawingml/2006/main" xmlns:pic="http://schemas.openxmlformats.org/drawingml/2006/picture">
             <wp:extent cx="5852160" cy="3474720"/>
-            <wp:docPr id="7" name="Picture 7"/>
-            <wp:cNvGraphicFramePr>
-              <a:graphicFrameLocks noChangeAspect="1"/>
-            </wp:cNvGraphicFramePr>
-            <a:graphic>
-              <a:graphicData uri="http://schemas.openxmlformats.org/drawingml/2006/picture">
-                <pic:pic>
-                  <pic:nvPicPr>
-                    <pic:cNvPr id="0" name="06_dfd.png"/>
-                    <pic:cNvPicPr/>
-                  </pic:nvPicPr>
-                  <pic:blipFill>
-                    <a:blip r:embed="rId17"/>
-                    <a:stretch>
-                      <a:fillRect/>
-                    </a:stretch>
-                  </pic:blipFill>
-                  <pic:spPr>
-                    <a:xfrm>
-                      <a:off x="0" y="0"/>
-                      <a:ext cx="5852160" cy="3474720"/>
-                    </a:xfrm>
-                    <a:prstGeom prst="rect"/>
-                  </pic:spPr>
-                </pic:pic>
-              </a:graphicData>
-            </a:graphic>
-          </wp:inline>
-        </w:drawing>
-      </w:r>
-    </w:p>
-    <w:p>
-      <w:pPr>
-        <w:pStyle w:val="55"/>
-        <w:jc w:val="center"/>
-      </w:pPr>
-      <w:r>
-        <w:rPr>
-          <w:rFonts w:ascii="Times New Roman" w:hAnsi="Times New Roman"/>
-          <w:sz w:val="26"/>
-        </w:rPr>
-        <w:t>Hình 1.6: Biểu đồ luồng dữ liệu batch, streaming tùy chọn và serving</w:t>
-      </w:r>
-    </w:p>
-    <w:p>
-      <w:pPr>
-        <w:pStyle w:val="3"/>
-      </w:pPr>
-      <w:r>
-        <w:rPr>
-          <w:rFonts w:ascii="Times New Roman" w:hAnsi="Times New Roman"/>
-          <w:color w:val="000000"/>
-        </w:rPr>
-        <w:t>1.8. Thiết kế giao diện</w:t>
-      </w:r>
-    </w:p>
-    <w:p>
-      <w:pPr>
-        <w:pStyle w:val="30"/>
-      </w:pPr>
-      <w:r>
-        <w:rPr>
-          <w:rFonts w:ascii="Times New Roman" w:hAnsi="Times New Roman"/>
-          <w:sz w:val="26"/>
-        </w:rPr>
-        <w:t>Giao diện được xây dựng bằng React và Vite. Các màn hình chính được thiết kế cho hai nhóm người dùng: bác sĩ thao tác với bệnh nhân và admin vận hành hệ thống MLOps. Giao diện sử dụng các khối thông tin ngắn, bảng danh sách và form lâm sàng để giảm thao tác lặp lại.</w:t>
-      </w:r>
-    </w:p>
-    <w:p>
-      <w:pPr>
-        <w:pStyle w:val="56"/>
-        <w:jc w:val="center"/>
-      </w:pPr>
-      <w:r>
-        <w:rPr>
-          <w:rFonts w:ascii="Times New Roman" w:hAnsi="Times New Roman"/>
-          <w:sz w:val="26"/>
-        </w:rPr>
-        <w:t>Bảng 1.3: Các màn hình chính của giao diện</w:t>
-      </w:r>
-    </w:p>
-    <w:tbl>
-      <w:tblPr>
-        <w:tblStyle w:val="20"/>
-        <w:tblW w:type="auto" w:w="0"/>
-        <w:tblLook w:firstColumn="1" w:firstRow="1" w:lastColumn="0" w:lastRow="0" w:noHBand="0" w:noVBand="1" w:val="04A0"/>
-      </w:tblPr>
-      <w:tblGrid>
-        <w:gridCol w:w="4560"/>
-        <w:gridCol w:w="4560"/>
-      </w:tblGrid>
-      <w:tr>
-        <w:tc>
-          <w:tcPr>
-            <w:tcW w:type="dxa" w:w="4560"/>
-            <w:shd w:fill="D9D9D9"/>
-          </w:tcPr>
-          <w:p>
-            <w:r/>
-            <w:r>
-              <w:rPr>
-                <w:rFonts w:ascii="Times New Roman" w:hAnsi="Times New Roman"/>
-                <w:b/>
-                <w:sz w:val="24"/>
-              </w:rPr>
-              <w:t>Màn hình</w:t>
-            </w:r>
-          </w:p>
-        </w:tc>
-        <w:tc>
-          <w:tcPr>
-            <w:tcW w:type="dxa" w:w="4560"/>
-            <w:shd w:fill="D9D9D9"/>
-          </w:tcPr>
-          <w:p>
-            <w:r/>
-            <w:r>
-              <w:rPr>
-                <w:rFonts w:ascii="Times New Roman" w:hAnsi="Times New Roman"/>
-                <w:b/>
-                <w:sz w:val="24"/>
-              </w:rPr>
-              <w:t>Chức năng chính</w:t>
-            </w:r>
-          </w:p>
-        </w:tc>
-      </w:tr>
-      <w:tr>
-        <w:tc>
-          <w:tcPr>
-            <w:tcW w:type="dxa" w:w="4560"/>
-          </w:tcPr>
-          <w:p>
-            <w:r/>
-            <w:r>
-              <w:rPr>
-                <w:rFonts w:ascii="Times New Roman" w:hAnsi="Times New Roman"/>
-                <w:b w:val="0"/>
-                <w:sz w:val="24"/>
-              </w:rPr>
-              <w:t>Login</w:t>
-            </w:r>
-          </w:p>
-        </w:tc>
-        <w:tc>
-          <w:tcPr>
-            <w:tcW w:type="dxa" w:w="4560"/>
-          </w:tcPr>
-          <w:p>
-            <w:r/>
-            <w:r>
-              <w:rPr>
-                <w:rFonts w:ascii="Times New Roman" w:hAnsi="Times New Roman"/>
-                <w:b w:val="0"/>
-                <w:sz w:val="24"/>
-              </w:rPr>
-              <w:t>Đăng nhập với tài khoản doctor01/doctor123 hoặc admin01/admin123</w:t>
-            </w:r>
-          </w:p>
-        </w:tc>
-      </w:tr>
-      <w:tr>
-        <w:tc>
-          <w:tcPr>
-            <w:tcW w:type="dxa" w:w="4560"/>
-          </w:tcPr>
-          <w:p>
-            <w:r/>
-            <w:r>
-              <w:rPr>
-                <w:rFonts w:ascii="Times New Roman" w:hAnsi="Times New Roman"/>
-                <w:b w:val="0"/>
-                <w:sz w:val="24"/>
-              </w:rPr>
-              <w:t>Dashboard</w:t>
-            </w:r>
-          </w:p>
-        </w:tc>
-        <w:tc>
-          <w:tcPr>
-            <w:tcW w:type="dxa" w:w="4560"/>
-          </w:tcPr>
-          <w:p>
-            <w:r/>
-            <w:r>
-              <w:rPr>
-                <w:rFonts w:ascii="Times New Roman" w:hAnsi="Times New Roman"/>
-                <w:b w:val="0"/>
-                <w:sz w:val="24"/>
-              </w:rPr>
-              <w:t>Hiển thị thống kê nghiệp vụ, thông tin model và Grafana dashboard MLOps</w:t>
-            </w:r>
-          </w:p>
-        </w:tc>
-      </w:tr>
-      <w:tr>
-        <w:tc>
-          <w:tcPr>
-            <w:tcW w:type="dxa" w:w="4560"/>
-          </w:tcPr>
-          <w:p>
-            <w:r/>
-            <w:r>
-              <w:rPr>
-                <w:rFonts w:ascii="Times New Roman" w:hAnsi="Times New Roman"/>
-                <w:b w:val="0"/>
-                <w:sz w:val="24"/>
-              </w:rPr>
-              <w:t>Doctor Overview</w:t>
-            </w:r>
-          </w:p>
-        </w:tc>
-        <w:tc>
-          <w:tcPr>
-            <w:tcW w:type="dxa" w:w="4560"/>
-          </w:tcPr>
-          <w:p>
-            <w:r/>
-            <w:r>
-              <w:rPr>
-                <w:rFonts w:ascii="Times New Roman" w:hAnsi="Times New Roman"/>
-                <w:b w:val="0"/>
-                <w:sz w:val="24"/>
-              </w:rPr>
-              <w:t>Tổng quan bệnh nhân của bác sĩ và danh sách ưu tiên</w:t>
-            </w:r>
-          </w:p>
-        </w:tc>
-      </w:tr>
-      <w:tr>
-        <w:tc>
-          <w:tcPr>
-            <w:tcW w:type="dxa" w:w="4560"/>
-          </w:tcPr>
-          <w:p>
-            <w:r/>
-            <w:r>
-              <w:rPr>
-                <w:rFonts w:ascii="Times New Roman" w:hAnsi="Times New Roman"/>
-                <w:b w:val="0"/>
-                <w:sz w:val="24"/>
-              </w:rPr>
-              <w:t>Patients</w:t>
-            </w:r>
-          </w:p>
-        </w:tc>
-        <w:tc>
-          <w:tcPr>
-            <w:tcW w:type="dxa" w:w="4560"/>
-          </w:tcPr>
-          <w:p>
-            <w:r/>
-            <w:r>
-              <w:rPr>
-                <w:rFonts w:ascii="Times New Roman" w:hAnsi="Times New Roman"/>
-                <w:b w:val="0"/>
-                <w:sz w:val="24"/>
-              </w:rPr>
-              <w:t>Quản lý danh bạ bệnh nhân, xem chi tiết, dự đoán và lịch sử từng bệnh nhân</w:t>
-            </w:r>
-          </w:p>
-        </w:tc>
-      </w:tr>
-      <w:tr>
-        <w:tc>
-          <w:tcPr>
-            <w:tcW w:type="dxa" w:w="4560"/>
-          </w:tcPr>
-          <w:p>
-            <w:r/>
-            <w:r>
-              <w:rPr>
-                <w:rFonts w:ascii="Times New Roman" w:hAnsi="Times New Roman"/>
-                <w:b w:val="0"/>
-                <w:sz w:val="24"/>
-              </w:rPr>
-              <w:t>Create Patient</w:t>
-            </w:r>
-          </w:p>
-        </w:tc>
-        <w:tc>
-          <w:tcPr>
-            <w:tcW w:type="dxa" w:w="4560"/>
-          </w:tcPr>
-          <w:p>
-            <w:r/>
-            <w:r>
-              <w:rPr>
-                <w:rFonts w:ascii="Times New Roman" w:hAnsi="Times New Roman"/>
-                <w:b w:val="0"/>
-                <w:sz w:val="24"/>
-              </w:rPr>
-              <w:t>Nhập hồ sơ bệnh nhân mới và chạy dự đoán ngay sau khi tạo</w:t>
-            </w:r>
-          </w:p>
-        </w:tc>
-      </w:tr>
-      <w:tr>
-        <w:tc>
-          <w:tcPr>
-            <w:tcW w:type="dxa" w:w="4560"/>
-          </w:tcPr>
-          <w:p>
-            <w:r/>
-            <w:r>
-              <w:rPr>
-                <w:rFonts w:ascii="Times New Roman" w:hAnsi="Times New Roman"/>
-                <w:b w:val="0"/>
-                <w:sz w:val="24"/>
-              </w:rPr>
-              <w:t>Predict</w:t>
-            </w:r>
-          </w:p>
-        </w:tc>
-        <w:tc>
-          <w:tcPr>
-            <w:tcW w:type="dxa" w:w="4560"/>
-          </w:tcPr>
-          <w:p>
-            <w:r/>
-            <w:r>
-              <w:rPr>
-                <w:rFonts w:ascii="Times New Roman" w:hAnsi="Times New Roman"/>
-                <w:b w:val="0"/>
-                <w:sz w:val="24"/>
-              </w:rPr>
-              <w:t>Dự đoán trực tiếp từ form lâm sàng không cần tạo hồ sơ trước</w:t>
-            </w:r>
-          </w:p>
-        </w:tc>
-      </w:tr>
-      <w:tr>
-        <w:tc>
-          <w:tcPr>
-            <w:tcW w:type="dxa" w:w="4560"/>
-          </w:tcPr>
-          <w:p>
-            <w:r/>
-            <w:r>
-              <w:rPr>
-                <w:rFonts w:ascii="Times New Roman" w:hAnsi="Times New Roman"/>
-                <w:b w:val="0"/>
-                <w:sz w:val="24"/>
-              </w:rPr>
-              <w:t>High Risk Patients</w:t>
-            </w:r>
-          </w:p>
-        </w:tc>
-        <w:tc>
-          <w:tcPr>
-            <w:tcW w:type="dxa" w:w="4560"/>
-          </w:tcPr>
-          <w:p>
-            <w:r/>
-            <w:r>
-              <w:rPr>
-                <w:rFonts w:ascii="Times New Roman" w:hAnsi="Times New Roman"/>
-                <w:b w:val="0"/>
-                <w:sz w:val="24"/>
-              </w:rPr>
-              <w:t>Danh sách bệnh nhân có nguy cơ tái nhập viện cao</w:t>
-            </w:r>
-          </w:p>
-        </w:tc>
-      </w:tr>
-      <w:tr>
-        <w:tc>
-          <w:tcPr>
-            <w:tcW w:type="dxa" w:w="4560"/>
-          </w:tcPr>
-          <w:p>
-            <w:r/>
-            <w:r>
-              <w:rPr>
-                <w:rFonts w:ascii="Times New Roman" w:hAnsi="Times New Roman"/>
-                <w:b w:val="0"/>
-                <w:sz w:val="24"/>
-              </w:rPr>
-              <w:t>Pipelines</w:t>
-            </w:r>
-          </w:p>
-        </w:tc>
-        <w:tc>
-          <w:tcPr>
-            <w:tcW w:type="dxa" w:w="4560"/>
-          </w:tcPr>
-          <w:p>
-            <w:r/>
-            <w:r>
-              <w:rPr>
-                <w:rFonts w:ascii="Times New Roman" w:hAnsi="Times New Roman"/>
-                <w:b w:val="0"/>
-                <w:sz w:val="24"/>
-              </w:rPr>
-              <w:t>Xem trạng thái DAG và kích hoạt pipeline Airflow</w:t>
-            </w:r>
-          </w:p>
-        </w:tc>
-      </w:tr>
-      <w:tr>
-        <w:tc>
-          <w:tcPr>
-            <w:tcW w:type="dxa" w:w="4560"/>
-          </w:tcPr>
-          <w:p>
-            <w:r/>
-            <w:r>
-              <w:rPr>
-                <w:rFonts w:ascii="Times New Roman" w:hAnsi="Times New Roman"/>
-                <w:b w:val="0"/>
-                <w:sz w:val="24"/>
-              </w:rPr>
-              <w:t>Observability</w:t>
-            </w:r>
-          </w:p>
-        </w:tc>
-        <w:tc>
-          <w:tcPr>
-            <w:tcW w:type="dxa" w:w="4560"/>
-          </w:tcPr>
-          <w:p>
-            <w:r/>
-            <w:r>
-              <w:rPr>
-                <w:rFonts w:ascii="Times New Roman" w:hAnsi="Times New Roman"/>
-                <w:b w:val="0"/>
-                <w:sz w:val="24"/>
-              </w:rPr>
-              <w:t>Truy cập Prometheus, MLflow và Airflow trong giao diện quản trị</w:t>
-            </w:r>
-          </w:p>
-        </w:tc>
-      </w:tr>
-    </w:tbl>
-    <w:p/>
-    <w:p>
-      <w:pPr>
-        <w:jc w:val="center"/>
-      </w:pPr>
-      <w:r>
-        <w:drawing>
-          <wp:inline xmlns:a="http://schemas.openxmlformats.org/drawingml/2006/main" xmlns:pic="http://schemas.openxmlformats.org/drawingml/2006/picture">
-            <wp:extent cx="5852160" cy="3474720"/>
             <wp:docPr id="8" name="Picture 8"/>
             <wp:cNvGraphicFramePr>
               <a:graphicFrameLocks noChangeAspect="1"/>
@@ -2966,7 +2585,7 @@
               <a:graphicData uri="http://schemas.openxmlformats.org/drawingml/2006/picture">
                 <pic:pic>
                   <pic:nvPicPr>
-                    <pic:cNvPr id="0" name="11_ui_wireframe.png"/>
+                    <pic:cNvPr id="0" name="07_dfd.png"/>
                     <pic:cNvPicPr/>
                   </pic:nvPicPr>
                   <pic:blipFill>
@@ -2999,7 +2618,7 @@
           <w:rFonts w:ascii="Times New Roman" w:hAnsi="Times New Roman"/>
           <w:sz w:val="26"/>
         </w:rPr>
-        <w:t>Hình 1.7: Thiết kế các giao diện chính</w:t>
+        <w:t>Hình 1.7: Biểu đồ luồng dữ liệu batch, streaming tùy chọn và serving</w:t>
       </w:r>
     </w:p>
     <w:p>
@@ -3011,7 +2630,7 @@
           <w:rFonts w:ascii="Times New Roman" w:hAnsi="Times New Roman"/>
           <w:color w:val="000000"/>
         </w:rPr>
-        <w:t>1.9. Thiết kế giải thuật</w:t>
+        <w:t>1.8. Thiết kế giao diện</w:t>
       </w:r>
     </w:p>
     <w:p>
@@ -3023,21 +2642,376 @@
           <w:rFonts w:ascii="Times New Roman" w:hAnsi="Times New Roman"/>
           <w:sz w:val="26"/>
         </w:rPr>
-        <w:t>Pipeline huấn luyện đọc dữ liệu CSV, thay ký tự ? bằng missing value, tạo nhãn readmitted_binary, loại bỏ các cột encounter_id, patient_nbr, weight, payer_code, medical_specialty và readmitted. Sau đó dữ liệu được chia train/test theo tỷ lệ 80/20 có stratify để giữ phân bố nhãn.</w:t>
-      </w:r>
-    </w:p>
-    <w:p>
-      <w:pPr>
-        <w:pStyle w:val="30"/>
-      </w:pPr>
-      <w:r>
-        <w:rPr>
-          <w:rFonts w:ascii="Times New Roman" w:hAnsi="Times New Roman"/>
-          <w:sz w:val="26"/>
-        </w:rPr>
-        <w:t>Mô hình được xây dựng bằng sklearn Pipeline. Các cột số đi qua SimpleImputer(strategy='median') và StandardScaler; các cột phân loại đi qua SimpleImputer(fill_value='Unknown') và OneHotEncoder(handle_unknown='ignore'). Hai ứng viên trong cấu hình hiện tại là Random Forest và Logistic Regression, champion được chọn theo ROC-AUC.</w:t>
-      </w:r>
-    </w:p>
+        <w:t>Giao diện được xây dựng bằng React và Vite. Các màn hình chính được thiết kế cho hai nhóm người dùng: bác sĩ thao tác với bệnh nhân và admin vận hành hệ thống MLOps. Giao diện sử dụng các khối thông tin ngắn, bảng danh sách và form lâm sàng để giảm thao tác lặp lại.</w:t>
+      </w:r>
+    </w:p>
+    <w:p>
+      <w:pPr>
+        <w:pStyle w:val="56"/>
+        <w:jc w:val="center"/>
+      </w:pPr>
+      <w:r>
+        <w:rPr>
+          <w:rFonts w:ascii="Times New Roman" w:hAnsi="Times New Roman"/>
+          <w:sz w:val="26"/>
+        </w:rPr>
+        <w:t>Bảng 1.3: Các màn hình chính của giao diện</w:t>
+      </w:r>
+    </w:p>
+    <w:tbl>
+      <w:tblPr>
+        <w:tblStyle w:val="20"/>
+        <w:tblW w:type="auto" w:w="0"/>
+        <w:tblLook w:firstColumn="1" w:firstRow="1" w:lastColumn="0" w:lastRow="0" w:noHBand="0" w:noVBand="1" w:val="04A0"/>
+      </w:tblPr>
+      <w:tblGrid>
+        <w:gridCol w:w="4560"/>
+        <w:gridCol w:w="4560"/>
+      </w:tblGrid>
+      <w:tr>
+        <w:tc>
+          <w:tcPr>
+            <w:tcW w:type="dxa" w:w="4560"/>
+            <w:shd w:fill="D9D9D9"/>
+          </w:tcPr>
+          <w:p>
+            <w:r/>
+            <w:r>
+              <w:rPr>
+                <w:rFonts w:ascii="Times New Roman" w:hAnsi="Times New Roman"/>
+                <w:b/>
+                <w:sz w:val="24"/>
+              </w:rPr>
+              <w:t>Màn hình</w:t>
+            </w:r>
+          </w:p>
+        </w:tc>
+        <w:tc>
+          <w:tcPr>
+            <w:tcW w:type="dxa" w:w="4560"/>
+            <w:shd w:fill="D9D9D9"/>
+          </w:tcPr>
+          <w:p>
+            <w:r/>
+            <w:r>
+              <w:rPr>
+                <w:rFonts w:ascii="Times New Roman" w:hAnsi="Times New Roman"/>
+                <w:b/>
+                <w:sz w:val="24"/>
+              </w:rPr>
+              <w:t>Chức năng chính</w:t>
+            </w:r>
+          </w:p>
+        </w:tc>
+      </w:tr>
+      <w:tr>
+        <w:tc>
+          <w:tcPr>
+            <w:tcW w:type="dxa" w:w="4560"/>
+          </w:tcPr>
+          <w:p>
+            <w:r/>
+            <w:r>
+              <w:rPr>
+                <w:rFonts w:ascii="Times New Roman" w:hAnsi="Times New Roman"/>
+                <w:b w:val="0"/>
+                <w:sz w:val="24"/>
+              </w:rPr>
+              <w:t>Login</w:t>
+            </w:r>
+          </w:p>
+        </w:tc>
+        <w:tc>
+          <w:tcPr>
+            <w:tcW w:type="dxa" w:w="4560"/>
+          </w:tcPr>
+          <w:p>
+            <w:r/>
+            <w:r>
+              <w:rPr>
+                <w:rFonts w:ascii="Times New Roman" w:hAnsi="Times New Roman"/>
+                <w:b w:val="0"/>
+                <w:sz w:val="24"/>
+              </w:rPr>
+              <w:t>Đăng nhập với tài khoản doctor01/doctor123 hoặc admin01/admin123</w:t>
+            </w:r>
+          </w:p>
+        </w:tc>
+      </w:tr>
+      <w:tr>
+        <w:tc>
+          <w:tcPr>
+            <w:tcW w:type="dxa" w:w="4560"/>
+          </w:tcPr>
+          <w:p>
+            <w:r/>
+            <w:r>
+              <w:rPr>
+                <w:rFonts w:ascii="Times New Roman" w:hAnsi="Times New Roman"/>
+                <w:b w:val="0"/>
+                <w:sz w:val="24"/>
+              </w:rPr>
+              <w:t>Dashboard</w:t>
+            </w:r>
+          </w:p>
+        </w:tc>
+        <w:tc>
+          <w:tcPr>
+            <w:tcW w:type="dxa" w:w="4560"/>
+          </w:tcPr>
+          <w:p>
+            <w:r/>
+            <w:r>
+              <w:rPr>
+                <w:rFonts w:ascii="Times New Roman" w:hAnsi="Times New Roman"/>
+                <w:b w:val="0"/>
+                <w:sz w:val="24"/>
+              </w:rPr>
+              <w:t>Hiển thị thống kê nghiệp vụ, thông tin model và Grafana dashboard MLOps</w:t>
+            </w:r>
+          </w:p>
+        </w:tc>
+      </w:tr>
+      <w:tr>
+        <w:tc>
+          <w:tcPr>
+            <w:tcW w:type="dxa" w:w="4560"/>
+          </w:tcPr>
+          <w:p>
+            <w:r/>
+            <w:r>
+              <w:rPr>
+                <w:rFonts w:ascii="Times New Roman" w:hAnsi="Times New Roman"/>
+                <w:b w:val="0"/>
+                <w:sz w:val="24"/>
+              </w:rPr>
+              <w:t>Doctor Overview</w:t>
+            </w:r>
+          </w:p>
+        </w:tc>
+        <w:tc>
+          <w:tcPr>
+            <w:tcW w:type="dxa" w:w="4560"/>
+          </w:tcPr>
+          <w:p>
+            <w:r/>
+            <w:r>
+              <w:rPr>
+                <w:rFonts w:ascii="Times New Roman" w:hAnsi="Times New Roman"/>
+                <w:b w:val="0"/>
+                <w:sz w:val="24"/>
+              </w:rPr>
+              <w:t>Tổng quan bệnh nhân của bác sĩ và danh sách ưu tiên</w:t>
+            </w:r>
+          </w:p>
+        </w:tc>
+      </w:tr>
+      <w:tr>
+        <w:tc>
+          <w:tcPr>
+            <w:tcW w:type="dxa" w:w="4560"/>
+          </w:tcPr>
+          <w:p>
+            <w:r/>
+            <w:r>
+              <w:rPr>
+                <w:rFonts w:ascii="Times New Roman" w:hAnsi="Times New Roman"/>
+                <w:b w:val="0"/>
+                <w:sz w:val="24"/>
+              </w:rPr>
+              <w:t>Patients</w:t>
+            </w:r>
+          </w:p>
+        </w:tc>
+        <w:tc>
+          <w:tcPr>
+            <w:tcW w:type="dxa" w:w="4560"/>
+          </w:tcPr>
+          <w:p>
+            <w:r/>
+            <w:r>
+              <w:rPr>
+                <w:rFonts w:ascii="Times New Roman" w:hAnsi="Times New Roman"/>
+                <w:b w:val="0"/>
+                <w:sz w:val="24"/>
+              </w:rPr>
+              <w:t>Quản lý danh bạ bệnh nhân, xem chi tiết, dự đoán và lịch sử từng bệnh nhân</w:t>
+            </w:r>
+          </w:p>
+        </w:tc>
+      </w:tr>
+      <w:tr>
+        <w:tc>
+          <w:tcPr>
+            <w:tcW w:type="dxa" w:w="4560"/>
+          </w:tcPr>
+          <w:p>
+            <w:r/>
+            <w:r>
+              <w:rPr>
+                <w:rFonts w:ascii="Times New Roman" w:hAnsi="Times New Roman"/>
+                <w:b w:val="0"/>
+                <w:sz w:val="24"/>
+              </w:rPr>
+              <w:t>Create Patient</w:t>
+            </w:r>
+          </w:p>
+        </w:tc>
+        <w:tc>
+          <w:tcPr>
+            <w:tcW w:type="dxa" w:w="4560"/>
+          </w:tcPr>
+          <w:p>
+            <w:r/>
+            <w:r>
+              <w:rPr>
+                <w:rFonts w:ascii="Times New Roman" w:hAnsi="Times New Roman"/>
+                <w:b w:val="0"/>
+                <w:sz w:val="24"/>
+              </w:rPr>
+              <w:t>Nhập hồ sơ bệnh nhân mới và chạy dự đoán ngay sau khi tạo</w:t>
+            </w:r>
+          </w:p>
+        </w:tc>
+      </w:tr>
+      <w:tr>
+        <w:tc>
+          <w:tcPr>
+            <w:tcW w:type="dxa" w:w="4560"/>
+          </w:tcPr>
+          <w:p>
+            <w:r/>
+            <w:r>
+              <w:rPr>
+                <w:rFonts w:ascii="Times New Roman" w:hAnsi="Times New Roman"/>
+                <w:b w:val="0"/>
+                <w:sz w:val="24"/>
+              </w:rPr>
+              <w:t>Predict</w:t>
+            </w:r>
+          </w:p>
+        </w:tc>
+        <w:tc>
+          <w:tcPr>
+            <w:tcW w:type="dxa" w:w="4560"/>
+          </w:tcPr>
+          <w:p>
+            <w:r/>
+            <w:r>
+              <w:rPr>
+                <w:rFonts w:ascii="Times New Roman" w:hAnsi="Times New Roman"/>
+                <w:b w:val="0"/>
+                <w:sz w:val="24"/>
+              </w:rPr>
+              <w:t>Dự đoán trực tiếp từ form lâm sàng không cần tạo hồ sơ trước</w:t>
+            </w:r>
+          </w:p>
+        </w:tc>
+      </w:tr>
+      <w:tr>
+        <w:tc>
+          <w:tcPr>
+            <w:tcW w:type="dxa" w:w="4560"/>
+          </w:tcPr>
+          <w:p>
+            <w:r/>
+            <w:r>
+              <w:rPr>
+                <w:rFonts w:ascii="Times New Roman" w:hAnsi="Times New Roman"/>
+                <w:b w:val="0"/>
+                <w:sz w:val="24"/>
+              </w:rPr>
+              <w:t>High Risk Patients</w:t>
+            </w:r>
+          </w:p>
+        </w:tc>
+        <w:tc>
+          <w:tcPr>
+            <w:tcW w:type="dxa" w:w="4560"/>
+          </w:tcPr>
+          <w:p>
+            <w:r/>
+            <w:r>
+              <w:rPr>
+                <w:rFonts w:ascii="Times New Roman" w:hAnsi="Times New Roman"/>
+                <w:b w:val="0"/>
+                <w:sz w:val="24"/>
+              </w:rPr>
+              <w:t>Danh sách bệnh nhân có nguy cơ tái nhập viện cao</w:t>
+            </w:r>
+          </w:p>
+        </w:tc>
+      </w:tr>
+      <w:tr>
+        <w:tc>
+          <w:tcPr>
+            <w:tcW w:type="dxa" w:w="4560"/>
+          </w:tcPr>
+          <w:p>
+            <w:r/>
+            <w:r>
+              <w:rPr>
+                <w:rFonts w:ascii="Times New Roman" w:hAnsi="Times New Roman"/>
+                <w:b w:val="0"/>
+                <w:sz w:val="24"/>
+              </w:rPr>
+              <w:t>Pipelines</w:t>
+            </w:r>
+          </w:p>
+        </w:tc>
+        <w:tc>
+          <w:tcPr>
+            <w:tcW w:type="dxa" w:w="4560"/>
+          </w:tcPr>
+          <w:p>
+            <w:r/>
+            <w:r>
+              <w:rPr>
+                <w:rFonts w:ascii="Times New Roman" w:hAnsi="Times New Roman"/>
+                <w:b w:val="0"/>
+                <w:sz w:val="24"/>
+              </w:rPr>
+              <w:t>Xem trạng thái DAG và kích hoạt pipeline Airflow</w:t>
+            </w:r>
+          </w:p>
+        </w:tc>
+      </w:tr>
+      <w:tr>
+        <w:tc>
+          <w:tcPr>
+            <w:tcW w:type="dxa" w:w="4560"/>
+          </w:tcPr>
+          <w:p>
+            <w:r/>
+            <w:r>
+              <w:rPr>
+                <w:rFonts w:ascii="Times New Roman" w:hAnsi="Times New Roman"/>
+                <w:b w:val="0"/>
+                <w:sz w:val="24"/>
+              </w:rPr>
+              <w:t>Observability</w:t>
+            </w:r>
+          </w:p>
+        </w:tc>
+        <w:tc>
+          <w:tcPr>
+            <w:tcW w:type="dxa" w:w="4560"/>
+          </w:tcPr>
+          <w:p>
+            <w:r/>
+            <w:r>
+              <w:rPr>
+                <w:rFonts w:ascii="Times New Roman" w:hAnsi="Times New Roman"/>
+                <w:b w:val="0"/>
+                <w:sz w:val="24"/>
+              </w:rPr>
+              <w:t>Truy cập Prometheus, MLflow và Airflow trong giao diện quản trị</w:t>
+            </w:r>
+          </w:p>
+        </w:tc>
+      </w:tr>
+    </w:tbl>
+    <w:p/>
     <w:p>
       <w:pPr>
         <w:jc w:val="center"/>
@@ -3054,7 +3028,7 @@
               <a:graphicData uri="http://schemas.openxmlformats.org/drawingml/2006/picture">
                 <pic:pic>
                   <pic:nvPicPr>
-                    <pic:cNvPr id="0" name="07_algorithm.png"/>
+                    <pic:cNvPr id="0" name="12_ui_wireframe.png"/>
                     <pic:cNvPicPr/>
                   </pic:nvPicPr>
                   <pic:blipFill>
@@ -3087,7 +3061,19 @@
           <w:rFonts w:ascii="Times New Roman" w:hAnsi="Times New Roman"/>
           <w:sz w:val="26"/>
         </w:rPr>
-        <w:t>Hình 1.8: Quy trình tiền xử lý, huấn luyện và lựa chọn mô hình</w:t>
+        <w:t>Hình 1.8: Thiết kế các giao diện chính</w:t>
+      </w:r>
+    </w:p>
+    <w:p>
+      <w:pPr>
+        <w:pStyle w:val="3"/>
+      </w:pPr>
+      <w:r>
+        <w:rPr>
+          <w:rFonts w:ascii="Times New Roman" w:hAnsi="Times New Roman"/>
+          <w:color w:val="000000"/>
+        </w:rPr>
+        <w:t>1.9. Thiết kế giải thuật</w:t>
       </w:r>
     </w:p>
     <w:p>
@@ -3099,7 +3085,19 @@
           <w:rFonts w:ascii="Times New Roman" w:hAnsi="Times New Roman"/>
           <w:sz w:val="26"/>
         </w:rPr>
-        <w:t>Cơ chế tái huấn luyện được thiết kế theo hướng database-triggered. Khi đủ bệnh nhân hoặc prediction log đã có nhãn actual_readmitted trong PostgreSQL, Airflow chạy prepare_training_from_db để tạo tập db_training_data.csv, huấn luyện lại mô hình, so sánh với phiên bản Production theo ngưỡng MIN_IMPROVEMENT, đăng ký model mới nếu tốt hơn và gọi FastAPI reload model.</w:t>
+        <w:t>Pipeline huấn luyện đọc dữ liệu CSV, thay ký tự ? bằng missing value, tạo nhãn readmitted_binary, loại bỏ các cột encounter_id, patient_nbr, weight, payer_code, medical_specialty và readmitted. Sau đó dữ liệu được chia train/test theo tỷ lệ 80/20 có stratify để giữ phân bố nhãn.</w:t>
+      </w:r>
+    </w:p>
+    <w:p>
+      <w:pPr>
+        <w:pStyle w:val="30"/>
+      </w:pPr>
+      <w:r>
+        <w:rPr>
+          <w:rFonts w:ascii="Times New Roman" w:hAnsi="Times New Roman"/>
+          <w:sz w:val="26"/>
+        </w:rPr>
+        <w:t>Mô hình được xây dựng bằng sklearn Pipeline. Các cột số đi qua SimpleImputer(strategy='median') và StandardScaler; các cột phân loại đi qua SimpleImputer(fill_value='Unknown') và OneHotEncoder(handle_unknown='ignore'). Hai ứng viên trong cấu hình hiện tại là Random Forest và Logistic Regression, champion được chọn theo ROC-AUC.</w:t>
       </w:r>
     </w:p>
     <w:p>
@@ -3118,7 +3116,7 @@
               <a:graphicData uri="http://schemas.openxmlformats.org/drawingml/2006/picture">
                 <pic:pic>
                   <pic:nvPicPr>
-                    <pic:cNvPr id="0" name="08_retraining.png"/>
+                    <pic:cNvPr id="0" name="08_algorithm.png"/>
                     <pic:cNvPicPr/>
                   </pic:nvPicPr>
                   <pic:blipFill>
@@ -3151,7 +3149,7 @@
           <w:rFonts w:ascii="Times New Roman" w:hAnsi="Times New Roman"/>
           <w:sz w:val="26"/>
         </w:rPr>
-        <w:t>Hình 1.9: Luồng tái huấn luyện tự động</w:t>
+        <w:t>Hình 1.9: Quy trình tiền xử lý, huấn luyện và lựa chọn mô hình</w:t>
       </w:r>
     </w:p>
     <w:p>
@@ -3163,7 +3161,7 @@
           <w:rFonts w:ascii="Times New Roman" w:hAnsi="Times New Roman"/>
           <w:sz w:val="26"/>
         </w:rPr>
-        <w:t>Sơ đồ MLOps tổng thể mô tả vòng đời khép kín của mô hình: dữ liệu được thu thập và xử lý, thí nghiệm được ghi nhận trong MLflow, model tốt nhất được đưa vào Registry, FastAPI phục vụ suy luận, kết quả vận hành được giám sát và dữ liệu mới quay lại pipeline tái huấn luyện.</w:t>
+        <w:t>Cơ chế tái huấn luyện được thiết kế theo hướng database-triggered. Khi đủ bệnh nhân hoặc prediction log đã có nhãn actual_readmitted trong PostgreSQL, Airflow chạy prepare_training_from_db để tạo tập db_training_data.csv, huấn luyện lại mô hình, so sánh với phiên bản Production theo ngưỡng MIN_IMPROVEMENT, đăng ký model mới nếu tốt hơn và gọi FastAPI reload model.</w:t>
       </w:r>
     </w:p>
     <w:p>
@@ -3182,7 +3180,7 @@
               <a:graphicData uri="http://schemas.openxmlformats.org/drawingml/2006/picture">
                 <pic:pic>
                   <pic:nvPicPr>
-                    <pic:cNvPr id="0" name="09_mlops_diagram.png"/>
+                    <pic:cNvPr id="0" name="09_retraining.png"/>
                     <pic:cNvPicPr/>
                   </pic:nvPicPr>
                   <pic:blipFill>
@@ -3215,19 +3213,7 @@
           <w:rFonts w:ascii="Times New Roman" w:hAnsi="Times New Roman"/>
           <w:sz w:val="26"/>
         </w:rPr>
-        <w:t>Hình 1.10: Sơ đồ MLOps tổng thể</w:t>
-      </w:r>
-    </w:p>
-    <w:p>
-      <w:pPr>
-        <w:pStyle w:val="3"/>
-      </w:pPr>
-      <w:r>
-        <w:rPr>
-          <w:rFonts w:ascii="Times New Roman" w:hAnsi="Times New Roman"/>
-          <w:color w:val="000000"/>
-        </w:rPr>
-        <w:t>1.10. Thiết kế kiểm thử</w:t>
+        <w:t>Hình 1.10: Luồng tái huấn luyện tự động</w:t>
       </w:r>
     </w:p>
     <w:p>
@@ -3239,903 +3225,9 @@
           <w:rFonts w:ascii="Times New Roman" w:hAnsi="Times New Roman"/>
           <w:sz w:val="26"/>
         </w:rPr>
-        <w:t>Kiểm thử hệ thống cần bao phủ cả logic học máy, API nghiệp vụ và vận hành MLOps. Vì hệ thống có nhiều service, kiểm thử tích hợp đặc biệt quan trọng để bảo đảm dữ liệu đi đúng từ giao diện, API, cơ sở dữ liệu đến dashboard giám sát.</w:t>
-      </w:r>
-    </w:p>
-    <w:p>
-      <w:pPr>
-        <w:pStyle w:val="56"/>
-        <w:jc w:val="center"/>
-      </w:pPr>
-      <w:r>
-        <w:rPr>
-          <w:rFonts w:ascii="Times New Roman" w:hAnsi="Times New Roman"/>
-          <w:sz w:val="26"/>
-        </w:rPr>
-        <w:t>Bảng 1.4: Các loại kiểm thử</w:t>
-      </w:r>
-    </w:p>
-    <w:tbl>
-      <w:tblPr>
-        <w:tblStyle w:val="20"/>
-        <w:tblW w:type="auto" w:w="0"/>
-        <w:tblLook w:firstColumn="1" w:firstRow="1" w:lastColumn="0" w:lastRow="0" w:noHBand="0" w:noVBand="1" w:val="04A0"/>
-      </w:tblPr>
-      <w:tblGrid>
-        <w:gridCol w:w="3040"/>
-        <w:gridCol w:w="3040"/>
-        <w:gridCol w:w="3040"/>
-      </w:tblGrid>
-      <w:tr>
-        <w:tc>
-          <w:tcPr>
-            <w:tcW w:type="dxa" w:w="3040"/>
-            <w:shd w:fill="D9D9D9"/>
-          </w:tcPr>
-          <w:p>
-            <w:r/>
-            <w:r>
-              <w:rPr>
-                <w:rFonts w:ascii="Times New Roman" w:hAnsi="Times New Roman"/>
-                <w:b/>
-                <w:sz w:val="24"/>
-              </w:rPr>
-              <w:t>Loại kiểm thử</w:t>
-            </w:r>
-          </w:p>
-        </w:tc>
-        <w:tc>
-          <w:tcPr>
-            <w:tcW w:type="dxa" w:w="3040"/>
-            <w:shd w:fill="D9D9D9"/>
-          </w:tcPr>
-          <w:p>
-            <w:r/>
-            <w:r>
-              <w:rPr>
-                <w:rFonts w:ascii="Times New Roman" w:hAnsi="Times New Roman"/>
-                <w:b/>
-                <w:sz w:val="24"/>
-              </w:rPr>
-              <w:t>Phạm vi</w:t>
-            </w:r>
-          </w:p>
-        </w:tc>
-        <w:tc>
-          <w:tcPr>
-            <w:tcW w:type="dxa" w:w="3040"/>
-            <w:shd w:fill="D9D9D9"/>
-          </w:tcPr>
-          <w:p>
-            <w:r/>
-            <w:r>
-              <w:rPr>
-                <w:rFonts w:ascii="Times New Roman" w:hAnsi="Times New Roman"/>
-                <w:b/>
-                <w:sz w:val="24"/>
-              </w:rPr>
-              <w:t>Ví dụ</w:t>
-            </w:r>
-          </w:p>
-        </w:tc>
-      </w:tr>
-      <w:tr>
-        <w:tc>
-          <w:tcPr>
-            <w:tcW w:type="dxa" w:w="3040"/>
-          </w:tcPr>
-          <w:p>
-            <w:r/>
-            <w:r>
-              <w:rPr>
-                <w:rFonts w:ascii="Times New Roman" w:hAnsi="Times New Roman"/>
-                <w:b w:val="0"/>
-                <w:sz w:val="24"/>
-              </w:rPr>
-              <w:t>Unit test</w:t>
-            </w:r>
-          </w:p>
-        </w:tc>
-        <w:tc>
-          <w:tcPr>
-            <w:tcW w:type="dxa" w:w="3040"/>
-          </w:tcPr>
-          <w:p>
-            <w:r/>
-            <w:r>
-              <w:rPr>
-                <w:rFonts w:ascii="Times New Roman" w:hAnsi="Times New Roman"/>
-                <w:b w:val="0"/>
-                <w:sz w:val="24"/>
-              </w:rPr>
-              <w:t>Hàm tiền xử lý, phân mức rủi ro, normalize patient data</w:t>
-            </w:r>
-          </w:p>
-        </w:tc>
-        <w:tc>
-          <w:tcPr>
-            <w:tcW w:type="dxa" w:w="3040"/>
-          </w:tcPr>
-          <w:p>
-            <w:r/>
-            <w:r>
-              <w:rPr>
-                <w:rFonts w:ascii="Times New Roman" w:hAnsi="Times New Roman"/>
-                <w:b w:val="0"/>
-                <w:sz w:val="24"/>
-              </w:rPr>
-              <w:t>Xác suất 0,75 phải trả về risk_level = high</w:t>
-            </w:r>
-          </w:p>
-        </w:tc>
-      </w:tr>
-      <w:tr>
-        <w:tc>
-          <w:tcPr>
-            <w:tcW w:type="dxa" w:w="3040"/>
-          </w:tcPr>
-          <w:p>
-            <w:r/>
-            <w:r>
-              <w:rPr>
-                <w:rFonts w:ascii="Times New Roman" w:hAnsi="Times New Roman"/>
-                <w:b w:val="0"/>
-                <w:sz w:val="24"/>
-              </w:rPr>
-              <w:t>API test</w:t>
-            </w:r>
-          </w:p>
-        </w:tc>
-        <w:tc>
-          <w:tcPr>
-            <w:tcW w:type="dxa" w:w="3040"/>
-          </w:tcPr>
-          <w:p>
-            <w:r/>
-            <w:r>
-              <w:rPr>
-                <w:rFonts w:ascii="Times New Roman" w:hAnsi="Times New Roman"/>
-                <w:b w:val="0"/>
-                <w:sz w:val="24"/>
-              </w:rPr>
-              <w:t>Endpoint FastAPI và phân quyền JWT</w:t>
-            </w:r>
-          </w:p>
-        </w:tc>
-        <w:tc>
-          <w:tcPr>
-            <w:tcW w:type="dxa" w:w="3040"/>
-          </w:tcPr>
-          <w:p>
-            <w:r/>
-            <w:r>
-              <w:rPr>
-                <w:rFonts w:ascii="Times New Roman" w:hAnsi="Times New Roman"/>
-                <w:b w:val="0"/>
-                <w:sz w:val="24"/>
-              </w:rPr>
-              <w:t>Chưa đăng nhập gọi /prediction-logs phải bị từ chối</w:t>
-            </w:r>
-          </w:p>
-        </w:tc>
-      </w:tr>
-      <w:tr>
-        <w:tc>
-          <w:tcPr>
-            <w:tcW w:type="dxa" w:w="3040"/>
-          </w:tcPr>
-          <w:p>
-            <w:r/>
-            <w:r>
-              <w:rPr>
-                <w:rFonts w:ascii="Times New Roman" w:hAnsi="Times New Roman"/>
-                <w:b w:val="0"/>
-                <w:sz w:val="24"/>
-              </w:rPr>
-              <w:t>Model test</w:t>
-            </w:r>
-          </w:p>
-        </w:tc>
-        <w:tc>
-          <w:tcPr>
-            <w:tcW w:type="dxa" w:w="3040"/>
-          </w:tcPr>
-          <w:p>
-            <w:r/>
-            <w:r>
-              <w:rPr>
-                <w:rFonts w:ascii="Times New Roman" w:hAnsi="Times New Roman"/>
-                <w:b w:val="0"/>
-                <w:sz w:val="24"/>
-              </w:rPr>
-              <w:t>Chất lượng mô hình và tính tái lập</w:t>
-            </w:r>
-          </w:p>
-        </w:tc>
-        <w:tc>
-          <w:tcPr>
-            <w:tcW w:type="dxa" w:w="3040"/>
-          </w:tcPr>
-          <w:p>
-            <w:r/>
-            <w:r>
-              <w:rPr>
-                <w:rFonts w:ascii="Times New Roman" w:hAnsi="Times New Roman"/>
-                <w:b w:val="0"/>
-                <w:sz w:val="24"/>
-              </w:rPr>
-              <w:t>reports/metrics.json có đủ accuracy, precision, recall, f1_score, roc_auc</w:t>
-            </w:r>
-          </w:p>
-        </w:tc>
-      </w:tr>
-      <w:tr>
-        <w:tc>
-          <w:tcPr>
-            <w:tcW w:type="dxa" w:w="3040"/>
-          </w:tcPr>
-          <w:p>
-            <w:r/>
-            <w:r>
-              <w:rPr>
-                <w:rFonts w:ascii="Times New Roman" w:hAnsi="Times New Roman"/>
-                <w:b w:val="0"/>
-                <w:sz w:val="24"/>
-              </w:rPr>
-              <w:t>Integration test</w:t>
-            </w:r>
-          </w:p>
-        </w:tc>
-        <w:tc>
-          <w:tcPr>
-            <w:tcW w:type="dxa" w:w="3040"/>
-          </w:tcPr>
-          <w:p>
-            <w:r/>
-            <w:r>
-              <w:rPr>
-                <w:rFonts w:ascii="Times New Roman" w:hAnsi="Times New Roman"/>
-                <w:b w:val="0"/>
-                <w:sz w:val="24"/>
-              </w:rPr>
-              <w:t>React - FastAPI - MLflow - PostgreSQL</w:t>
-            </w:r>
-          </w:p>
-        </w:tc>
-        <w:tc>
-          <w:tcPr>
-            <w:tcW w:type="dxa" w:w="3040"/>
-          </w:tcPr>
-          <w:p>
-            <w:r/>
-            <w:r>
-              <w:rPr>
-                <w:rFonts w:ascii="Times New Roman" w:hAnsi="Times New Roman"/>
-                <w:b w:val="0"/>
-                <w:sz w:val="24"/>
-              </w:rPr>
-              <w:t>Tạo bệnh nhân, dự đoán, kiểm tra log xuất hiện trong prediction_logs</w:t>
-            </w:r>
-          </w:p>
-        </w:tc>
-      </w:tr>
-      <w:tr>
-        <w:tc>
-          <w:tcPr>
-            <w:tcW w:type="dxa" w:w="3040"/>
-          </w:tcPr>
-          <w:p>
-            <w:r/>
-            <w:r>
-              <w:rPr>
-                <w:rFonts w:ascii="Times New Roman" w:hAnsi="Times New Roman"/>
-                <w:b w:val="0"/>
-                <w:sz w:val="24"/>
-              </w:rPr>
-              <w:t>Pipeline test</w:t>
-            </w:r>
-          </w:p>
-        </w:tc>
-        <w:tc>
-          <w:tcPr>
-            <w:tcW w:type="dxa" w:w="3040"/>
-          </w:tcPr>
-          <w:p>
-            <w:r/>
-            <w:r>
-              <w:rPr>
-                <w:rFonts w:ascii="Times New Roman" w:hAnsi="Times New Roman"/>
-                <w:b w:val="0"/>
-                <w:sz w:val="24"/>
-              </w:rPr>
-              <w:t>Airflow DAG và Spark job</w:t>
-            </w:r>
-          </w:p>
-        </w:tc>
-        <w:tc>
-          <w:tcPr>
-            <w:tcW w:type="dxa" w:w="3040"/>
-          </w:tcPr>
-          <w:p>
-            <w:r/>
-            <w:r>
-              <w:rPr>
-                <w:rFonts w:ascii="Times New Roman" w:hAnsi="Times New Roman"/>
-                <w:b w:val="0"/>
-                <w:sz w:val="24"/>
-              </w:rPr>
-              <w:t>Chạy etl_dag tạo data/gold và data/features thành công</w:t>
-            </w:r>
-          </w:p>
-        </w:tc>
-      </w:tr>
-      <w:tr>
-        <w:tc>
-          <w:tcPr>
-            <w:tcW w:type="dxa" w:w="3040"/>
-          </w:tcPr>
-          <w:p>
-            <w:r/>
-            <w:r>
-              <w:rPr>
-                <w:rFonts w:ascii="Times New Roman" w:hAnsi="Times New Roman"/>
-                <w:b w:val="0"/>
-                <w:sz w:val="24"/>
-              </w:rPr>
-              <w:t>Monitoring test</w:t>
-            </w:r>
-          </w:p>
-        </w:tc>
-        <w:tc>
-          <w:tcPr>
-            <w:tcW w:type="dxa" w:w="3040"/>
-          </w:tcPr>
-          <w:p>
-            <w:r/>
-            <w:r>
-              <w:rPr>
-                <w:rFonts w:ascii="Times New Roman" w:hAnsi="Times New Roman"/>
-                <w:b w:val="0"/>
-                <w:sz w:val="24"/>
-              </w:rPr>
-              <w:t>Prometheus/Grafana</w:t>
-            </w:r>
-          </w:p>
-        </w:tc>
-        <w:tc>
-          <w:tcPr>
-            <w:tcW w:type="dxa" w:w="3040"/>
-          </w:tcPr>
-          <w:p>
-            <w:r/>
-            <w:r>
-              <w:rPr>
-                <w:rFonts w:ascii="Times New Roman" w:hAnsi="Times New Roman"/>
-                <w:b w:val="0"/>
-                <w:sz w:val="24"/>
-              </w:rPr>
-              <w:t>FastAPI expose đủ metric prediction_requests_total và prediction_errors_total</w:t>
-            </w:r>
-          </w:p>
-        </w:tc>
-      </w:tr>
-    </w:tbl>
-    <w:p/>
-    <w:p>
-      <w:pPr>
-        <w:pStyle w:val="2"/>
-      </w:pPr>
-      <w:r>
-        <w:rPr>
-          <w:rFonts w:ascii="Times New Roman" w:hAnsi="Times New Roman"/>
-          <w:color w:val="000000"/>
-        </w:rPr>
-        <w:t>CHƯƠNG 2 – HIỆN THỰC</w:t>
-      </w:r>
-    </w:p>
-    <w:p>
-      <w:pPr>
-        <w:pStyle w:val="3"/>
-      </w:pPr>
-      <w:r>
-        <w:rPr>
-          <w:rFonts w:ascii="Times New Roman" w:hAnsi="Times New Roman"/>
-          <w:color w:val="000000"/>
-        </w:rPr>
-        <w:t>2.1. Công nghệ sử dụng</w:t>
-      </w:r>
-    </w:p>
-    <w:p>
-      <w:pPr>
-        <w:pStyle w:val="30"/>
-      </w:pPr>
-      <w:r>
-        <w:rPr>
-          <w:rFonts w:ascii="Times New Roman" w:hAnsi="Times New Roman"/>
-          <w:sz w:val="26"/>
-        </w:rPr>
-        <w:t>Project được đóng gói bằng Docker Compose, gồm các service phục vụ dữ liệu, huấn luyện mô hình, API, giao diện và giám sát. Việc triển khai bằng container giúp tái lập môi trường và giảm sai khác giữa máy phát triển và môi trường chạy thử.</w:t>
-      </w:r>
-    </w:p>
-    <w:p>
-      <w:pPr>
-        <w:pStyle w:val="56"/>
-        <w:jc w:val="center"/>
-      </w:pPr>
-      <w:r>
-        <w:rPr>
-          <w:rFonts w:ascii="Times New Roman" w:hAnsi="Times New Roman"/>
-          <w:sz w:val="26"/>
-        </w:rPr>
-        <w:t>Bảng 2.1: Công nghệ sử dụng trong hệ thống</w:t>
-      </w:r>
-    </w:p>
-    <w:tbl>
-      <w:tblPr>
-        <w:tblStyle w:val="20"/>
-        <w:tblW w:type="auto" w:w="0"/>
-        <w:tblLook w:firstColumn="1" w:firstRow="1" w:lastColumn="0" w:lastRow="0" w:noHBand="0" w:noVBand="1" w:val="04A0"/>
-      </w:tblPr>
-      <w:tblGrid>
-        <w:gridCol w:w="3040"/>
-        <w:gridCol w:w="3040"/>
-        <w:gridCol w:w="3040"/>
-      </w:tblGrid>
-      <w:tr>
-        <w:tc>
-          <w:tcPr>
-            <w:tcW w:type="dxa" w:w="3040"/>
-            <w:shd w:fill="D9D9D9"/>
-          </w:tcPr>
-          <w:p>
-            <w:r/>
-            <w:r>
-              <w:rPr>
-                <w:rFonts w:ascii="Times New Roman" w:hAnsi="Times New Roman"/>
-                <w:b/>
-                <w:sz w:val="24"/>
-              </w:rPr>
-              <w:t>Nhóm</w:t>
-            </w:r>
-          </w:p>
-        </w:tc>
-        <w:tc>
-          <w:tcPr>
-            <w:tcW w:type="dxa" w:w="3040"/>
-            <w:shd w:fill="D9D9D9"/>
-          </w:tcPr>
-          <w:p>
-            <w:r/>
-            <w:r>
-              <w:rPr>
-                <w:rFonts w:ascii="Times New Roman" w:hAnsi="Times New Roman"/>
-                <w:b/>
-                <w:sz w:val="24"/>
-              </w:rPr>
-              <w:t>Công nghệ</w:t>
-            </w:r>
-          </w:p>
-        </w:tc>
-        <w:tc>
-          <w:tcPr>
-            <w:tcW w:type="dxa" w:w="3040"/>
-            <w:shd w:fill="D9D9D9"/>
-          </w:tcPr>
-          <w:p>
-            <w:r/>
-            <w:r>
-              <w:rPr>
-                <w:rFonts w:ascii="Times New Roman" w:hAnsi="Times New Roman"/>
-                <w:b/>
-                <w:sz w:val="24"/>
-              </w:rPr>
-              <w:t>Vai trò</w:t>
-            </w:r>
-          </w:p>
-        </w:tc>
-      </w:tr>
-      <w:tr>
-        <w:tc>
-          <w:tcPr>
-            <w:tcW w:type="dxa" w:w="3040"/>
-          </w:tcPr>
-          <w:p>
-            <w:r/>
-            <w:r>
-              <w:rPr>
-                <w:rFonts w:ascii="Times New Roman" w:hAnsi="Times New Roman"/>
-                <w:b w:val="0"/>
-                <w:sz w:val="24"/>
-              </w:rPr>
-              <w:t>Frontend</w:t>
-            </w:r>
-          </w:p>
-        </w:tc>
-        <w:tc>
-          <w:tcPr>
-            <w:tcW w:type="dxa" w:w="3040"/>
-          </w:tcPr>
-          <w:p>
-            <w:r/>
-            <w:r>
-              <w:rPr>
-                <w:rFonts w:ascii="Times New Roman" w:hAnsi="Times New Roman"/>
-                <w:b w:val="0"/>
-                <w:sz w:val="24"/>
-              </w:rPr>
-              <w:t>React 18, Vite, axios, lucide-react</w:t>
-            </w:r>
-          </w:p>
-        </w:tc>
-        <w:tc>
-          <w:tcPr>
-            <w:tcW w:type="dxa" w:w="3040"/>
-          </w:tcPr>
-          <w:p>
-            <w:r/>
-            <w:r>
-              <w:rPr>
-                <w:rFonts w:ascii="Times New Roman" w:hAnsi="Times New Roman"/>
-                <w:b w:val="0"/>
-                <w:sz w:val="24"/>
-              </w:rPr>
-              <w:t>Giao diện bác sĩ/admin và gọi FastAPI</w:t>
-            </w:r>
-          </w:p>
-        </w:tc>
-      </w:tr>
-      <w:tr>
-        <w:tc>
-          <w:tcPr>
-            <w:tcW w:type="dxa" w:w="3040"/>
-          </w:tcPr>
-          <w:p>
-            <w:r/>
-            <w:r>
-              <w:rPr>
-                <w:rFonts w:ascii="Times New Roman" w:hAnsi="Times New Roman"/>
-                <w:b w:val="0"/>
-                <w:sz w:val="24"/>
-              </w:rPr>
-              <w:t>Backend</w:t>
-            </w:r>
-          </w:p>
-        </w:tc>
-        <w:tc>
-          <w:tcPr>
-            <w:tcW w:type="dxa" w:w="3040"/>
-          </w:tcPr>
-          <w:p>
-            <w:r/>
-            <w:r>
-              <w:rPr>
-                <w:rFonts w:ascii="Times New Roman" w:hAnsi="Times New Roman"/>
-                <w:b w:val="0"/>
-                <w:sz w:val="24"/>
-              </w:rPr>
-              <w:t>FastAPI, Pydantic, JWT, passlib</w:t>
-            </w:r>
-          </w:p>
-        </w:tc>
-        <w:tc>
-          <w:tcPr>
-            <w:tcW w:type="dxa" w:w="3040"/>
-          </w:tcPr>
-          <w:p>
-            <w:r/>
-            <w:r>
-              <w:rPr>
-                <w:rFonts w:ascii="Times New Roman" w:hAnsi="Times New Roman"/>
-                <w:b w:val="0"/>
-                <w:sz w:val="24"/>
-              </w:rPr>
-              <w:t>API dự đoán, xác thực, phân quyền, quản lý bệnh nhân</w:t>
-            </w:r>
-          </w:p>
-        </w:tc>
-      </w:tr>
-      <w:tr>
-        <w:tc>
-          <w:tcPr>
-            <w:tcW w:type="dxa" w:w="3040"/>
-          </w:tcPr>
-          <w:p>
-            <w:r/>
-            <w:r>
-              <w:rPr>
-                <w:rFonts w:ascii="Times New Roman" w:hAnsi="Times New Roman"/>
-                <w:b w:val="0"/>
-                <w:sz w:val="24"/>
-              </w:rPr>
-              <w:t>Dữ liệu</w:t>
-            </w:r>
-          </w:p>
-        </w:tc>
-        <w:tc>
-          <w:tcPr>
-            <w:tcW w:type="dxa" w:w="3040"/>
-          </w:tcPr>
-          <w:p>
-            <w:r/>
-            <w:r>
-              <w:rPr>
-                <w:rFonts w:ascii="Times New Roman" w:hAnsi="Times New Roman"/>
-                <w:b w:val="0"/>
-                <w:sz w:val="24"/>
-              </w:rPr>
-              <w:t>PostgreSQL, Redis</w:t>
-            </w:r>
-          </w:p>
-        </w:tc>
-        <w:tc>
-          <w:tcPr>
-            <w:tcW w:type="dxa" w:w="3040"/>
-          </w:tcPr>
-          <w:p>
-            <w:r/>
-            <w:r>
-              <w:rPr>
-                <w:rFonts w:ascii="Times New Roman" w:hAnsi="Times New Roman"/>
-                <w:b w:val="0"/>
-                <w:sz w:val="24"/>
-              </w:rPr>
-              <w:t>Lưu hồ sơ, prediction log, trạng thái retraining và cache log</w:t>
-            </w:r>
-          </w:p>
-        </w:tc>
-      </w:tr>
-      <w:tr>
-        <w:tc>
-          <w:tcPr>
-            <w:tcW w:type="dxa" w:w="3040"/>
-          </w:tcPr>
-          <w:p>
-            <w:r/>
-            <w:r>
-              <w:rPr>
-                <w:rFonts w:ascii="Times New Roman" w:hAnsi="Times New Roman"/>
-                <w:b w:val="0"/>
-                <w:sz w:val="24"/>
-              </w:rPr>
-              <w:t>Streaming</w:t>
-            </w:r>
-          </w:p>
-        </w:tc>
-        <w:tc>
-          <w:tcPr>
-            <w:tcW w:type="dxa" w:w="3040"/>
-          </w:tcPr>
-          <w:p>
-            <w:r/>
-            <w:r>
-              <w:rPr>
-                <w:rFonts w:ascii="Times New Roman" w:hAnsi="Times New Roman"/>
-                <w:b w:val="0"/>
-                <w:sz w:val="24"/>
-              </w:rPr>
-              <w:t>Kafka, Zookeeper, Spark Streaming</w:t>
-            </w:r>
-          </w:p>
-        </w:tc>
-        <w:tc>
-          <w:tcPr>
-            <w:tcW w:type="dxa" w:w="3040"/>
-          </w:tcPr>
-          <w:p>
-            <w:r/>
-            <w:r>
-              <w:rPr>
-                <w:rFonts w:ascii="Times New Roman" w:hAnsi="Times New Roman"/>
-                <w:b w:val="0"/>
-                <w:sz w:val="24"/>
-              </w:rPr>
-              <w:t>Luồng tùy chọn để phát lại dữ liệu bệnh nhân và ghi bronze parquet</w:t>
-            </w:r>
-          </w:p>
-        </w:tc>
-      </w:tr>
-      <w:tr>
-        <w:tc>
-          <w:tcPr>
-            <w:tcW w:type="dxa" w:w="3040"/>
-          </w:tcPr>
-          <w:p>
-            <w:r/>
-            <w:r>
-              <w:rPr>
-                <w:rFonts w:ascii="Times New Roman" w:hAnsi="Times New Roman"/>
-                <w:b w:val="0"/>
-                <w:sz w:val="24"/>
-              </w:rPr>
-              <w:t>Batch ETL</w:t>
-            </w:r>
-          </w:p>
-        </w:tc>
-        <w:tc>
-          <w:tcPr>
-            <w:tcW w:type="dxa" w:w="3040"/>
-          </w:tcPr>
-          <w:p>
-            <w:r/>
-            <w:r>
-              <w:rPr>
-                <w:rFonts w:ascii="Times New Roman" w:hAnsi="Times New Roman"/>
-                <w:b w:val="0"/>
-                <w:sz w:val="24"/>
-              </w:rPr>
-              <w:t>Apache Spark</w:t>
-            </w:r>
-          </w:p>
-        </w:tc>
-        <w:tc>
-          <w:tcPr>
-            <w:tcW w:type="dxa" w:w="3040"/>
-          </w:tcPr>
-          <w:p>
-            <w:r/>
-            <w:r>
-              <w:rPr>
-                <w:rFonts w:ascii="Times New Roman" w:hAnsi="Times New Roman"/>
-                <w:b w:val="0"/>
-                <w:sz w:val="24"/>
-              </w:rPr>
-              <w:t>Làm sạch dữ liệu, tạo gold và feature parquet</w:t>
-            </w:r>
-          </w:p>
-        </w:tc>
-      </w:tr>
-      <w:tr>
-        <w:tc>
-          <w:tcPr>
-            <w:tcW w:type="dxa" w:w="3040"/>
-          </w:tcPr>
-          <w:p>
-            <w:r/>
-            <w:r>
-              <w:rPr>
-                <w:rFonts w:ascii="Times New Roman" w:hAnsi="Times New Roman"/>
-                <w:b w:val="0"/>
-                <w:sz w:val="24"/>
-              </w:rPr>
-              <w:t>ML/MLOps</w:t>
-            </w:r>
-          </w:p>
-        </w:tc>
-        <w:tc>
-          <w:tcPr>
-            <w:tcW w:type="dxa" w:w="3040"/>
-          </w:tcPr>
-          <w:p>
-            <w:r/>
-            <w:r>
-              <w:rPr>
-                <w:rFonts w:ascii="Times New Roman" w:hAnsi="Times New Roman"/>
-                <w:b w:val="0"/>
-                <w:sz w:val="24"/>
-              </w:rPr>
-              <w:t>scikit-learn, MLflow, MinIO, DVC, Airflow</w:t>
-            </w:r>
-          </w:p>
-        </w:tc>
-        <w:tc>
-          <w:tcPr>
-            <w:tcW w:type="dxa" w:w="3040"/>
-          </w:tcPr>
-          <w:p>
-            <w:r/>
-            <w:r>
-              <w:rPr>
-                <w:rFonts w:ascii="Times New Roman" w:hAnsi="Times New Roman"/>
-                <w:b w:val="0"/>
-                <w:sz w:val="24"/>
-              </w:rPr>
-              <w:t>Huấn luyện, theo dõi thí nghiệm, lưu artifact và điều phối pipeline</w:t>
-            </w:r>
-          </w:p>
-        </w:tc>
-      </w:tr>
-      <w:tr>
-        <w:tc>
-          <w:tcPr>
-            <w:tcW w:type="dxa" w:w="3040"/>
-          </w:tcPr>
-          <w:p>
-            <w:r/>
-            <w:r>
-              <w:rPr>
-                <w:rFonts w:ascii="Times New Roman" w:hAnsi="Times New Roman"/>
-                <w:b w:val="0"/>
-                <w:sz w:val="24"/>
-              </w:rPr>
-              <w:t>Monitoring</w:t>
-            </w:r>
-          </w:p>
-        </w:tc>
-        <w:tc>
-          <w:tcPr>
-            <w:tcW w:type="dxa" w:w="3040"/>
-          </w:tcPr>
-          <w:p>
-            <w:r/>
-            <w:r>
-              <w:rPr>
-                <w:rFonts w:ascii="Times New Roman" w:hAnsi="Times New Roman"/>
-                <w:b w:val="0"/>
-                <w:sz w:val="24"/>
-              </w:rPr>
-              <w:t>Prometheus, Grafana</w:t>
-            </w:r>
-          </w:p>
-        </w:tc>
-        <w:tc>
-          <w:tcPr>
-            <w:tcW w:type="dxa" w:w="3040"/>
-          </w:tcPr>
-          <w:p>
-            <w:r/>
-            <w:r>
-              <w:rPr>
-                <w:rFonts w:ascii="Times New Roman" w:hAnsi="Times New Roman"/>
-                <w:b w:val="0"/>
-                <w:sz w:val="24"/>
-              </w:rPr>
-              <w:t>Thu thập metric, dashboard và alert rules</w:t>
-            </w:r>
-          </w:p>
-        </w:tc>
-      </w:tr>
-      <w:tr>
-        <w:tc>
-          <w:tcPr>
-            <w:tcW w:type="dxa" w:w="3040"/>
-          </w:tcPr>
-          <w:p>
-            <w:r/>
-            <w:r>
-              <w:rPr>
-                <w:rFonts w:ascii="Times New Roman" w:hAnsi="Times New Roman"/>
-                <w:b w:val="0"/>
-                <w:sz w:val="24"/>
-              </w:rPr>
-              <w:t>Hạ tầng</w:t>
-            </w:r>
-          </w:p>
-        </w:tc>
-        <w:tc>
-          <w:tcPr>
-            <w:tcW w:type="dxa" w:w="3040"/>
-          </w:tcPr>
-          <w:p>
-            <w:r/>
-            <w:r>
-              <w:rPr>
-                <w:rFonts w:ascii="Times New Roman" w:hAnsi="Times New Roman"/>
-                <w:b w:val="0"/>
-                <w:sz w:val="24"/>
-              </w:rPr>
-              <w:t>Docker Compose, Nginx</w:t>
-            </w:r>
-          </w:p>
-        </w:tc>
-        <w:tc>
-          <w:tcPr>
-            <w:tcW w:type="dxa" w:w="3040"/>
-          </w:tcPr>
-          <w:p>
-            <w:r/>
-            <w:r>
-              <w:rPr>
-                <w:rFonts w:ascii="Times New Roman" w:hAnsi="Times New Roman"/>
-                <w:b w:val="0"/>
-                <w:sz w:val="24"/>
-              </w:rPr>
-              <w:t>Đóng gói service và reverse proxy cơ bản</w:t>
-            </w:r>
-          </w:p>
-        </w:tc>
-      </w:tr>
-    </w:tbl>
-    <w:p/>
+        <w:t>Sơ đồ MLOps tổng thể mô tả vòng đời khép kín của mô hình: dữ liệu được thu thập và xử lý, thí nghiệm được ghi nhận trong MLflow, model tốt nhất được đưa vào Registry, FastAPI phục vụ suy luận, kết quả vận hành được giám sát và dữ liệu mới quay lại pipeline tái huấn luyện.</w:t>
+      </w:r>
+    </w:p>
     <w:p>
       <w:pPr>
         <w:jc w:val="center"/>
@@ -4152,7 +3244,7 @@
               <a:graphicData uri="http://schemas.openxmlformats.org/drawingml/2006/picture">
                 <pic:pic>
                   <pic:nvPicPr>
-                    <pic:cNvPr id="0" name="10_deployment.png"/>
+                    <pic:cNvPr id="0" name="10_mlops_diagram.png"/>
                     <pic:cNvPicPr/>
                   </pic:nvPicPr>
                   <pic:blipFill>
@@ -4185,7 +3277,7 @@
           <w:rFonts w:ascii="Times New Roman" w:hAnsi="Times New Roman"/>
           <w:sz w:val="26"/>
         </w:rPr>
-        <w:t>Hình 2.1: Sơ đồ triển khai Docker Compose</w:t>
+        <w:t>Hình 1.11: Sơ đồ MLOps tổng thể</w:t>
       </w:r>
     </w:p>
     <w:p>
@@ -4197,19 +3289,422 @@
           <w:rFonts w:ascii="Times New Roman" w:hAnsi="Times New Roman"/>
           <w:color w:val="000000"/>
         </w:rPr>
-        <w:t>2.2. Các chức năng đã hiện thực</w:t>
-      </w:r>
-    </w:p>
-    <w:p>
-      <w:pPr>
-        <w:pStyle w:val="4"/>
+        <w:t>1.10. Thiết kế kiểm thử</w:t>
+      </w:r>
+    </w:p>
+    <w:p>
+      <w:pPr>
+        <w:pStyle w:val="30"/>
+      </w:pPr>
+      <w:r>
+        <w:rPr>
+          <w:rFonts w:ascii="Times New Roman" w:hAnsi="Times New Roman"/>
+          <w:sz w:val="26"/>
+        </w:rPr>
+        <w:t>Kiểm thử hệ thống cần bao phủ cả logic học máy, API nghiệp vụ và vận hành MLOps. Vì hệ thống có nhiều service, kiểm thử tích hợp đặc biệt quan trọng để bảo đảm dữ liệu đi đúng từ giao diện, API, cơ sở dữ liệu đến dashboard giám sát.</w:t>
+      </w:r>
+    </w:p>
+    <w:p>
+      <w:pPr>
+        <w:pStyle w:val="56"/>
+        <w:jc w:val="center"/>
+      </w:pPr>
+      <w:r>
+        <w:rPr>
+          <w:rFonts w:ascii="Times New Roman" w:hAnsi="Times New Roman"/>
+          <w:sz w:val="26"/>
+        </w:rPr>
+        <w:t>Bảng 1.4: Các loại kiểm thử</w:t>
+      </w:r>
+    </w:p>
+    <w:tbl>
+      <w:tblPr>
+        <w:tblStyle w:val="20"/>
+        <w:tblW w:type="auto" w:w="0"/>
+        <w:tblLook w:firstColumn="1" w:firstRow="1" w:lastColumn="0" w:lastRow="0" w:noHBand="0" w:noVBand="1" w:val="04A0"/>
+      </w:tblPr>
+      <w:tblGrid>
+        <w:gridCol w:w="3040"/>
+        <w:gridCol w:w="3040"/>
+        <w:gridCol w:w="3040"/>
+      </w:tblGrid>
+      <w:tr>
+        <w:tc>
+          <w:tcPr>
+            <w:tcW w:type="dxa" w:w="3040"/>
+            <w:shd w:fill="D9D9D9"/>
+          </w:tcPr>
+          <w:p>
+            <w:r/>
+            <w:r>
+              <w:rPr>
+                <w:rFonts w:ascii="Times New Roman" w:hAnsi="Times New Roman"/>
+                <w:b/>
+                <w:sz w:val="24"/>
+              </w:rPr>
+              <w:t>Loại kiểm thử</w:t>
+            </w:r>
+          </w:p>
+        </w:tc>
+        <w:tc>
+          <w:tcPr>
+            <w:tcW w:type="dxa" w:w="3040"/>
+            <w:shd w:fill="D9D9D9"/>
+          </w:tcPr>
+          <w:p>
+            <w:r/>
+            <w:r>
+              <w:rPr>
+                <w:rFonts w:ascii="Times New Roman" w:hAnsi="Times New Roman"/>
+                <w:b/>
+                <w:sz w:val="24"/>
+              </w:rPr>
+              <w:t>Phạm vi</w:t>
+            </w:r>
+          </w:p>
+        </w:tc>
+        <w:tc>
+          <w:tcPr>
+            <w:tcW w:type="dxa" w:w="3040"/>
+            <w:shd w:fill="D9D9D9"/>
+          </w:tcPr>
+          <w:p>
+            <w:r/>
+            <w:r>
+              <w:rPr>
+                <w:rFonts w:ascii="Times New Roman" w:hAnsi="Times New Roman"/>
+                <w:b/>
+                <w:sz w:val="24"/>
+              </w:rPr>
+              <w:t>Ví dụ</w:t>
+            </w:r>
+          </w:p>
+        </w:tc>
+      </w:tr>
+      <w:tr>
+        <w:tc>
+          <w:tcPr>
+            <w:tcW w:type="dxa" w:w="3040"/>
+          </w:tcPr>
+          <w:p>
+            <w:r/>
+            <w:r>
+              <w:rPr>
+                <w:rFonts w:ascii="Times New Roman" w:hAnsi="Times New Roman"/>
+                <w:b w:val="0"/>
+                <w:sz w:val="24"/>
+              </w:rPr>
+              <w:t>Unit test</w:t>
+            </w:r>
+          </w:p>
+        </w:tc>
+        <w:tc>
+          <w:tcPr>
+            <w:tcW w:type="dxa" w:w="3040"/>
+          </w:tcPr>
+          <w:p>
+            <w:r/>
+            <w:r>
+              <w:rPr>
+                <w:rFonts w:ascii="Times New Roman" w:hAnsi="Times New Roman"/>
+                <w:b w:val="0"/>
+                <w:sz w:val="24"/>
+              </w:rPr>
+              <w:t>Hàm tiền xử lý, phân mức rủi ro, normalize patient data</w:t>
+            </w:r>
+          </w:p>
+        </w:tc>
+        <w:tc>
+          <w:tcPr>
+            <w:tcW w:type="dxa" w:w="3040"/>
+          </w:tcPr>
+          <w:p>
+            <w:r/>
+            <w:r>
+              <w:rPr>
+                <w:rFonts w:ascii="Times New Roman" w:hAnsi="Times New Roman"/>
+                <w:b w:val="0"/>
+                <w:sz w:val="24"/>
+              </w:rPr>
+              <w:t>Xác suất 0,75 phải trả về risk_level = high</w:t>
+            </w:r>
+          </w:p>
+        </w:tc>
+      </w:tr>
+      <w:tr>
+        <w:tc>
+          <w:tcPr>
+            <w:tcW w:type="dxa" w:w="3040"/>
+          </w:tcPr>
+          <w:p>
+            <w:r/>
+            <w:r>
+              <w:rPr>
+                <w:rFonts w:ascii="Times New Roman" w:hAnsi="Times New Roman"/>
+                <w:b w:val="0"/>
+                <w:sz w:val="24"/>
+              </w:rPr>
+              <w:t>API test</w:t>
+            </w:r>
+          </w:p>
+        </w:tc>
+        <w:tc>
+          <w:tcPr>
+            <w:tcW w:type="dxa" w:w="3040"/>
+          </w:tcPr>
+          <w:p>
+            <w:r/>
+            <w:r>
+              <w:rPr>
+                <w:rFonts w:ascii="Times New Roman" w:hAnsi="Times New Roman"/>
+                <w:b w:val="0"/>
+                <w:sz w:val="24"/>
+              </w:rPr>
+              <w:t>Endpoint FastAPI và phân quyền JWT</w:t>
+            </w:r>
+          </w:p>
+        </w:tc>
+        <w:tc>
+          <w:tcPr>
+            <w:tcW w:type="dxa" w:w="3040"/>
+          </w:tcPr>
+          <w:p>
+            <w:r/>
+            <w:r>
+              <w:rPr>
+                <w:rFonts w:ascii="Times New Roman" w:hAnsi="Times New Roman"/>
+                <w:b w:val="0"/>
+                <w:sz w:val="24"/>
+              </w:rPr>
+              <w:t>Chưa đăng nhập gọi /prediction-logs phải bị từ chối</w:t>
+            </w:r>
+          </w:p>
+        </w:tc>
+      </w:tr>
+      <w:tr>
+        <w:tc>
+          <w:tcPr>
+            <w:tcW w:type="dxa" w:w="3040"/>
+          </w:tcPr>
+          <w:p>
+            <w:r/>
+            <w:r>
+              <w:rPr>
+                <w:rFonts w:ascii="Times New Roman" w:hAnsi="Times New Roman"/>
+                <w:b w:val="0"/>
+                <w:sz w:val="24"/>
+              </w:rPr>
+              <w:t>Model test</w:t>
+            </w:r>
+          </w:p>
+        </w:tc>
+        <w:tc>
+          <w:tcPr>
+            <w:tcW w:type="dxa" w:w="3040"/>
+          </w:tcPr>
+          <w:p>
+            <w:r/>
+            <w:r>
+              <w:rPr>
+                <w:rFonts w:ascii="Times New Roman" w:hAnsi="Times New Roman"/>
+                <w:b w:val="0"/>
+                <w:sz w:val="24"/>
+              </w:rPr>
+              <w:t>Chất lượng mô hình và tính tái lập</w:t>
+            </w:r>
+          </w:p>
+        </w:tc>
+        <w:tc>
+          <w:tcPr>
+            <w:tcW w:type="dxa" w:w="3040"/>
+          </w:tcPr>
+          <w:p>
+            <w:r/>
+            <w:r>
+              <w:rPr>
+                <w:rFonts w:ascii="Times New Roman" w:hAnsi="Times New Roman"/>
+                <w:b w:val="0"/>
+                <w:sz w:val="24"/>
+              </w:rPr>
+              <w:t>reports/metrics.json có đủ accuracy, precision, recall, f1_score, roc_auc</w:t>
+            </w:r>
+          </w:p>
+        </w:tc>
+      </w:tr>
+      <w:tr>
+        <w:tc>
+          <w:tcPr>
+            <w:tcW w:type="dxa" w:w="3040"/>
+          </w:tcPr>
+          <w:p>
+            <w:r/>
+            <w:r>
+              <w:rPr>
+                <w:rFonts w:ascii="Times New Roman" w:hAnsi="Times New Roman"/>
+                <w:b w:val="0"/>
+                <w:sz w:val="24"/>
+              </w:rPr>
+              <w:t>Integration test</w:t>
+            </w:r>
+          </w:p>
+        </w:tc>
+        <w:tc>
+          <w:tcPr>
+            <w:tcW w:type="dxa" w:w="3040"/>
+          </w:tcPr>
+          <w:p>
+            <w:r/>
+            <w:r>
+              <w:rPr>
+                <w:rFonts w:ascii="Times New Roman" w:hAnsi="Times New Roman"/>
+                <w:b w:val="0"/>
+                <w:sz w:val="24"/>
+              </w:rPr>
+              <w:t>React - FastAPI - MLflow - PostgreSQL</w:t>
+            </w:r>
+          </w:p>
+        </w:tc>
+        <w:tc>
+          <w:tcPr>
+            <w:tcW w:type="dxa" w:w="3040"/>
+          </w:tcPr>
+          <w:p>
+            <w:r/>
+            <w:r>
+              <w:rPr>
+                <w:rFonts w:ascii="Times New Roman" w:hAnsi="Times New Roman"/>
+                <w:b w:val="0"/>
+                <w:sz w:val="24"/>
+              </w:rPr>
+              <w:t>Tạo bệnh nhân, dự đoán, kiểm tra log xuất hiện trong prediction_logs</w:t>
+            </w:r>
+          </w:p>
+        </w:tc>
+      </w:tr>
+      <w:tr>
+        <w:tc>
+          <w:tcPr>
+            <w:tcW w:type="dxa" w:w="3040"/>
+          </w:tcPr>
+          <w:p>
+            <w:r/>
+            <w:r>
+              <w:rPr>
+                <w:rFonts w:ascii="Times New Roman" w:hAnsi="Times New Roman"/>
+                <w:b w:val="0"/>
+                <w:sz w:val="24"/>
+              </w:rPr>
+              <w:t>Pipeline test</w:t>
+            </w:r>
+          </w:p>
+        </w:tc>
+        <w:tc>
+          <w:tcPr>
+            <w:tcW w:type="dxa" w:w="3040"/>
+          </w:tcPr>
+          <w:p>
+            <w:r/>
+            <w:r>
+              <w:rPr>
+                <w:rFonts w:ascii="Times New Roman" w:hAnsi="Times New Roman"/>
+                <w:b w:val="0"/>
+                <w:sz w:val="24"/>
+              </w:rPr>
+              <w:t>Airflow DAG và Spark job</w:t>
+            </w:r>
+          </w:p>
+        </w:tc>
+        <w:tc>
+          <w:tcPr>
+            <w:tcW w:type="dxa" w:w="3040"/>
+          </w:tcPr>
+          <w:p>
+            <w:r/>
+            <w:r>
+              <w:rPr>
+                <w:rFonts w:ascii="Times New Roman" w:hAnsi="Times New Roman"/>
+                <w:b w:val="0"/>
+                <w:sz w:val="24"/>
+              </w:rPr>
+              <w:t>Chạy etl_dag tạo data/gold và data/features thành công</w:t>
+            </w:r>
+          </w:p>
+        </w:tc>
+      </w:tr>
+      <w:tr>
+        <w:tc>
+          <w:tcPr>
+            <w:tcW w:type="dxa" w:w="3040"/>
+          </w:tcPr>
+          <w:p>
+            <w:r/>
+            <w:r>
+              <w:rPr>
+                <w:rFonts w:ascii="Times New Roman" w:hAnsi="Times New Roman"/>
+                <w:b w:val="0"/>
+                <w:sz w:val="24"/>
+              </w:rPr>
+              <w:t>Monitoring test</w:t>
+            </w:r>
+          </w:p>
+        </w:tc>
+        <w:tc>
+          <w:tcPr>
+            <w:tcW w:type="dxa" w:w="3040"/>
+          </w:tcPr>
+          <w:p>
+            <w:r/>
+            <w:r>
+              <w:rPr>
+                <w:rFonts w:ascii="Times New Roman" w:hAnsi="Times New Roman"/>
+                <w:b w:val="0"/>
+                <w:sz w:val="24"/>
+              </w:rPr>
+              <w:t>Prometheus/Grafana</w:t>
+            </w:r>
+          </w:p>
+        </w:tc>
+        <w:tc>
+          <w:tcPr>
+            <w:tcW w:type="dxa" w:w="3040"/>
+          </w:tcPr>
+          <w:p>
+            <w:r/>
+            <w:r>
+              <w:rPr>
+                <w:rFonts w:ascii="Times New Roman" w:hAnsi="Times New Roman"/>
+                <w:b w:val="0"/>
+                <w:sz w:val="24"/>
+              </w:rPr>
+              <w:t>FastAPI expose đủ metric prediction_requests_total và prediction_errors_total</w:t>
+            </w:r>
+          </w:p>
+        </w:tc>
+      </w:tr>
+    </w:tbl>
+    <w:p/>
+    <w:p>
+      <w:pPr>
+        <w:pStyle w:val="2"/>
       </w:pPr>
       <w:r>
         <w:rPr>
           <w:rFonts w:ascii="Times New Roman" w:hAnsi="Times New Roman"/>
           <w:color w:val="000000"/>
         </w:rPr>
-        <w:t>2.2.1. Quản lý người dùng và phân quyền</w:t>
+        <w:t>CHƯƠNG 2 – HIỆN THỰC</w:t>
+      </w:r>
+    </w:p>
+    <w:p>
+      <w:pPr>
+        <w:pStyle w:val="3"/>
+      </w:pPr>
+      <w:r>
+        <w:rPr>
+          <w:rFonts w:ascii="Times New Roman" w:hAnsi="Times New Roman"/>
+          <w:color w:val="000000"/>
+        </w:rPr>
+        <w:t>2.1. Công nghệ sử dụng</w:t>
       </w:r>
     </w:p>
     <w:p>
@@ -4221,105 +3716,488 @@
           <w:rFonts w:ascii="Times New Roman" w:hAnsi="Times New Roman"/>
           <w:sz w:val="26"/>
         </w:rPr>
-        <w:t>FastAPI khởi tạo hai tài khoản mặc định: doctor01/doctor123 và admin01/admin123. Người dùng đăng nhập qua /auth/login để nhận JWT. Các endpoint bệnh nhân yêu cầu vai trò doctor hoặc admin, trong khi endpoint pipeline và prediction log toàn hệ thống yêu cầu admin.</w:t>
-      </w:r>
-    </w:p>
-    <w:p>
-      <w:pPr>
-        <w:pStyle w:val="4"/>
-      </w:pPr>
-      <w:r>
-        <w:rPr>
-          <w:rFonts w:ascii="Times New Roman" w:hAnsi="Times New Roman"/>
-          <w:color w:val="000000"/>
-        </w:rPr>
-        <w:t>2.2.2. Quản lý bệnh nhân và dự đoán</w:t>
-      </w:r>
-    </w:p>
-    <w:p>
-      <w:pPr>
-        <w:pStyle w:val="30"/>
-      </w:pPr>
-      <w:r>
-        <w:rPr>
-          <w:rFonts w:ascii="Times New Roman" w:hAnsi="Times New Roman"/>
-          <w:sz w:val="26"/>
-        </w:rPr>
-        <w:t>Người dùng có thể tạo, xem, cập nhật và xóa bệnh nhân. Endpoint /patients/{patient_id}/predict lấy dữ liệu bệnh nhân đã lưu, chuẩn hóa tên cột cho khớp pipeline huấn luyện, gọi model Production trên MLflow và lưu kết quả vào Redis cùng PostgreSQL.</w:t>
-      </w:r>
-    </w:p>
-    <w:p>
-      <w:pPr>
-        <w:pStyle w:val="4"/>
-      </w:pPr>
-      <w:r>
-        <w:rPr>
-          <w:rFonts w:ascii="Times New Roman" w:hAnsi="Times New Roman"/>
-          <w:color w:val="000000"/>
-        </w:rPr>
-        <w:t>2.2.3. Pipeline ingestion, ETL và feature engineering</w:t>
-      </w:r>
-    </w:p>
-    <w:p>
-      <w:pPr>
-        <w:pStyle w:val="30"/>
-      </w:pPr>
-      <w:r>
-        <w:rPr>
-          <w:rFonts w:ascii="Times New Roman" w:hAnsi="Times New Roman"/>
-          <w:sz w:val="26"/>
-        </w:rPr>
-        <w:t>ingestion_dag tạo Kafka topic patient-events và chạy producer phát lại dữ liệu CSV. etl_dag chạy Spark batch ETL để tạo data/gold/diabetic_gold.parquet, sau đó chạy feature_engineering.py để tạo data/features/offline/patient_features.parquet. Spark Streaming được đóng gói trong profile tùy chọn để ghi bronze parquet khi cần demo ingestion liên tục.</w:t>
-      </w:r>
-    </w:p>
-    <w:p>
-      <w:pPr>
-        <w:pStyle w:val="4"/>
-      </w:pPr>
-      <w:r>
-        <w:rPr>
-          <w:rFonts w:ascii="Times New Roman" w:hAnsi="Times New Roman"/>
-          <w:color w:val="000000"/>
-        </w:rPr>
-        <w:t>2.2.4. Huấn luyện, đăng ký và reload model</w:t>
-      </w:r>
-    </w:p>
-    <w:p>
-      <w:pPr>
-        <w:pStyle w:val="30"/>
-      </w:pPr>
-      <w:r>
-        <w:rPr>
-          <w:rFonts w:ascii="Times New Roman" w:hAnsi="Times New Roman"/>
-          <w:sz w:val="26"/>
-        </w:rPr>
-        <w:t>training.train huấn luyện các mô hình ứng viên, log params/metrics/model vào MLflow và lưu champion vào models/model.pkl cùng reports/metrics.json. training.register_model kiểm tra artifact, so sánh metric với model Production hiện tại và promote phiên bản mới khi tốt hơn ngưỡng cấu hình.</w:t>
-      </w:r>
-    </w:p>
-    <w:p>
-      <w:pPr>
-        <w:pStyle w:val="4"/>
-      </w:pPr>
-      <w:r>
-        <w:rPr>
-          <w:rFonts w:ascii="Times New Roman" w:hAnsi="Times New Roman"/>
-          <w:color w:val="000000"/>
-        </w:rPr>
-        <w:t>2.2.5. Giám sát và dashboard</w:t>
-      </w:r>
-    </w:p>
-    <w:p>
-      <w:pPr>
-        <w:pStyle w:val="30"/>
-      </w:pPr>
-      <w:r>
-        <w:rPr>
-          <w:rFonts w:ascii="Times New Roman" w:hAnsi="Times New Roman"/>
-          <w:sz w:val="26"/>
-        </w:rPr>
-        <w:t>FastAPI expose /metrics theo chuẩn Prometheus, gồm tổng request dự đoán, latency, lỗi dự đoán, phân bố risk_level, histogram xác suất và số lần reload model. Grafana dashboard đọc Prometheus để hiển thị tình trạng API và chất lượng vận hành.</w:t>
-      </w:r>
-    </w:p>
+        <w:t>Project được đóng gói bằng Docker Compose, gồm các service phục vụ dữ liệu, huấn luyện mô hình, API, giao diện và giám sát. Việc triển khai bằng container giúp tái lập môi trường và giảm sai khác giữa máy phát triển và môi trường chạy thử.</w:t>
+      </w:r>
+    </w:p>
+    <w:p>
+      <w:pPr>
+        <w:pStyle w:val="56"/>
+        <w:jc w:val="center"/>
+      </w:pPr>
+      <w:r>
+        <w:rPr>
+          <w:rFonts w:ascii="Times New Roman" w:hAnsi="Times New Roman"/>
+          <w:sz w:val="26"/>
+        </w:rPr>
+        <w:t>Bảng 2.1: Công nghệ sử dụng trong hệ thống</w:t>
+      </w:r>
+    </w:p>
+    <w:tbl>
+      <w:tblPr>
+        <w:tblStyle w:val="20"/>
+        <w:tblW w:type="auto" w:w="0"/>
+        <w:tblLook w:firstColumn="1" w:firstRow="1" w:lastColumn="0" w:lastRow="0" w:noHBand="0" w:noVBand="1" w:val="04A0"/>
+      </w:tblPr>
+      <w:tblGrid>
+        <w:gridCol w:w="3040"/>
+        <w:gridCol w:w="3040"/>
+        <w:gridCol w:w="3040"/>
+      </w:tblGrid>
+      <w:tr>
+        <w:tc>
+          <w:tcPr>
+            <w:tcW w:type="dxa" w:w="3040"/>
+            <w:shd w:fill="D9D9D9"/>
+          </w:tcPr>
+          <w:p>
+            <w:r/>
+            <w:r>
+              <w:rPr>
+                <w:rFonts w:ascii="Times New Roman" w:hAnsi="Times New Roman"/>
+                <w:b/>
+                <w:sz w:val="24"/>
+              </w:rPr>
+              <w:t>Nhóm</w:t>
+            </w:r>
+          </w:p>
+        </w:tc>
+        <w:tc>
+          <w:tcPr>
+            <w:tcW w:type="dxa" w:w="3040"/>
+            <w:shd w:fill="D9D9D9"/>
+          </w:tcPr>
+          <w:p>
+            <w:r/>
+            <w:r>
+              <w:rPr>
+                <w:rFonts w:ascii="Times New Roman" w:hAnsi="Times New Roman"/>
+                <w:b/>
+                <w:sz w:val="24"/>
+              </w:rPr>
+              <w:t>Công nghệ</w:t>
+            </w:r>
+          </w:p>
+        </w:tc>
+        <w:tc>
+          <w:tcPr>
+            <w:tcW w:type="dxa" w:w="3040"/>
+            <w:shd w:fill="D9D9D9"/>
+          </w:tcPr>
+          <w:p>
+            <w:r/>
+            <w:r>
+              <w:rPr>
+                <w:rFonts w:ascii="Times New Roman" w:hAnsi="Times New Roman"/>
+                <w:b/>
+                <w:sz w:val="24"/>
+              </w:rPr>
+              <w:t>Vai trò</w:t>
+            </w:r>
+          </w:p>
+        </w:tc>
+      </w:tr>
+      <w:tr>
+        <w:tc>
+          <w:tcPr>
+            <w:tcW w:type="dxa" w:w="3040"/>
+          </w:tcPr>
+          <w:p>
+            <w:r/>
+            <w:r>
+              <w:rPr>
+                <w:rFonts w:ascii="Times New Roman" w:hAnsi="Times New Roman"/>
+                <w:b w:val="0"/>
+                <w:sz w:val="24"/>
+              </w:rPr>
+              <w:t>Frontend</w:t>
+            </w:r>
+          </w:p>
+        </w:tc>
+        <w:tc>
+          <w:tcPr>
+            <w:tcW w:type="dxa" w:w="3040"/>
+          </w:tcPr>
+          <w:p>
+            <w:r/>
+            <w:r>
+              <w:rPr>
+                <w:rFonts w:ascii="Times New Roman" w:hAnsi="Times New Roman"/>
+                <w:b w:val="0"/>
+                <w:sz w:val="24"/>
+              </w:rPr>
+              <w:t>React 18, Vite, axios, lucide-react</w:t>
+            </w:r>
+          </w:p>
+        </w:tc>
+        <w:tc>
+          <w:tcPr>
+            <w:tcW w:type="dxa" w:w="3040"/>
+          </w:tcPr>
+          <w:p>
+            <w:r/>
+            <w:r>
+              <w:rPr>
+                <w:rFonts w:ascii="Times New Roman" w:hAnsi="Times New Roman"/>
+                <w:b w:val="0"/>
+                <w:sz w:val="24"/>
+              </w:rPr>
+              <w:t>Giao diện bác sĩ/admin và gọi FastAPI</w:t>
+            </w:r>
+          </w:p>
+        </w:tc>
+      </w:tr>
+      <w:tr>
+        <w:tc>
+          <w:tcPr>
+            <w:tcW w:type="dxa" w:w="3040"/>
+          </w:tcPr>
+          <w:p>
+            <w:r/>
+            <w:r>
+              <w:rPr>
+                <w:rFonts w:ascii="Times New Roman" w:hAnsi="Times New Roman"/>
+                <w:b w:val="0"/>
+                <w:sz w:val="24"/>
+              </w:rPr>
+              <w:t>Backend</w:t>
+            </w:r>
+          </w:p>
+        </w:tc>
+        <w:tc>
+          <w:tcPr>
+            <w:tcW w:type="dxa" w:w="3040"/>
+          </w:tcPr>
+          <w:p>
+            <w:r/>
+            <w:r>
+              <w:rPr>
+                <w:rFonts w:ascii="Times New Roman" w:hAnsi="Times New Roman"/>
+                <w:b w:val="0"/>
+                <w:sz w:val="24"/>
+              </w:rPr>
+              <w:t>FastAPI, Pydantic, JWT, passlib</w:t>
+            </w:r>
+          </w:p>
+        </w:tc>
+        <w:tc>
+          <w:tcPr>
+            <w:tcW w:type="dxa" w:w="3040"/>
+          </w:tcPr>
+          <w:p>
+            <w:r/>
+            <w:r>
+              <w:rPr>
+                <w:rFonts w:ascii="Times New Roman" w:hAnsi="Times New Roman"/>
+                <w:b w:val="0"/>
+                <w:sz w:val="24"/>
+              </w:rPr>
+              <w:t>API dự đoán, xác thực, phân quyền, quản lý bệnh nhân</w:t>
+            </w:r>
+          </w:p>
+        </w:tc>
+      </w:tr>
+      <w:tr>
+        <w:tc>
+          <w:tcPr>
+            <w:tcW w:type="dxa" w:w="3040"/>
+          </w:tcPr>
+          <w:p>
+            <w:r/>
+            <w:r>
+              <w:rPr>
+                <w:rFonts w:ascii="Times New Roman" w:hAnsi="Times New Roman"/>
+                <w:b w:val="0"/>
+                <w:sz w:val="24"/>
+              </w:rPr>
+              <w:t>Dữ liệu</w:t>
+            </w:r>
+          </w:p>
+        </w:tc>
+        <w:tc>
+          <w:tcPr>
+            <w:tcW w:type="dxa" w:w="3040"/>
+          </w:tcPr>
+          <w:p>
+            <w:r/>
+            <w:r>
+              <w:rPr>
+                <w:rFonts w:ascii="Times New Roman" w:hAnsi="Times New Roman"/>
+                <w:b w:val="0"/>
+                <w:sz w:val="24"/>
+              </w:rPr>
+              <w:t>PostgreSQL, Redis</w:t>
+            </w:r>
+          </w:p>
+        </w:tc>
+        <w:tc>
+          <w:tcPr>
+            <w:tcW w:type="dxa" w:w="3040"/>
+          </w:tcPr>
+          <w:p>
+            <w:r/>
+            <w:r>
+              <w:rPr>
+                <w:rFonts w:ascii="Times New Roman" w:hAnsi="Times New Roman"/>
+                <w:b w:val="0"/>
+                <w:sz w:val="24"/>
+              </w:rPr>
+              <w:t>Lưu hồ sơ, prediction log, trạng thái retraining và cache log</w:t>
+            </w:r>
+          </w:p>
+        </w:tc>
+      </w:tr>
+      <w:tr>
+        <w:tc>
+          <w:tcPr>
+            <w:tcW w:type="dxa" w:w="3040"/>
+          </w:tcPr>
+          <w:p>
+            <w:r/>
+            <w:r>
+              <w:rPr>
+                <w:rFonts w:ascii="Times New Roman" w:hAnsi="Times New Roman"/>
+                <w:b w:val="0"/>
+                <w:sz w:val="24"/>
+              </w:rPr>
+              <w:t>Streaming</w:t>
+            </w:r>
+          </w:p>
+        </w:tc>
+        <w:tc>
+          <w:tcPr>
+            <w:tcW w:type="dxa" w:w="3040"/>
+          </w:tcPr>
+          <w:p>
+            <w:r/>
+            <w:r>
+              <w:rPr>
+                <w:rFonts w:ascii="Times New Roman" w:hAnsi="Times New Roman"/>
+                <w:b w:val="0"/>
+                <w:sz w:val="24"/>
+              </w:rPr>
+              <w:t>Kafka, Zookeeper, Spark Streaming</w:t>
+            </w:r>
+          </w:p>
+        </w:tc>
+        <w:tc>
+          <w:tcPr>
+            <w:tcW w:type="dxa" w:w="3040"/>
+          </w:tcPr>
+          <w:p>
+            <w:r/>
+            <w:r>
+              <w:rPr>
+                <w:rFonts w:ascii="Times New Roman" w:hAnsi="Times New Roman"/>
+                <w:b w:val="0"/>
+                <w:sz w:val="24"/>
+              </w:rPr>
+              <w:t>Luồng tùy chọn để phát lại dữ liệu bệnh nhân và ghi bronze parquet</w:t>
+            </w:r>
+          </w:p>
+        </w:tc>
+      </w:tr>
+      <w:tr>
+        <w:tc>
+          <w:tcPr>
+            <w:tcW w:type="dxa" w:w="3040"/>
+          </w:tcPr>
+          <w:p>
+            <w:r/>
+            <w:r>
+              <w:rPr>
+                <w:rFonts w:ascii="Times New Roman" w:hAnsi="Times New Roman"/>
+                <w:b w:val="0"/>
+                <w:sz w:val="24"/>
+              </w:rPr>
+              <w:t>Batch ETL</w:t>
+            </w:r>
+          </w:p>
+        </w:tc>
+        <w:tc>
+          <w:tcPr>
+            <w:tcW w:type="dxa" w:w="3040"/>
+          </w:tcPr>
+          <w:p>
+            <w:r/>
+            <w:r>
+              <w:rPr>
+                <w:rFonts w:ascii="Times New Roman" w:hAnsi="Times New Roman"/>
+                <w:b w:val="0"/>
+                <w:sz w:val="24"/>
+              </w:rPr>
+              <w:t>Apache Spark</w:t>
+            </w:r>
+          </w:p>
+        </w:tc>
+        <w:tc>
+          <w:tcPr>
+            <w:tcW w:type="dxa" w:w="3040"/>
+          </w:tcPr>
+          <w:p>
+            <w:r/>
+            <w:r>
+              <w:rPr>
+                <w:rFonts w:ascii="Times New Roman" w:hAnsi="Times New Roman"/>
+                <w:b w:val="0"/>
+                <w:sz w:val="24"/>
+              </w:rPr>
+              <w:t>Làm sạch dữ liệu, tạo gold và feature parquet</w:t>
+            </w:r>
+          </w:p>
+        </w:tc>
+      </w:tr>
+      <w:tr>
+        <w:tc>
+          <w:tcPr>
+            <w:tcW w:type="dxa" w:w="3040"/>
+          </w:tcPr>
+          <w:p>
+            <w:r/>
+            <w:r>
+              <w:rPr>
+                <w:rFonts w:ascii="Times New Roman" w:hAnsi="Times New Roman"/>
+                <w:b w:val="0"/>
+                <w:sz w:val="24"/>
+              </w:rPr>
+              <w:t>ML/MLOps</w:t>
+            </w:r>
+          </w:p>
+        </w:tc>
+        <w:tc>
+          <w:tcPr>
+            <w:tcW w:type="dxa" w:w="3040"/>
+          </w:tcPr>
+          <w:p>
+            <w:r/>
+            <w:r>
+              <w:rPr>
+                <w:rFonts w:ascii="Times New Roman" w:hAnsi="Times New Roman"/>
+                <w:b w:val="0"/>
+                <w:sz w:val="24"/>
+              </w:rPr>
+              <w:t>scikit-learn, MLflow, MinIO, DVC, Airflow</w:t>
+            </w:r>
+          </w:p>
+        </w:tc>
+        <w:tc>
+          <w:tcPr>
+            <w:tcW w:type="dxa" w:w="3040"/>
+          </w:tcPr>
+          <w:p>
+            <w:r/>
+            <w:r>
+              <w:rPr>
+                <w:rFonts w:ascii="Times New Roman" w:hAnsi="Times New Roman"/>
+                <w:b w:val="0"/>
+                <w:sz w:val="24"/>
+              </w:rPr>
+              <w:t>Huấn luyện, theo dõi thí nghiệm, lưu artifact và điều phối pipeline</w:t>
+            </w:r>
+          </w:p>
+        </w:tc>
+      </w:tr>
+      <w:tr>
+        <w:tc>
+          <w:tcPr>
+            <w:tcW w:type="dxa" w:w="3040"/>
+          </w:tcPr>
+          <w:p>
+            <w:r/>
+            <w:r>
+              <w:rPr>
+                <w:rFonts w:ascii="Times New Roman" w:hAnsi="Times New Roman"/>
+                <w:b w:val="0"/>
+                <w:sz w:val="24"/>
+              </w:rPr>
+              <w:t>Monitoring</w:t>
+            </w:r>
+          </w:p>
+        </w:tc>
+        <w:tc>
+          <w:tcPr>
+            <w:tcW w:type="dxa" w:w="3040"/>
+          </w:tcPr>
+          <w:p>
+            <w:r/>
+            <w:r>
+              <w:rPr>
+                <w:rFonts w:ascii="Times New Roman" w:hAnsi="Times New Roman"/>
+                <w:b w:val="0"/>
+                <w:sz w:val="24"/>
+              </w:rPr>
+              <w:t>Prometheus, Grafana</w:t>
+            </w:r>
+          </w:p>
+        </w:tc>
+        <w:tc>
+          <w:tcPr>
+            <w:tcW w:type="dxa" w:w="3040"/>
+          </w:tcPr>
+          <w:p>
+            <w:r/>
+            <w:r>
+              <w:rPr>
+                <w:rFonts w:ascii="Times New Roman" w:hAnsi="Times New Roman"/>
+                <w:b w:val="0"/>
+                <w:sz w:val="24"/>
+              </w:rPr>
+              <w:t>Thu thập metric, dashboard và alert rules</w:t>
+            </w:r>
+          </w:p>
+        </w:tc>
+      </w:tr>
+      <w:tr>
+        <w:tc>
+          <w:tcPr>
+            <w:tcW w:type="dxa" w:w="3040"/>
+          </w:tcPr>
+          <w:p>
+            <w:r/>
+            <w:r>
+              <w:rPr>
+                <w:rFonts w:ascii="Times New Roman" w:hAnsi="Times New Roman"/>
+                <w:b w:val="0"/>
+                <w:sz w:val="24"/>
+              </w:rPr>
+              <w:t>Hạ tầng</w:t>
+            </w:r>
+          </w:p>
+        </w:tc>
+        <w:tc>
+          <w:tcPr>
+            <w:tcW w:type="dxa" w:w="3040"/>
+          </w:tcPr>
+          <w:p>
+            <w:r/>
+            <w:r>
+              <w:rPr>
+                <w:rFonts w:ascii="Times New Roman" w:hAnsi="Times New Roman"/>
+                <w:b w:val="0"/>
+                <w:sz w:val="24"/>
+              </w:rPr>
+              <w:t>Docker Compose, Nginx</w:t>
+            </w:r>
+          </w:p>
+        </w:tc>
+        <w:tc>
+          <w:tcPr>
+            <w:tcW w:type="dxa" w:w="3040"/>
+          </w:tcPr>
+          <w:p>
+            <w:r/>
+            <w:r>
+              <w:rPr>
+                <w:rFonts w:ascii="Times New Roman" w:hAnsi="Times New Roman"/>
+                <w:b w:val="0"/>
+                <w:sz w:val="24"/>
+              </w:rPr>
+              <w:t>Đóng gói service và reverse proxy cơ bản</w:t>
+            </w:r>
+          </w:p>
+        </w:tc>
+      </w:tr>
+    </w:tbl>
+    <w:p/>
     <w:p>
       <w:pPr>
         <w:jc w:val="center"/>
@@ -4336,11 +4214,195 @@
               <a:graphicData uri="http://schemas.openxmlformats.org/drawingml/2006/picture">
                 <pic:pic>
                   <pic:nvPicPr>
-                    <pic:cNvPr id="0" name="12_monitoring.png"/>
+                    <pic:cNvPr id="0" name="11_deployment.png"/>
                     <pic:cNvPicPr/>
                   </pic:nvPicPr>
                   <pic:blipFill>
                     <a:blip r:embed="rId23"/>
+                    <a:stretch>
+                      <a:fillRect/>
+                    </a:stretch>
+                  </pic:blipFill>
+                  <pic:spPr>
+                    <a:xfrm>
+                      <a:off x="0" y="0"/>
+                      <a:ext cx="5852160" cy="3474720"/>
+                    </a:xfrm>
+                    <a:prstGeom prst="rect"/>
+                  </pic:spPr>
+                </pic:pic>
+              </a:graphicData>
+            </a:graphic>
+          </wp:inline>
+        </w:drawing>
+      </w:r>
+    </w:p>
+    <w:p>
+      <w:pPr>
+        <w:pStyle w:val="55"/>
+        <w:jc w:val="center"/>
+      </w:pPr>
+      <w:r>
+        <w:rPr>
+          <w:rFonts w:ascii="Times New Roman" w:hAnsi="Times New Roman"/>
+          <w:sz w:val="26"/>
+        </w:rPr>
+        <w:t>Hình 2.1: Sơ đồ triển khai Docker Compose</w:t>
+      </w:r>
+    </w:p>
+    <w:p>
+      <w:pPr>
+        <w:pStyle w:val="3"/>
+      </w:pPr>
+      <w:r>
+        <w:rPr>
+          <w:rFonts w:ascii="Times New Roman" w:hAnsi="Times New Roman"/>
+          <w:color w:val="000000"/>
+        </w:rPr>
+        <w:t>2.2. Các chức năng đã hiện thực</w:t>
+      </w:r>
+    </w:p>
+    <w:p>
+      <w:pPr>
+        <w:pStyle w:val="4"/>
+      </w:pPr>
+      <w:r>
+        <w:rPr>
+          <w:rFonts w:ascii="Times New Roman" w:hAnsi="Times New Roman"/>
+          <w:color w:val="000000"/>
+        </w:rPr>
+        <w:t>2.2.1. Quản lý người dùng và phân quyền</w:t>
+      </w:r>
+    </w:p>
+    <w:p>
+      <w:pPr>
+        <w:pStyle w:val="30"/>
+      </w:pPr>
+      <w:r>
+        <w:rPr>
+          <w:rFonts w:ascii="Times New Roman" w:hAnsi="Times New Roman"/>
+          <w:sz w:val="26"/>
+        </w:rPr>
+        <w:t>FastAPI khởi tạo hai tài khoản mặc định: doctor01/doctor123 và admin01/admin123. Người dùng đăng nhập qua /auth/login để nhận JWT. Các endpoint bệnh nhân yêu cầu vai trò doctor hoặc admin, trong khi endpoint pipeline và prediction log toàn hệ thống yêu cầu admin.</w:t>
+      </w:r>
+    </w:p>
+    <w:p>
+      <w:pPr>
+        <w:pStyle w:val="4"/>
+      </w:pPr>
+      <w:r>
+        <w:rPr>
+          <w:rFonts w:ascii="Times New Roman" w:hAnsi="Times New Roman"/>
+          <w:color w:val="000000"/>
+        </w:rPr>
+        <w:t>2.2.2. Quản lý bệnh nhân và dự đoán</w:t>
+      </w:r>
+    </w:p>
+    <w:p>
+      <w:pPr>
+        <w:pStyle w:val="30"/>
+      </w:pPr>
+      <w:r>
+        <w:rPr>
+          <w:rFonts w:ascii="Times New Roman" w:hAnsi="Times New Roman"/>
+          <w:sz w:val="26"/>
+        </w:rPr>
+        <w:t>Người dùng có thể tạo, xem, cập nhật và xóa bệnh nhân. Endpoint /patients/{patient_id}/predict lấy dữ liệu bệnh nhân đã lưu, chuẩn hóa tên cột cho khớp pipeline huấn luyện, gọi model Production trên MLflow và lưu kết quả vào Redis cùng PostgreSQL.</w:t>
+      </w:r>
+    </w:p>
+    <w:p>
+      <w:pPr>
+        <w:pStyle w:val="4"/>
+      </w:pPr>
+      <w:r>
+        <w:rPr>
+          <w:rFonts w:ascii="Times New Roman" w:hAnsi="Times New Roman"/>
+          <w:color w:val="000000"/>
+        </w:rPr>
+        <w:t>2.2.3. Pipeline ingestion, ETL và feature engineering</w:t>
+      </w:r>
+    </w:p>
+    <w:p>
+      <w:pPr>
+        <w:pStyle w:val="30"/>
+      </w:pPr>
+      <w:r>
+        <w:rPr>
+          <w:rFonts w:ascii="Times New Roman" w:hAnsi="Times New Roman"/>
+          <w:sz w:val="26"/>
+        </w:rPr>
+        <w:t>ingestion_dag tạo Kafka topic patient-events và chạy producer phát lại dữ liệu CSV. etl_dag chạy Spark batch ETL để tạo data/gold/diabetic_gold.parquet, sau đó chạy feature_engineering.py để tạo data/features/offline/patient_features.parquet. Spark Streaming được đóng gói trong profile tùy chọn để ghi bronze parquet khi cần demo ingestion liên tục.</w:t>
+      </w:r>
+    </w:p>
+    <w:p>
+      <w:pPr>
+        <w:pStyle w:val="4"/>
+      </w:pPr>
+      <w:r>
+        <w:rPr>
+          <w:rFonts w:ascii="Times New Roman" w:hAnsi="Times New Roman"/>
+          <w:color w:val="000000"/>
+        </w:rPr>
+        <w:t>2.2.4. Huấn luyện, đăng ký và reload model</w:t>
+      </w:r>
+    </w:p>
+    <w:p>
+      <w:pPr>
+        <w:pStyle w:val="30"/>
+      </w:pPr>
+      <w:r>
+        <w:rPr>
+          <w:rFonts w:ascii="Times New Roman" w:hAnsi="Times New Roman"/>
+          <w:sz w:val="26"/>
+        </w:rPr>
+        <w:t>training.train huấn luyện các mô hình ứng viên, log params/metrics/model vào MLflow và lưu champion vào models/model.pkl cùng reports/metrics.json. training.register_model kiểm tra artifact, so sánh metric với model Production hiện tại và promote phiên bản mới khi tốt hơn ngưỡng cấu hình.</w:t>
+      </w:r>
+    </w:p>
+    <w:p>
+      <w:pPr>
+        <w:pStyle w:val="4"/>
+      </w:pPr>
+      <w:r>
+        <w:rPr>
+          <w:rFonts w:ascii="Times New Roman" w:hAnsi="Times New Roman"/>
+          <w:color w:val="000000"/>
+        </w:rPr>
+        <w:t>2.2.5. Giám sát và dashboard</w:t>
+      </w:r>
+    </w:p>
+    <w:p>
+      <w:pPr>
+        <w:pStyle w:val="30"/>
+      </w:pPr>
+      <w:r>
+        <w:rPr>
+          <w:rFonts w:ascii="Times New Roman" w:hAnsi="Times New Roman"/>
+          <w:sz w:val="26"/>
+        </w:rPr>
+        <w:t>FastAPI expose /metrics theo chuẩn Prometheus, gồm tổng request dự đoán, latency, lỗi dự đoán, phân bố risk_level, histogram xác suất và số lần reload model. Grafana dashboard đọc Prometheus để hiển thị tình trạng API và chất lượng vận hành.</w:t>
+      </w:r>
+    </w:p>
+    <w:p>
+      <w:pPr>
+        <w:jc w:val="center"/>
+      </w:pPr>
+      <w:r>
+        <w:drawing>
+          <wp:inline xmlns:a="http://schemas.openxmlformats.org/drawingml/2006/main" xmlns:pic="http://schemas.openxmlformats.org/drawingml/2006/picture">
+            <wp:extent cx="5852160" cy="3474720"/>
+            <wp:docPr id="14" name="Picture 14"/>
+            <wp:cNvGraphicFramePr>
+              <a:graphicFrameLocks noChangeAspect="1"/>
+            </wp:cNvGraphicFramePr>
+            <a:graphic>
+              <a:graphicData uri="http://schemas.openxmlformats.org/drawingml/2006/picture">
+                <pic:pic>
+                  <pic:nvPicPr>
+                    <pic:cNvPr id="0" name="13_monitoring.png"/>
+                    <pic:cNvPicPr/>
+                  </pic:nvPicPr>
+                  <pic:blipFill>
+                    <a:blip r:embed="rId24"/>
                     <a:stretch>
                       <a:fillRect/>
                     </a:stretch>

</xml_diff>

<commit_message>
docs: refresh report for user management and retraining
</commit_message>
<xml_diff>
--- a/docs/Hospital_Readmission_Prediction_Report.docx
+++ b/docs/Hospital_Readmission_Prediction_Report.docx
@@ -1474,7 +1474,55 @@
           <w:rFonts w:ascii="Times New Roman" w:hAnsi="Times New Roman"/>
           <w:sz w:val="26"/>
         </w:rPr>
-        <w:t>Hệ thống được chia thành bốn nhóm chức năng chính: quản lý người dùng và bệnh nhân, dự đoán tái nhập viện, dữ liệu và logging, quản trị MLOps. Cách phân rã này giúp tách rõ chức năng nghiệp vụ cho bác sĩ với chức năng vận hành mô hình dành cho admin.</w:t>
+        <w:t>Sơ đồ chức năng tổng quát phân rã hệ thống dự đoán tái nhập viện bệnh nhân thành sáu nhóm chức năng chính. Cách phân chia này tách rõ phần nghiệp vụ dành cho bác sĩ, phần quản trị dành cho admin và phần vận hành MLOps phía sau hệ thống.</w:t>
+      </w:r>
+    </w:p>
+    <w:p>
+      <w:pPr>
+        <w:pStyle w:val="30"/>
+      </w:pPr>
+      <w:r>
+        <w:rPr>
+          <w:rFonts w:ascii="Times New Roman" w:hAnsi="Times New Roman"/>
+          <w:sz w:val="26"/>
+        </w:rPr>
+        <w:t>Nhóm quản lý người dùng và xác thực chịu trách nhiệm đăng nhập, cấp JWT token, phân quyền Doctor/Admin và cho phép người dùng xem thông tin tài khoản hiện tại. Đây là lớp kiểm soát truy cập chung trước khi người dùng thao tác với bệnh nhân, dự đoán hoặc các chức năng quản trị.</w:t>
+      </w:r>
+    </w:p>
+    <w:p>
+      <w:pPr>
+        <w:pStyle w:val="30"/>
+      </w:pPr>
+      <w:r>
+        <w:rPr>
+          <w:rFonts w:ascii="Times New Roman" w:hAnsi="Times New Roman"/>
+          <w:sz w:val="26"/>
+        </w:rPr>
+        <w:t>Nhóm quản lý bệnh nhân bao phủ các thao tác nghiệp vụ cốt lõi gồm thêm hồ sơ, xem danh sách, xem chi tiết, cập nhật, xóa hồ sơ bệnh nhân và xem danh sách bệnh nhân có nguy cơ cao. Dữ liệu bệnh nhân là đầu vào chính cho nhóm dự đoán tái nhập viện, nơi hệ thống nhận dữ liệu lâm sàng, tiền xử lý dữ liệu, tải model Production, trả kết quả dự đoán và ghi lại prediction log.</w:t>
+      </w:r>
+    </w:p>
+    <w:p>
+      <w:pPr>
+        <w:pStyle w:val="30"/>
+      </w:pPr>
+      <w:r>
+        <w:rPr>
+          <w:rFonts w:ascii="Times New Roman" w:hAnsi="Times New Roman"/>
+          <w:sz w:val="26"/>
+        </w:rPr>
+        <w:t>Nhóm quản trị MLOps cho phép admin theo dõi trạng thái pipeline, kích hoạt Airflow DAG, chạy ETL, huấn luyện model, retraining model và reload model Production. Nhóm quản lý dữ liệu và huấn luyện mô hình mô tả luồng xử lý offline: đọc dữ liệu nguồn, chạy Spark Batch ETL, tạo dữ liệu Gold, tạo Offline Feature, train và đánh giá model, ghi experiment vào MLflow, lưu artifact vào MinIO và promote model tốt nhất lên Production.</w:t>
+      </w:r>
+    </w:p>
+    <w:p>
+      <w:pPr>
+        <w:pStyle w:val="30"/>
+      </w:pPr>
+      <w:r>
+        <w:rPr>
+          <w:rFonts w:ascii="Times New Roman" w:hAnsi="Times New Roman"/>
+          <w:sz w:val="26"/>
+        </w:rPr>
+        <w:t>Nhóm giám sát hệ thống tập trung vào vận hành sau triển khai. FastAPI xuất metrics, Prometheus thu thập metrics, Grafana hiển thị dashboard và hệ thống có thể cảnh báo khi request, latency, error hoặc phân bố risk level xuất hiện bất thường. Nhờ đó, hệ thống không chỉ phục vụ dự đoán mà còn có khả năng theo dõi chất lượng vận hành và hỗ trợ tái huấn luyện khi dữ liệu mới phát sinh.</w:t>
       </w:r>
     </w:p>
     <w:p>
@@ -1484,7 +1532,7 @@
       <w:r>
         <w:drawing>
           <wp:inline xmlns:a="http://schemas.openxmlformats.org/drawingml/2006/main" xmlns:pic="http://schemas.openxmlformats.org/drawingml/2006/picture">
-            <wp:extent cx="5852160" cy="7315200"/>
+            <wp:extent cx="5852160" cy="6141156"/>
             <wp:docPr id="2" name="Picture 2"/>
             <wp:cNvGraphicFramePr>
               <a:graphicFrameLocks noChangeAspect="1"/>
@@ -1505,7 +1553,7 @@
                   <pic:spPr>
                     <a:xfrm>
                       <a:off x="0" y="0"/>
-                      <a:ext cx="5852160" cy="7315200"/>
+                      <a:ext cx="5852160" cy="6141156"/>
                     </a:xfrm>
                     <a:prstGeom prst="rect"/>
                   </pic:spPr>
@@ -1550,7 +1598,7 @@
           <w:rFonts w:ascii="Times New Roman" w:hAnsi="Times New Roman"/>
           <w:sz w:val="26"/>
         </w:rPr>
-        <w:t>Hệ thống có hai tác nhân chính. Bác sĩ sử dụng hệ thống để quản lý bệnh nhân, nhập dữ liệu lâm sàng và xem kết quả dự đoán. Admin có thêm quyền xem toàn bộ dữ liệu, điều khiển pipeline MLOps, truy cập lịch sử dự đoán và reload model production.</w:t>
+        <w:t>Hệ thống có hai tác nhân chính. Bác sĩ sử dụng hệ thống để quản lý bệnh nhân, nhập dữ liệu lâm sàng và xem kết quả dự đoán. Admin có thêm quyền xem toàn bộ dữ liệu, quản lý tài khoản người dùng, điều khiển pipeline MLOps, truy cập lịch sử dự đoán và reload model production.</w:t>
       </w:r>
     </w:p>
     <w:p>
@@ -1560,7 +1608,7 @@
       <w:r>
         <w:drawing>
           <wp:inline xmlns:a="http://schemas.openxmlformats.org/drawingml/2006/main" xmlns:pic="http://schemas.openxmlformats.org/drawingml/2006/picture">
-            <wp:extent cx="5852160" cy="3738880"/>
+            <wp:extent cx="5852160" cy="4303059"/>
             <wp:docPr id="3" name="Picture 3"/>
             <wp:cNvGraphicFramePr>
               <a:graphicFrameLocks noChangeAspect="1"/>
@@ -1581,7 +1629,7 @@
                   <pic:spPr>
                     <a:xfrm>
                       <a:off x="0" y="0"/>
-                      <a:ext cx="5852160" cy="3738880"/>
+                      <a:ext cx="5852160" cy="4303059"/>
                     </a:xfrm>
                     <a:prstGeom prst="rect"/>
                   </pic:spPr>
@@ -1928,6 +1976,56 @@
                 <w:sz w:val="24"/>
               </w:rPr>
               <w:t>Xem thống kê tổng quan, lịch sử dự đoán và thông tin model</w:t>
+            </w:r>
+          </w:p>
+        </w:tc>
+      </w:tr>
+      <w:tr>
+        <w:tc>
+          <w:tcPr>
+            <w:tcW w:type="dxa" w:w="3040"/>
+          </w:tcPr>
+          <w:p>
+            <w:r/>
+            <w:r>
+              <w:rPr>
+                <w:rFonts w:ascii="Times New Roman" w:hAnsi="Times New Roman"/>
+                <w:b w:val="0"/>
+                <w:sz w:val="24"/>
+              </w:rPr>
+              <w:t>Admin</w:t>
+            </w:r>
+          </w:p>
+        </w:tc>
+        <w:tc>
+          <w:tcPr>
+            <w:tcW w:type="dxa" w:w="3040"/>
+          </w:tcPr>
+          <w:p>
+            <w:r/>
+            <w:r>
+              <w:rPr>
+                <w:rFonts w:ascii="Times New Roman" w:hAnsi="Times New Roman"/>
+                <w:b w:val="0"/>
+                <w:sz w:val="24"/>
+              </w:rPr>
+              <w:t>Quản lý người dùng</w:t>
+            </w:r>
+          </w:p>
+        </w:tc>
+        <w:tc>
+          <w:tcPr>
+            <w:tcW w:type="dxa" w:w="3040"/>
+          </w:tcPr>
+          <w:p>
+            <w:r/>
+            <w:r>
+              <w:rPr>
+                <w:rFonts w:ascii="Times New Roman" w:hAnsi="Times New Roman"/>
+                <w:b w:val="0"/>
+                <w:sz w:val="24"/>
+              </w:rPr>
+              <w:t>Tạo tài khoản, cập nhật họ tên/vai trò, reset mật khẩu và bật/tắt trạng thái hoạt động</w:t>
             </w:r>
           </w:p>
         </w:tc>
@@ -2402,7 +2500,7 @@
                 <w:b w:val="0"/>
                 <w:sz w:val="24"/>
               </w:rPr>
-              <w:t>Lưu tài khoản, mật khẩu đã băm, họ tên và vai trò doctor/admin</w:t>
+              <w:t>Lưu tài khoản, mật khẩu đã băm, họ tên, vai trò doctor/admin và trạng thái is_active</w:t>
             </w:r>
           </w:p>
         </w:tc>
@@ -2642,7 +2740,7 @@
           <w:rFonts w:ascii="Times New Roman" w:hAnsi="Times New Roman"/>
           <w:sz w:val="26"/>
         </w:rPr>
-        <w:t>Giao diện được xây dựng bằng React và Vite. Các màn hình chính được thiết kế cho hai nhóm người dùng: bác sĩ thao tác với bệnh nhân và admin vận hành hệ thống MLOps. Giao diện sử dụng các khối thông tin ngắn, bảng danh sách và form lâm sàng để giảm thao tác lặp lại.</w:t>
+        <w:t>Giao diện được xây dựng bằng React và Vite. Các màn hình chính được thiết kế cho hai nhóm người dùng: bác sĩ thao tác với bệnh nhân và admin vận hành hệ thống MLOps. Admin có thêm màn hình Users để tạo tài khoản, cập nhật vai trò, reset mật khẩu và vô hiệu hóa/kích hoạt lại tài khoản. Giao diện sử dụng các khối thông tin ngắn, bảng danh sách và form lâm sàng để giảm thao tác lặp lại.</w:t>
       </w:r>
     </w:p>
     <w:p>
@@ -2785,7 +2883,7 @@
                 <w:b w:val="0"/>
                 <w:sz w:val="24"/>
               </w:rPr>
-              <w:t>Doctor Overview</w:t>
+              <w:t>Users</w:t>
             </w:r>
           </w:p>
         </w:tc>
@@ -2801,7 +2899,7 @@
                 <w:b w:val="0"/>
                 <w:sz w:val="24"/>
               </w:rPr>
-              <w:t>Tổng quan bệnh nhân của bác sĩ và danh sách ưu tiên</w:t>
+              <w:t>Quản lý tài khoản doctor/admin, reset mật khẩu và bật/tắt trạng thái hoạt động</w:t>
             </w:r>
           </w:p>
         </w:tc>
@@ -2819,7 +2917,7 @@
                 <w:b w:val="0"/>
                 <w:sz w:val="24"/>
               </w:rPr>
-              <w:t>Patients</w:t>
+              <w:t>Doctor Overview</w:t>
             </w:r>
           </w:p>
         </w:tc>
@@ -2835,7 +2933,7 @@
                 <w:b w:val="0"/>
                 <w:sz w:val="24"/>
               </w:rPr>
-              <w:t>Quản lý danh bạ bệnh nhân, xem chi tiết, dự đoán và lịch sử từng bệnh nhân</w:t>
+              <w:t>Tổng quan bệnh nhân của bác sĩ và danh sách ưu tiên</w:t>
             </w:r>
           </w:p>
         </w:tc>
@@ -2853,7 +2951,7 @@
                 <w:b w:val="0"/>
                 <w:sz w:val="24"/>
               </w:rPr>
-              <w:t>Create Patient</w:t>
+              <w:t>Patients</w:t>
             </w:r>
           </w:p>
         </w:tc>
@@ -2869,7 +2967,7 @@
                 <w:b w:val="0"/>
                 <w:sz w:val="24"/>
               </w:rPr>
-              <w:t>Nhập hồ sơ bệnh nhân mới và chạy dự đoán ngay sau khi tạo</w:t>
+              <w:t>Quản lý danh bạ bệnh nhân, xem chi tiết, dự đoán và lịch sử từng bệnh nhân</w:t>
             </w:r>
           </w:p>
         </w:tc>
@@ -2887,7 +2985,7 @@
                 <w:b w:val="0"/>
                 <w:sz w:val="24"/>
               </w:rPr>
-              <w:t>Predict</w:t>
+              <w:t>Create Patient</w:t>
             </w:r>
           </w:p>
         </w:tc>
@@ -2903,7 +3001,7 @@
                 <w:b w:val="0"/>
                 <w:sz w:val="24"/>
               </w:rPr>
-              <w:t>Dự đoán trực tiếp từ form lâm sàng không cần tạo hồ sơ trước</w:t>
+              <w:t>Nhập hồ sơ bệnh nhân mới và chạy dự đoán ngay sau khi tạo</w:t>
             </w:r>
           </w:p>
         </w:tc>
@@ -4283,7 +4381,19 @@
           <w:rFonts w:ascii="Times New Roman" w:hAnsi="Times New Roman"/>
           <w:sz w:val="26"/>
         </w:rPr>
-        <w:t>FastAPI khởi tạo hai tài khoản mặc định: doctor01/doctor123 và admin01/admin123. Người dùng đăng nhập qua /auth/login để nhận JWT. Các endpoint bệnh nhân yêu cầu vai trò doctor hoặc admin, trong khi endpoint pipeline và prediction log toàn hệ thống yêu cầu admin.</w:t>
+        <w:t>FastAPI khởi tạo hai tài khoản mặc định: doctor01/doctor123 và admin01/admin123. Người dùng đăng nhập qua /auth/login để nhận JWT. Các endpoint bệnh nhân yêu cầu vai trò doctor hoặc admin, trong khi endpoint pipeline, prediction log toàn hệ thống và quản trị user yêu cầu admin.</w:t>
+      </w:r>
+    </w:p>
+    <w:p>
+      <w:pPr>
+        <w:pStyle w:val="30"/>
+      </w:pPr>
+      <w:r>
+        <w:rPr>
+          <w:rFonts w:ascii="Times New Roman" w:hAnsi="Times New Roman"/>
+          <w:sz w:val="26"/>
+        </w:rPr>
+        <w:t>Admin có thể xem danh sách tài khoản, tạo user mới, cập nhật họ tên/vai trò, reset mật khẩu và thay đổi trạng thái is_active qua /users/{user_id}/status. Hệ thống không xóa cứng user; tài khoản bị vô hiệu hóa không thể đăng nhập và token cũ cũng bị từ chối khi gọi API.</w:t>
       </w:r>
     </w:p>
     <w:p>
@@ -6280,6 +6390,156 @@
                 <w:sz w:val="24"/>
               </w:rPr>
               <w:t>Lấy thông tin người dùng hiện tại</w:t>
+            </w:r>
+          </w:p>
+        </w:tc>
+      </w:tr>
+      <w:tr>
+        <w:tc>
+          <w:tcPr>
+            <w:tcW w:type="dxa" w:w="3040"/>
+          </w:tcPr>
+          <w:p>
+            <w:r/>
+            <w:r>
+              <w:rPr>
+                <w:rFonts w:ascii="Times New Roman" w:hAnsi="Times New Roman"/>
+                <w:b w:val="0"/>
+                <w:sz w:val="24"/>
+              </w:rPr>
+              <w:t>GET/POST</w:t>
+            </w:r>
+          </w:p>
+        </w:tc>
+        <w:tc>
+          <w:tcPr>
+            <w:tcW w:type="dxa" w:w="3040"/>
+          </w:tcPr>
+          <w:p>
+            <w:r/>
+            <w:r>
+              <w:rPr>
+                <w:rFonts w:ascii="Times New Roman" w:hAnsi="Times New Roman"/>
+                <w:b w:val="0"/>
+                <w:sz w:val="24"/>
+              </w:rPr>
+              <w:t>/users</w:t>
+            </w:r>
+          </w:p>
+        </w:tc>
+        <w:tc>
+          <w:tcPr>
+            <w:tcW w:type="dxa" w:w="3040"/>
+          </w:tcPr>
+          <w:p>
+            <w:r/>
+            <w:r>
+              <w:rPr>
+                <w:rFonts w:ascii="Times New Roman" w:hAnsi="Times New Roman"/>
+                <w:b w:val="0"/>
+                <w:sz w:val="24"/>
+              </w:rPr>
+              <w:t>Admin xem danh sách hoặc tạo tài khoản doctor/admin</w:t>
+            </w:r>
+          </w:p>
+        </w:tc>
+      </w:tr>
+      <w:tr>
+        <w:tc>
+          <w:tcPr>
+            <w:tcW w:type="dxa" w:w="3040"/>
+          </w:tcPr>
+          <w:p>
+            <w:r/>
+            <w:r>
+              <w:rPr>
+                <w:rFonts w:ascii="Times New Roman" w:hAnsi="Times New Roman"/>
+                <w:b w:val="0"/>
+                <w:sz w:val="24"/>
+              </w:rPr>
+              <w:t>PUT</w:t>
+            </w:r>
+          </w:p>
+        </w:tc>
+        <w:tc>
+          <w:tcPr>
+            <w:tcW w:type="dxa" w:w="3040"/>
+          </w:tcPr>
+          <w:p>
+            <w:r/>
+            <w:r>
+              <w:rPr>
+                <w:rFonts w:ascii="Times New Roman" w:hAnsi="Times New Roman"/>
+                <w:b w:val="0"/>
+                <w:sz w:val="24"/>
+              </w:rPr>
+              <w:t>/users/{user_id}</w:t>
+            </w:r>
+          </w:p>
+        </w:tc>
+        <w:tc>
+          <w:tcPr>
+            <w:tcW w:type="dxa" w:w="3040"/>
+          </w:tcPr>
+          <w:p>
+            <w:r/>
+            <w:r>
+              <w:rPr>
+                <w:rFonts w:ascii="Times New Roman" w:hAnsi="Times New Roman"/>
+                <w:b w:val="0"/>
+                <w:sz w:val="24"/>
+              </w:rPr>
+              <w:t>Admin cập nhật họ tên, vai trò hoặc reset mật khẩu</w:t>
+            </w:r>
+          </w:p>
+        </w:tc>
+      </w:tr>
+      <w:tr>
+        <w:tc>
+          <w:tcPr>
+            <w:tcW w:type="dxa" w:w="3040"/>
+          </w:tcPr>
+          <w:p>
+            <w:r/>
+            <w:r>
+              <w:rPr>
+                <w:rFonts w:ascii="Times New Roman" w:hAnsi="Times New Roman"/>
+                <w:b w:val="0"/>
+                <w:sz w:val="24"/>
+              </w:rPr>
+              <w:t>PATCH</w:t>
+            </w:r>
+          </w:p>
+        </w:tc>
+        <w:tc>
+          <w:tcPr>
+            <w:tcW w:type="dxa" w:w="3040"/>
+          </w:tcPr>
+          <w:p>
+            <w:r/>
+            <w:r>
+              <w:rPr>
+                <w:rFonts w:ascii="Times New Roman" w:hAnsi="Times New Roman"/>
+                <w:b w:val="0"/>
+                <w:sz w:val="24"/>
+              </w:rPr>
+              <w:t>/users/{user_id}/status</w:t>
+            </w:r>
+          </w:p>
+        </w:tc>
+        <w:tc>
+          <w:tcPr>
+            <w:tcW w:type="dxa" w:w="3040"/>
+          </w:tcPr>
+          <w:p>
+            <w:r/>
+            <w:r>
+              <w:rPr>
+                <w:rFonts w:ascii="Times New Roman" w:hAnsi="Times New Roman"/>
+                <w:b w:val="0"/>
+                <w:sz w:val="24"/>
+              </w:rPr>
+              <w:t>Admin vô hiệu hóa hoặc kích hoạt lại tài khoản</w:t>
             </w:r>
           </w:p>
         </w:tc>

</xml_diff>